<commit_message>
Archivo roles y permisos listo
</commit_message>
<xml_diff>
--- a/Modulo1/Informe.docx
+++ b/Modulo1/Informe.docx
@@ -354,14 +354,14 @@
             </w:rPr>
             <w:fldChar w:fldCharType="separate"/>
           </w:r>
-          <w:hyperlink w:anchor="_Toc226805708" w:history="1">
+          <w:hyperlink w:anchor="_Toc226814934" w:history="1">
             <w:r>
               <w:rPr>
                 <w:rStyle w:val="Hipervnculo"/>
                 <w:rFonts w:ascii="Times New Roman" w:hAnsi="Times New Roman" w:cs="Times New Roman"/>
                 <w:noProof/>
               </w:rPr>
-              <w:t>Descripción</w:t>
+              <w:t>Alcance</w:t>
             </w:r>
             <w:r>
               <w:rPr>
@@ -385,7 +385,7 @@
                 <w:noProof/>
                 <w:webHidden/>
               </w:rPr>
-              <w:instrText xml:space="preserve"> PAGEREF _Toc226805708 \h </w:instrText>
+              <w:instrText xml:space="preserve"> PAGEREF _Toc226814934 \h </w:instrText>
             </w:r>
             <w:r>
               <w:rPr>
@@ -432,14 +432,14 @@
               <w:lang w:eastAsia="es-CO"/>
             </w:rPr>
           </w:pPr>
-          <w:hyperlink w:anchor="_Toc226805709" w:history="1">
+          <w:hyperlink w:anchor="_Toc226814935" w:history="1">
             <w:r>
               <w:rPr>
                 <w:rStyle w:val="Hipervnculo"/>
                 <w:rFonts w:ascii="Times New Roman" w:hAnsi="Times New Roman" w:cs="Times New Roman"/>
                 <w:noProof/>
               </w:rPr>
-              <w:t>Alcance del Módulo</w:t>
+              <w:t>Modelo Relacional</w:t>
             </w:r>
             <w:r>
               <w:rPr>
@@ -463,7 +463,7 @@
                 <w:noProof/>
                 <w:webHidden/>
               </w:rPr>
-              <w:instrText xml:space="preserve"> PAGEREF _Toc226805709 \h </w:instrText>
+              <w:instrText xml:space="preserve"> PAGEREF _Toc226814935 \h </w:instrText>
             </w:r>
             <w:r>
               <w:rPr>
@@ -486,7 +486,7 @@
                 <w:noProof/>
                 <w:webHidden/>
               </w:rPr>
-              <w:t>3</w:t>
+              <w:t>4</w:t>
             </w:r>
             <w:r>
               <w:rPr>
@@ -510,14 +510,14 @@
               <w:lang w:eastAsia="es-CO"/>
             </w:rPr>
           </w:pPr>
-          <w:hyperlink w:anchor="_Toc226805710" w:history="1">
+          <w:hyperlink w:anchor="_Toc226814936" w:history="1">
             <w:r>
               <w:rPr>
                 <w:rStyle w:val="Hipervnculo"/>
                 <w:rFonts w:ascii="Times New Roman" w:hAnsi="Times New Roman" w:cs="Times New Roman"/>
                 <w:noProof/>
               </w:rPr>
-              <w:t>Modelo Relacional</w:t>
+              <w:t>Diccionario de Datos</w:t>
             </w:r>
             <w:r>
               <w:rPr>
@@ -541,7 +541,7 @@
                 <w:noProof/>
                 <w:webHidden/>
               </w:rPr>
-              <w:instrText xml:space="preserve"> PAGEREF _Toc226805710 \h </w:instrText>
+              <w:instrText xml:space="preserve"> PAGEREF _Toc226814936 \h </w:instrText>
             </w:r>
             <w:r>
               <w:rPr>
@@ -564,7 +564,7 @@
                 <w:noProof/>
                 <w:webHidden/>
               </w:rPr>
-              <w:t>3</w:t>
+              <w:t>6</w:t>
             </w:r>
             <w:r>
               <w:rPr>
@@ -588,14 +588,14 @@
               <w:lang w:eastAsia="es-CO"/>
             </w:rPr>
           </w:pPr>
-          <w:hyperlink w:anchor="_Toc226805711" w:history="1">
+          <w:hyperlink w:anchor="_Toc226814937" w:history="1">
             <w:r>
               <w:rPr>
                 <w:rStyle w:val="Hipervnculo"/>
                 <w:rFonts w:ascii="Times New Roman" w:hAnsi="Times New Roman" w:cs="Times New Roman"/>
                 <w:noProof/>
               </w:rPr>
-              <w:t>Diccionario de Datos</w:t>
+              <w:t>Lógica de Negocio en Base de Datos</w:t>
             </w:r>
             <w:r>
               <w:rPr>
@@ -619,7 +619,7 @@
                 <w:noProof/>
                 <w:webHidden/>
               </w:rPr>
-              <w:instrText xml:space="preserve"> PAGEREF _Toc226805711 \h </w:instrText>
+              <w:instrText xml:space="preserve"> PAGEREF _Toc226814937 \h </w:instrText>
             </w:r>
             <w:r>
               <w:rPr>
@@ -642,7 +642,292 @@
                 <w:noProof/>
                 <w:webHidden/>
               </w:rPr>
-              <w:t>3</w:t>
+              <w:t>6</w:t>
+            </w:r>
+            <w:r>
+              <w:rPr>
+                <w:rFonts w:ascii="Times New Roman" w:hAnsi="Times New Roman" w:cs="Times New Roman"/>
+                <w:noProof/>
+                <w:webHidden/>
+              </w:rPr>
+              <w:fldChar w:fldCharType="end"/>
+            </w:r>
+          </w:hyperlink>
+        </w:p>
+        <w:p>
+          <w:pPr>
+            <w:pStyle w:val="TDC2"/>
+            <w:tabs>
+              <w:tab w:val="left" w:pos="720"/>
+              <w:tab w:val="right" w:leader="dot" w:pos="8828"/>
+            </w:tabs>
+            <w:rPr>
+              <w:rFonts w:ascii="Times New Roman" w:eastAsiaTheme="minorEastAsia" w:hAnsi="Times New Roman" w:cs="Times New Roman"/>
+              <w:noProof/>
+              <w:lang w:eastAsia="es-CO"/>
+            </w:rPr>
+          </w:pPr>
+          <w:hyperlink w:anchor="_Toc226814938" w:history="1">
+            <w:r>
+              <w:rPr>
+                <w:rStyle w:val="Hipervnculo"/>
+                <w:rFonts w:ascii="Times New Roman" w:hAnsi="Times New Roman" w:cs="Times New Roman"/>
+                <w:noProof/>
+              </w:rPr>
+              <w:t></w:t>
+            </w:r>
+            <w:r>
+              <w:rPr>
+                <w:rFonts w:ascii="Times New Roman" w:eastAsiaTheme="minorEastAsia" w:hAnsi="Times New Roman" w:cs="Times New Roman"/>
+                <w:noProof/>
+                <w:lang w:eastAsia="es-CO"/>
+              </w:rPr>
+              <w:tab/>
+            </w:r>
+            <w:r>
+              <w:rPr>
+                <w:rStyle w:val="Hipervnculo"/>
+                <w:rFonts w:ascii="Times New Roman" w:hAnsi="Times New Roman" w:cs="Times New Roman"/>
+                <w:noProof/>
+              </w:rPr>
+              <w:t>Procedimientos</w:t>
+            </w:r>
+            <w:r>
+              <w:rPr>
+                <w:rFonts w:ascii="Times New Roman" w:hAnsi="Times New Roman" w:cs="Times New Roman"/>
+                <w:noProof/>
+                <w:webHidden/>
+              </w:rPr>
+              <w:tab/>
+            </w:r>
+            <w:r>
+              <w:rPr>
+                <w:rFonts w:ascii="Times New Roman" w:hAnsi="Times New Roman" w:cs="Times New Roman"/>
+                <w:noProof/>
+                <w:webHidden/>
+              </w:rPr>
+              <w:fldChar w:fldCharType="begin"/>
+            </w:r>
+            <w:r>
+              <w:rPr>
+                <w:rFonts w:ascii="Times New Roman" w:hAnsi="Times New Roman" w:cs="Times New Roman"/>
+                <w:noProof/>
+                <w:webHidden/>
+              </w:rPr>
+              <w:instrText xml:space="preserve"> PAGEREF _Toc226814938 \h </w:instrText>
+            </w:r>
+            <w:r>
+              <w:rPr>
+                <w:rFonts w:ascii="Times New Roman" w:hAnsi="Times New Roman" w:cs="Times New Roman"/>
+                <w:noProof/>
+                <w:webHidden/>
+              </w:rPr>
+            </w:r>
+            <w:r>
+              <w:rPr>
+                <w:rFonts w:ascii="Times New Roman" w:hAnsi="Times New Roman" w:cs="Times New Roman"/>
+                <w:noProof/>
+                <w:webHidden/>
+              </w:rPr>
+              <w:fldChar w:fldCharType="separate"/>
+            </w:r>
+            <w:r>
+              <w:rPr>
+                <w:rFonts w:ascii="Times New Roman" w:hAnsi="Times New Roman" w:cs="Times New Roman"/>
+                <w:noProof/>
+                <w:webHidden/>
+              </w:rPr>
+              <w:t>6</w:t>
+            </w:r>
+            <w:r>
+              <w:rPr>
+                <w:rFonts w:ascii="Times New Roman" w:hAnsi="Times New Roman" w:cs="Times New Roman"/>
+                <w:noProof/>
+                <w:webHidden/>
+              </w:rPr>
+              <w:fldChar w:fldCharType="end"/>
+            </w:r>
+          </w:hyperlink>
+        </w:p>
+        <w:p>
+          <w:pPr>
+            <w:pStyle w:val="TDC2"/>
+            <w:tabs>
+              <w:tab w:val="left" w:pos="720"/>
+              <w:tab w:val="right" w:leader="dot" w:pos="8828"/>
+            </w:tabs>
+            <w:rPr>
+              <w:rFonts w:ascii="Times New Roman" w:eastAsiaTheme="minorEastAsia" w:hAnsi="Times New Roman" w:cs="Times New Roman"/>
+              <w:noProof/>
+              <w:lang w:eastAsia="es-CO"/>
+            </w:rPr>
+          </w:pPr>
+          <w:hyperlink w:anchor="_Toc226814939" w:history="1">
+            <w:r>
+              <w:rPr>
+                <w:rStyle w:val="Hipervnculo"/>
+                <w:rFonts w:ascii="Times New Roman" w:hAnsi="Times New Roman" w:cs="Times New Roman"/>
+                <w:noProof/>
+              </w:rPr>
+              <w:t></w:t>
+            </w:r>
+            <w:r>
+              <w:rPr>
+                <w:rFonts w:ascii="Times New Roman" w:eastAsiaTheme="minorEastAsia" w:hAnsi="Times New Roman" w:cs="Times New Roman"/>
+                <w:noProof/>
+                <w:lang w:eastAsia="es-CO"/>
+              </w:rPr>
+              <w:tab/>
+            </w:r>
+            <w:r>
+              <w:rPr>
+                <w:rStyle w:val="Hipervnculo"/>
+                <w:rFonts w:ascii="Times New Roman" w:hAnsi="Times New Roman" w:cs="Times New Roman"/>
+                <w:noProof/>
+              </w:rPr>
+              <w:t>Funciones</w:t>
+            </w:r>
+            <w:r>
+              <w:rPr>
+                <w:rFonts w:ascii="Times New Roman" w:hAnsi="Times New Roman" w:cs="Times New Roman"/>
+                <w:noProof/>
+                <w:webHidden/>
+              </w:rPr>
+              <w:tab/>
+            </w:r>
+            <w:r>
+              <w:rPr>
+                <w:rFonts w:ascii="Times New Roman" w:hAnsi="Times New Roman" w:cs="Times New Roman"/>
+                <w:noProof/>
+                <w:webHidden/>
+              </w:rPr>
+              <w:fldChar w:fldCharType="begin"/>
+            </w:r>
+            <w:r>
+              <w:rPr>
+                <w:rFonts w:ascii="Times New Roman" w:hAnsi="Times New Roman" w:cs="Times New Roman"/>
+                <w:noProof/>
+                <w:webHidden/>
+              </w:rPr>
+              <w:instrText xml:space="preserve"> PAGEREF _Toc226814939 \h </w:instrText>
+            </w:r>
+            <w:r>
+              <w:rPr>
+                <w:rFonts w:ascii="Times New Roman" w:hAnsi="Times New Roman" w:cs="Times New Roman"/>
+                <w:noProof/>
+                <w:webHidden/>
+              </w:rPr>
+            </w:r>
+            <w:r>
+              <w:rPr>
+                <w:rFonts w:ascii="Times New Roman" w:hAnsi="Times New Roman" w:cs="Times New Roman"/>
+                <w:noProof/>
+                <w:webHidden/>
+              </w:rPr>
+              <w:fldChar w:fldCharType="separate"/>
+            </w:r>
+            <w:r>
+              <w:rPr>
+                <w:rFonts w:ascii="Times New Roman" w:hAnsi="Times New Roman" w:cs="Times New Roman"/>
+                <w:noProof/>
+                <w:webHidden/>
+              </w:rPr>
+              <w:t>6</w:t>
+            </w:r>
+            <w:r>
+              <w:rPr>
+                <w:rFonts w:ascii="Times New Roman" w:hAnsi="Times New Roman" w:cs="Times New Roman"/>
+                <w:noProof/>
+                <w:webHidden/>
+              </w:rPr>
+              <w:fldChar w:fldCharType="end"/>
+            </w:r>
+          </w:hyperlink>
+        </w:p>
+        <w:p>
+          <w:pPr>
+            <w:pStyle w:val="TDC2"/>
+            <w:tabs>
+              <w:tab w:val="left" w:pos="720"/>
+              <w:tab w:val="right" w:leader="dot" w:pos="8828"/>
+            </w:tabs>
+            <w:rPr>
+              <w:rFonts w:ascii="Times New Roman" w:eastAsiaTheme="minorEastAsia" w:hAnsi="Times New Roman" w:cs="Times New Roman"/>
+              <w:noProof/>
+              <w:lang w:eastAsia="es-CO"/>
+            </w:rPr>
+          </w:pPr>
+          <w:hyperlink w:anchor="_Toc226814940" w:history="1">
+            <w:r>
+              <w:rPr>
+                <w:rStyle w:val="Hipervnculo"/>
+                <w:rFonts w:ascii="Times New Roman" w:hAnsi="Times New Roman" w:cs="Times New Roman"/>
+                <w:noProof/>
+              </w:rPr>
+              <w:t></w:t>
+            </w:r>
+            <w:r>
+              <w:rPr>
+                <w:rFonts w:ascii="Times New Roman" w:eastAsiaTheme="minorEastAsia" w:hAnsi="Times New Roman" w:cs="Times New Roman"/>
+                <w:noProof/>
+                <w:lang w:eastAsia="es-CO"/>
+              </w:rPr>
+              <w:tab/>
+            </w:r>
+            <w:r>
+              <w:rPr>
+                <w:rStyle w:val="Hipervnculo"/>
+                <w:rFonts w:ascii="Times New Roman" w:hAnsi="Times New Roman" w:cs="Times New Roman"/>
+                <w:noProof/>
+              </w:rPr>
+              <w:t>Triggers</w:t>
+            </w:r>
+            <w:r>
+              <w:rPr>
+                <w:rFonts w:ascii="Times New Roman" w:hAnsi="Times New Roman" w:cs="Times New Roman"/>
+                <w:noProof/>
+                <w:webHidden/>
+              </w:rPr>
+              <w:tab/>
+            </w:r>
+            <w:r>
+              <w:rPr>
+                <w:rFonts w:ascii="Times New Roman" w:hAnsi="Times New Roman" w:cs="Times New Roman"/>
+                <w:noProof/>
+                <w:webHidden/>
+              </w:rPr>
+              <w:fldChar w:fldCharType="begin"/>
+            </w:r>
+            <w:r>
+              <w:rPr>
+                <w:rFonts w:ascii="Times New Roman" w:hAnsi="Times New Roman" w:cs="Times New Roman"/>
+                <w:noProof/>
+                <w:webHidden/>
+              </w:rPr>
+              <w:instrText xml:space="preserve"> PAGEREF _Toc226814940 \h </w:instrText>
+            </w:r>
+            <w:r>
+              <w:rPr>
+                <w:rFonts w:ascii="Times New Roman" w:hAnsi="Times New Roman" w:cs="Times New Roman"/>
+                <w:noProof/>
+                <w:webHidden/>
+              </w:rPr>
+            </w:r>
+            <w:r>
+              <w:rPr>
+                <w:rFonts w:ascii="Times New Roman" w:hAnsi="Times New Roman" w:cs="Times New Roman"/>
+                <w:noProof/>
+                <w:webHidden/>
+              </w:rPr>
+              <w:fldChar w:fldCharType="separate"/>
+            </w:r>
+            <w:r>
+              <w:rPr>
+                <w:rFonts w:ascii="Times New Roman" w:hAnsi="Times New Roman" w:cs="Times New Roman"/>
+                <w:noProof/>
+                <w:webHidden/>
+              </w:rPr>
+              <w:t>6</w:t>
             </w:r>
             <w:r>
               <w:rPr>
@@ -666,14 +951,14 @@
               <w:lang w:eastAsia="es-CO"/>
             </w:rPr>
           </w:pPr>
-          <w:hyperlink w:anchor="_Toc226805712" w:history="1">
+          <w:hyperlink w:anchor="_Toc226814941" w:history="1">
             <w:r>
               <w:rPr>
                 <w:rStyle w:val="Hipervnculo"/>
                 <w:rFonts w:ascii="Times New Roman" w:hAnsi="Times New Roman" w:cs="Times New Roman"/>
                 <w:noProof/>
               </w:rPr>
-              <w:t>Lógica de Negocio en Base de Datos</w:t>
+              <w:t>Flujo de Datos</w:t>
             </w:r>
             <w:r>
               <w:rPr>
@@ -697,7 +982,7 @@
                 <w:noProof/>
                 <w:webHidden/>
               </w:rPr>
-              <w:instrText xml:space="preserve"> PAGEREF _Toc226805712 \h </w:instrText>
+              <w:instrText xml:space="preserve"> PAGEREF _Toc226814941 \h </w:instrText>
             </w:r>
             <w:r>
               <w:rPr>
@@ -720,241 +1005,7 @@
                 <w:noProof/>
                 <w:webHidden/>
               </w:rPr>
-              <w:t>3</w:t>
-            </w:r>
-            <w:r>
-              <w:rPr>
-                <w:rFonts w:ascii="Times New Roman" w:hAnsi="Times New Roman" w:cs="Times New Roman"/>
-                <w:noProof/>
-                <w:webHidden/>
-              </w:rPr>
-              <w:fldChar w:fldCharType="end"/>
-            </w:r>
-          </w:hyperlink>
-        </w:p>
-        <w:p>
-          <w:pPr>
-            <w:pStyle w:val="TDC2"/>
-            <w:tabs>
-              <w:tab w:val="right" w:leader="dot" w:pos="8828"/>
-            </w:tabs>
-            <w:rPr>
-              <w:rFonts w:ascii="Times New Roman" w:eastAsiaTheme="minorEastAsia" w:hAnsi="Times New Roman" w:cs="Times New Roman"/>
-              <w:noProof/>
-              <w:lang w:eastAsia="es-CO"/>
-            </w:rPr>
-          </w:pPr>
-          <w:hyperlink w:anchor="_Toc226805713" w:history="1">
-            <w:r>
-              <w:rPr>
-                <w:rStyle w:val="Hipervnculo"/>
-                <w:rFonts w:ascii="Times New Roman" w:hAnsi="Times New Roman" w:cs="Times New Roman"/>
-                <w:noProof/>
-              </w:rPr>
-              <w:t>Procedimientos</w:t>
-            </w:r>
-            <w:r>
-              <w:rPr>
-                <w:rFonts w:ascii="Times New Roman" w:hAnsi="Times New Roman" w:cs="Times New Roman"/>
-                <w:noProof/>
-                <w:webHidden/>
-              </w:rPr>
-              <w:tab/>
-            </w:r>
-            <w:r>
-              <w:rPr>
-                <w:rFonts w:ascii="Times New Roman" w:hAnsi="Times New Roman" w:cs="Times New Roman"/>
-                <w:noProof/>
-                <w:webHidden/>
-              </w:rPr>
-              <w:fldChar w:fldCharType="begin"/>
-            </w:r>
-            <w:r>
-              <w:rPr>
-                <w:rFonts w:ascii="Times New Roman" w:hAnsi="Times New Roman" w:cs="Times New Roman"/>
-                <w:noProof/>
-                <w:webHidden/>
-              </w:rPr>
-              <w:instrText xml:space="preserve"> PAGEREF _Toc226805713 \h </w:instrText>
-            </w:r>
-            <w:r>
-              <w:rPr>
-                <w:rFonts w:ascii="Times New Roman" w:hAnsi="Times New Roman" w:cs="Times New Roman"/>
-                <w:noProof/>
-                <w:webHidden/>
-              </w:rPr>
-            </w:r>
-            <w:r>
-              <w:rPr>
-                <w:rFonts w:ascii="Times New Roman" w:hAnsi="Times New Roman" w:cs="Times New Roman"/>
-                <w:noProof/>
-                <w:webHidden/>
-              </w:rPr>
-              <w:fldChar w:fldCharType="separate"/>
-            </w:r>
-            <w:r>
-              <w:rPr>
-                <w:rFonts w:ascii="Times New Roman" w:hAnsi="Times New Roman" w:cs="Times New Roman"/>
-                <w:noProof/>
-                <w:webHidden/>
-              </w:rPr>
-              <w:t>3</w:t>
-            </w:r>
-            <w:r>
-              <w:rPr>
-                <w:rFonts w:ascii="Times New Roman" w:hAnsi="Times New Roman" w:cs="Times New Roman"/>
-                <w:noProof/>
-                <w:webHidden/>
-              </w:rPr>
-              <w:fldChar w:fldCharType="end"/>
-            </w:r>
-          </w:hyperlink>
-        </w:p>
-        <w:p>
-          <w:pPr>
-            <w:pStyle w:val="TDC2"/>
-            <w:tabs>
-              <w:tab w:val="right" w:leader="dot" w:pos="8828"/>
-            </w:tabs>
-            <w:rPr>
-              <w:rFonts w:ascii="Times New Roman" w:eastAsiaTheme="minorEastAsia" w:hAnsi="Times New Roman" w:cs="Times New Roman"/>
-              <w:noProof/>
-              <w:lang w:eastAsia="es-CO"/>
-            </w:rPr>
-          </w:pPr>
-          <w:hyperlink w:anchor="_Toc226805714" w:history="1">
-            <w:r>
-              <w:rPr>
-                <w:rStyle w:val="Hipervnculo"/>
-                <w:rFonts w:ascii="Times New Roman" w:hAnsi="Times New Roman" w:cs="Times New Roman"/>
-                <w:noProof/>
-              </w:rPr>
-              <w:t>Funciones</w:t>
-            </w:r>
-            <w:r>
-              <w:rPr>
-                <w:rFonts w:ascii="Times New Roman" w:hAnsi="Times New Roman" w:cs="Times New Roman"/>
-                <w:noProof/>
-                <w:webHidden/>
-              </w:rPr>
-              <w:tab/>
-            </w:r>
-            <w:r>
-              <w:rPr>
-                <w:rFonts w:ascii="Times New Roman" w:hAnsi="Times New Roman" w:cs="Times New Roman"/>
-                <w:noProof/>
-                <w:webHidden/>
-              </w:rPr>
-              <w:fldChar w:fldCharType="begin"/>
-            </w:r>
-            <w:r>
-              <w:rPr>
-                <w:rFonts w:ascii="Times New Roman" w:hAnsi="Times New Roman" w:cs="Times New Roman"/>
-                <w:noProof/>
-                <w:webHidden/>
-              </w:rPr>
-              <w:instrText xml:space="preserve"> PAGEREF _Toc226805714 \h </w:instrText>
-            </w:r>
-            <w:r>
-              <w:rPr>
-                <w:rFonts w:ascii="Times New Roman" w:hAnsi="Times New Roman" w:cs="Times New Roman"/>
-                <w:noProof/>
-                <w:webHidden/>
-              </w:rPr>
-            </w:r>
-            <w:r>
-              <w:rPr>
-                <w:rFonts w:ascii="Times New Roman" w:hAnsi="Times New Roman" w:cs="Times New Roman"/>
-                <w:noProof/>
-                <w:webHidden/>
-              </w:rPr>
-              <w:fldChar w:fldCharType="separate"/>
-            </w:r>
-            <w:r>
-              <w:rPr>
-                <w:rFonts w:ascii="Times New Roman" w:hAnsi="Times New Roman" w:cs="Times New Roman"/>
-                <w:noProof/>
-                <w:webHidden/>
-              </w:rPr>
-              <w:t>3</w:t>
-            </w:r>
-            <w:r>
-              <w:rPr>
-                <w:rFonts w:ascii="Times New Roman" w:hAnsi="Times New Roman" w:cs="Times New Roman"/>
-                <w:noProof/>
-                <w:webHidden/>
-              </w:rPr>
-              <w:fldChar w:fldCharType="end"/>
-            </w:r>
-          </w:hyperlink>
-        </w:p>
-        <w:p>
-          <w:pPr>
-            <w:pStyle w:val="TDC2"/>
-            <w:tabs>
-              <w:tab w:val="right" w:leader="dot" w:pos="8828"/>
-            </w:tabs>
-            <w:rPr>
-              <w:rFonts w:ascii="Times New Roman" w:eastAsiaTheme="minorEastAsia" w:hAnsi="Times New Roman" w:cs="Times New Roman"/>
-              <w:noProof/>
-              <w:lang w:eastAsia="es-CO"/>
-            </w:rPr>
-          </w:pPr>
-          <w:hyperlink w:anchor="_Toc226805715" w:history="1">
-            <w:r>
-              <w:rPr>
-                <w:rStyle w:val="Hipervnculo"/>
-                <w:rFonts w:ascii="Times New Roman" w:hAnsi="Times New Roman" w:cs="Times New Roman"/>
-                <w:noProof/>
-              </w:rPr>
-              <w:t>Triggers</w:t>
-            </w:r>
-            <w:r>
-              <w:rPr>
-                <w:rFonts w:ascii="Times New Roman" w:hAnsi="Times New Roman" w:cs="Times New Roman"/>
-                <w:noProof/>
-                <w:webHidden/>
-              </w:rPr>
-              <w:tab/>
-            </w:r>
-            <w:r>
-              <w:rPr>
-                <w:rFonts w:ascii="Times New Roman" w:hAnsi="Times New Roman" w:cs="Times New Roman"/>
-                <w:noProof/>
-                <w:webHidden/>
-              </w:rPr>
-              <w:fldChar w:fldCharType="begin"/>
-            </w:r>
-            <w:r>
-              <w:rPr>
-                <w:rFonts w:ascii="Times New Roman" w:hAnsi="Times New Roman" w:cs="Times New Roman"/>
-                <w:noProof/>
-                <w:webHidden/>
-              </w:rPr>
-              <w:instrText xml:space="preserve"> PAGEREF _Toc226805715 \h </w:instrText>
-            </w:r>
-            <w:r>
-              <w:rPr>
-                <w:rFonts w:ascii="Times New Roman" w:hAnsi="Times New Roman" w:cs="Times New Roman"/>
-                <w:noProof/>
-                <w:webHidden/>
-              </w:rPr>
-            </w:r>
-            <w:r>
-              <w:rPr>
-                <w:rFonts w:ascii="Times New Roman" w:hAnsi="Times New Roman" w:cs="Times New Roman"/>
-                <w:noProof/>
-                <w:webHidden/>
-              </w:rPr>
-              <w:fldChar w:fldCharType="separate"/>
-            </w:r>
-            <w:r>
-              <w:rPr>
-                <w:rFonts w:ascii="Times New Roman" w:hAnsi="Times New Roman" w:cs="Times New Roman"/>
-                <w:noProof/>
-                <w:webHidden/>
-              </w:rPr>
-              <w:t>3</w:t>
+              <w:t>6</w:t>
             </w:r>
             <w:r>
               <w:rPr>
@@ -978,14 +1029,14 @@
               <w:lang w:eastAsia="es-CO"/>
             </w:rPr>
           </w:pPr>
-          <w:hyperlink w:anchor="_Toc226805716" w:history="1">
+          <w:hyperlink w:anchor="_Toc226814942" w:history="1">
             <w:r>
               <w:rPr>
                 <w:rStyle w:val="Hipervnculo"/>
                 <w:rFonts w:ascii="Times New Roman" w:hAnsi="Times New Roman" w:cs="Times New Roman"/>
                 <w:noProof/>
               </w:rPr>
-              <w:t>Flujo de Datos</w:t>
+              <w:t>Consideraciones Técnicas</w:t>
             </w:r>
             <w:r>
               <w:rPr>
@@ -1009,7 +1060,7 @@
                 <w:noProof/>
                 <w:webHidden/>
               </w:rPr>
-              <w:instrText xml:space="preserve"> PAGEREF _Toc226805716 \h </w:instrText>
+              <w:instrText xml:space="preserve"> PAGEREF _Toc226814942 \h </w:instrText>
             </w:r>
             <w:r>
               <w:rPr>
@@ -1032,85 +1083,7 @@
                 <w:noProof/>
                 <w:webHidden/>
               </w:rPr>
-              <w:t>3</w:t>
-            </w:r>
-            <w:r>
-              <w:rPr>
-                <w:rFonts w:ascii="Times New Roman" w:hAnsi="Times New Roman" w:cs="Times New Roman"/>
-                <w:noProof/>
-                <w:webHidden/>
-              </w:rPr>
-              <w:fldChar w:fldCharType="end"/>
-            </w:r>
-          </w:hyperlink>
-        </w:p>
-        <w:p>
-          <w:pPr>
-            <w:pStyle w:val="TDC1"/>
-            <w:tabs>
-              <w:tab w:val="right" w:leader="dot" w:pos="8828"/>
-            </w:tabs>
-            <w:rPr>
-              <w:rFonts w:ascii="Times New Roman" w:eastAsiaTheme="minorEastAsia" w:hAnsi="Times New Roman" w:cs="Times New Roman"/>
-              <w:noProof/>
-              <w:lang w:eastAsia="es-CO"/>
-            </w:rPr>
-          </w:pPr>
-          <w:hyperlink w:anchor="_Toc226805717" w:history="1">
-            <w:r>
-              <w:rPr>
-                <w:rStyle w:val="Hipervnculo"/>
-                <w:rFonts w:ascii="Times New Roman" w:hAnsi="Times New Roman" w:cs="Times New Roman"/>
-                <w:noProof/>
-              </w:rPr>
-              <w:t>Consideraciones Técnicas</w:t>
-            </w:r>
-            <w:r>
-              <w:rPr>
-                <w:rFonts w:ascii="Times New Roman" w:hAnsi="Times New Roman" w:cs="Times New Roman"/>
-                <w:noProof/>
-                <w:webHidden/>
-              </w:rPr>
-              <w:tab/>
-            </w:r>
-            <w:r>
-              <w:rPr>
-                <w:rFonts w:ascii="Times New Roman" w:hAnsi="Times New Roman" w:cs="Times New Roman"/>
-                <w:noProof/>
-                <w:webHidden/>
-              </w:rPr>
-              <w:fldChar w:fldCharType="begin"/>
-            </w:r>
-            <w:r>
-              <w:rPr>
-                <w:rFonts w:ascii="Times New Roman" w:hAnsi="Times New Roman" w:cs="Times New Roman"/>
-                <w:noProof/>
-                <w:webHidden/>
-              </w:rPr>
-              <w:instrText xml:space="preserve"> PAGEREF _Toc226805717 \h </w:instrText>
-            </w:r>
-            <w:r>
-              <w:rPr>
-                <w:rFonts w:ascii="Times New Roman" w:hAnsi="Times New Roman" w:cs="Times New Roman"/>
-                <w:noProof/>
-                <w:webHidden/>
-              </w:rPr>
-            </w:r>
-            <w:r>
-              <w:rPr>
-                <w:rFonts w:ascii="Times New Roman" w:hAnsi="Times New Roman" w:cs="Times New Roman"/>
-                <w:noProof/>
-                <w:webHidden/>
-              </w:rPr>
-              <w:fldChar w:fldCharType="separate"/>
-            </w:r>
-            <w:r>
-              <w:rPr>
-                <w:rFonts w:ascii="Times New Roman" w:hAnsi="Times New Roman" w:cs="Times New Roman"/>
-                <w:noProof/>
-                <w:webHidden/>
-              </w:rPr>
-              <w:t>4</w:t>
+              <w:t>6</w:t>
             </w:r>
             <w:r>
               <w:rPr>
@@ -1153,10 +1126,12 @@
       <w:pPr>
         <w:pStyle w:val="Ttulo1"/>
       </w:pPr>
+      <w:bookmarkStart w:id="0" w:name="_Toc226814934"/>
       <w:r>
         <w:lastRenderedPageBreak/>
         <w:t>Alcance</w:t>
       </w:r>
+      <w:bookmarkEnd w:id="0"/>
     </w:p>
     <w:p>
       <w:pPr>
@@ -1470,33 +1445,1402 @@
       <w:pPr>
         <w:pStyle w:val="Ttulo1"/>
       </w:pPr>
-      <w:bookmarkStart w:id="0" w:name="_Toc226805710"/>
+      <w:bookmarkStart w:id="1" w:name="_Toc226814935"/>
       <w:r>
         <w:t>Modelo Relacional</w:t>
       </w:r>
-      <w:bookmarkEnd w:id="0"/>
-    </w:p>
-    <w:p/>
+      <w:bookmarkEnd w:id="1"/>
+    </w:p>
+    <w:p>
+      <w:pPr>
+        <w:jc w:val="both"/>
+        <w:rPr>
+          <w:rFonts w:ascii="Times New Roman" w:hAnsi="Times New Roman" w:cs="Times New Roman"/>
+        </w:rPr>
+      </w:pPr>
+      <w:r>
+        <w:rPr>
+          <w:rFonts w:ascii="Times New Roman" w:hAnsi="Times New Roman" w:cs="Times New Roman"/>
+        </w:rPr>
+        <w:t xml:space="preserve">El módulo de usuarios, roles y control de acceso se estructura a partir de un conjunto de doce entidades principales: </w:t>
+      </w:r>
+      <w:r>
+        <w:rPr>
+          <w:rFonts w:ascii="Times New Roman" w:hAnsi="Times New Roman" w:cs="Times New Roman"/>
+          <w:i/>
+          <w:iCs/>
+        </w:rPr>
+        <w:t xml:space="preserve">usuarios, roles, </w:t>
+      </w:r>
+      <w:proofErr w:type="spellStart"/>
+      <w:r>
+        <w:rPr>
+          <w:rFonts w:ascii="Times New Roman" w:hAnsi="Times New Roman" w:cs="Times New Roman"/>
+          <w:i/>
+          <w:iCs/>
+        </w:rPr>
+        <w:t>roles_permisos</w:t>
+      </w:r>
+      <w:proofErr w:type="spellEnd"/>
+      <w:r>
+        <w:rPr>
+          <w:rFonts w:ascii="Times New Roman" w:hAnsi="Times New Roman" w:cs="Times New Roman"/>
+          <w:i/>
+          <w:iCs/>
+        </w:rPr>
+        <w:t xml:space="preserve">, permisos, </w:t>
+      </w:r>
+      <w:proofErr w:type="spellStart"/>
+      <w:r>
+        <w:rPr>
+          <w:rFonts w:ascii="Times New Roman" w:hAnsi="Times New Roman" w:cs="Times New Roman"/>
+          <w:i/>
+          <w:iCs/>
+        </w:rPr>
+        <w:t>gestiones_cuenta</w:t>
+      </w:r>
+      <w:proofErr w:type="spellEnd"/>
+      <w:r>
+        <w:rPr>
+          <w:rFonts w:ascii="Times New Roman" w:hAnsi="Times New Roman" w:cs="Times New Roman"/>
+          <w:i/>
+          <w:iCs/>
+        </w:rPr>
+        <w:t xml:space="preserve">, </w:t>
+      </w:r>
+      <w:proofErr w:type="spellStart"/>
+      <w:r>
+        <w:rPr>
+          <w:rFonts w:ascii="Times New Roman" w:hAnsi="Times New Roman" w:cs="Times New Roman"/>
+          <w:i/>
+          <w:iCs/>
+        </w:rPr>
+        <w:t>estados_cuenta</w:t>
+      </w:r>
+      <w:proofErr w:type="spellEnd"/>
+      <w:r>
+        <w:rPr>
+          <w:rFonts w:ascii="Times New Roman" w:hAnsi="Times New Roman" w:cs="Times New Roman"/>
+          <w:i/>
+          <w:iCs/>
+        </w:rPr>
+        <w:t xml:space="preserve">, eventos, </w:t>
+      </w:r>
+      <w:proofErr w:type="spellStart"/>
+      <w:r>
+        <w:rPr>
+          <w:rFonts w:ascii="Times New Roman" w:hAnsi="Times New Roman" w:cs="Times New Roman"/>
+          <w:i/>
+          <w:iCs/>
+        </w:rPr>
+        <w:t>tipo_eventos</w:t>
+      </w:r>
+      <w:proofErr w:type="spellEnd"/>
+      <w:r>
+        <w:rPr>
+          <w:rFonts w:ascii="Times New Roman" w:hAnsi="Times New Roman" w:cs="Times New Roman"/>
+          <w:i/>
+          <w:iCs/>
+        </w:rPr>
+        <w:t xml:space="preserve">, notificaciones, </w:t>
+      </w:r>
+      <w:proofErr w:type="spellStart"/>
+      <w:r>
+        <w:rPr>
+          <w:rFonts w:ascii="Times New Roman" w:hAnsi="Times New Roman" w:cs="Times New Roman"/>
+          <w:i/>
+          <w:iCs/>
+        </w:rPr>
+        <w:t>notificaciones_canales</w:t>
+      </w:r>
+      <w:proofErr w:type="spellEnd"/>
+      <w:r>
+        <w:rPr>
+          <w:rFonts w:ascii="Times New Roman" w:hAnsi="Times New Roman" w:cs="Times New Roman"/>
+          <w:i/>
+          <w:iCs/>
+        </w:rPr>
+        <w:t>, sesiones</w:t>
+      </w:r>
+      <w:r>
+        <w:rPr>
+          <w:rFonts w:ascii="Times New Roman" w:hAnsi="Times New Roman" w:cs="Times New Roman"/>
+        </w:rPr>
+        <w:t xml:space="preserve"> y </w:t>
+      </w:r>
+      <w:proofErr w:type="spellStart"/>
+      <w:r>
+        <w:rPr>
+          <w:rFonts w:ascii="Times New Roman" w:hAnsi="Times New Roman" w:cs="Times New Roman"/>
+          <w:i/>
+          <w:iCs/>
+        </w:rPr>
+        <w:t>cuentas_usuarios</w:t>
+      </w:r>
+      <w:proofErr w:type="spellEnd"/>
+      <w:r>
+        <w:rPr>
+          <w:rFonts w:ascii="Times New Roman" w:hAnsi="Times New Roman" w:cs="Times New Roman"/>
+        </w:rPr>
+        <w:t>.</w:t>
+      </w:r>
+    </w:p>
+    <w:p>
+      <w:pPr>
+        <w:jc w:val="both"/>
+        <w:rPr>
+          <w:rFonts w:ascii="Times New Roman" w:hAnsi="Times New Roman" w:cs="Times New Roman"/>
+        </w:rPr>
+      </w:pPr>
+      <w:r>
+        <w:rPr>
+          <w:rFonts w:ascii="Times New Roman" w:hAnsi="Times New Roman" w:cs="Times New Roman"/>
+        </w:rPr>
+        <w:t>El diseño del modelo relacional se fundamenta en principios de consistencia semántica, escalabilidad y control de integridad, alineados con la nomenclatura previamente definida. Asimismo, se prioriza el uso de relaciones normalizadas y el soporte para operaciones transaccionales complejas, garantizando coherencia en el manejo de los datos.</w:t>
+      </w:r>
+    </w:p>
+    <w:p>
+      <w:pPr>
+        <w:jc w:val="both"/>
+        <w:rPr>
+          <w:rFonts w:ascii="Times New Roman" w:hAnsi="Times New Roman" w:cs="Times New Roman"/>
+        </w:rPr>
+      </w:pPr>
+      <w:r>
+        <w:rPr>
+          <w:rFonts w:ascii="Times New Roman" w:hAnsi="Times New Roman" w:cs="Times New Roman"/>
+        </w:rPr>
+        <w:t xml:space="preserve">En primera instancia, se establece que cada usuario posee un único rol dentro del sistema. Sin embargo, los roles se encuentran asociados a un conjunto de permisos mediante una relación de tipo muchos a muchos. Para resolver esta relación, se implementa la tabla intermedia </w:t>
+      </w:r>
+      <w:proofErr w:type="spellStart"/>
+      <w:r>
+        <w:rPr>
+          <w:rFonts w:ascii="Times New Roman" w:hAnsi="Times New Roman" w:cs="Times New Roman"/>
+          <w:i/>
+          <w:iCs/>
+        </w:rPr>
+        <w:t>roles_permisos</w:t>
+      </w:r>
+      <w:proofErr w:type="spellEnd"/>
+      <w:r>
+        <w:rPr>
+          <w:rFonts w:ascii="Times New Roman" w:hAnsi="Times New Roman" w:cs="Times New Roman"/>
+        </w:rPr>
+        <w:t xml:space="preserve">, la cual almacena como claves foráneas el identificador del </w:t>
+      </w:r>
+      <w:proofErr w:type="gramStart"/>
+      <w:r>
+        <w:rPr>
+          <w:rFonts w:ascii="Times New Roman" w:hAnsi="Times New Roman" w:cs="Times New Roman"/>
+        </w:rPr>
+        <w:t>rol  y</w:t>
+      </w:r>
+      <w:proofErr w:type="gramEnd"/>
+      <w:r>
+        <w:rPr>
+          <w:rFonts w:ascii="Times New Roman" w:hAnsi="Times New Roman" w:cs="Times New Roman"/>
+        </w:rPr>
+        <w:t xml:space="preserve"> el identificador del permiso</w:t>
+      </w:r>
+      <w:r>
+        <w:rPr>
+          <w:rFonts w:ascii="Times New Roman" w:hAnsi="Times New Roman" w:cs="Times New Roman"/>
+        </w:rPr>
+        <w:t xml:space="preserve">, </w:t>
+      </w:r>
+      <w:r>
+        <w:rPr>
+          <w:rFonts w:ascii="Times New Roman" w:hAnsi="Times New Roman" w:cs="Times New Roman"/>
+        </w:rPr>
+        <w:t>junto con un atributo adicional que registra la fecha de asignación. Con el fin de garantizar la integridad y evitar duplicidad en las asignaciones, se define una clave primaria compuesta sobre dichas claves foráneas.</w:t>
+      </w:r>
+    </w:p>
+    <w:p>
+      <w:pPr>
+        <w:jc w:val="both"/>
+        <w:rPr>
+          <w:rFonts w:ascii="Times New Roman" w:hAnsi="Times New Roman" w:cs="Times New Roman"/>
+        </w:rPr>
+      </w:pPr>
+      <w:r>
+        <w:rPr>
+          <w:rFonts w:ascii="Times New Roman" w:hAnsi="Times New Roman" w:cs="Times New Roman"/>
+        </w:rPr>
+        <w:t xml:space="preserve">En cuanto a la gestión de cuentas, se establece una relación uno a uno entre las entidades </w:t>
+      </w:r>
+      <w:r>
+        <w:rPr>
+          <w:rFonts w:ascii="Times New Roman" w:hAnsi="Times New Roman" w:cs="Times New Roman"/>
+          <w:i/>
+          <w:iCs/>
+        </w:rPr>
+        <w:t>usuarios</w:t>
+      </w:r>
+      <w:r>
+        <w:rPr>
+          <w:rFonts w:ascii="Times New Roman" w:hAnsi="Times New Roman" w:cs="Times New Roman"/>
+        </w:rPr>
+        <w:t xml:space="preserve"> y </w:t>
+      </w:r>
+      <w:proofErr w:type="spellStart"/>
+      <w:r>
+        <w:rPr>
+          <w:rFonts w:ascii="Times New Roman" w:hAnsi="Times New Roman" w:cs="Times New Roman"/>
+          <w:i/>
+          <w:iCs/>
+        </w:rPr>
+        <w:t>cuentas_usuarios</w:t>
+      </w:r>
+      <w:proofErr w:type="spellEnd"/>
+      <w:r>
+        <w:rPr>
+          <w:rFonts w:ascii="Times New Roman" w:hAnsi="Times New Roman" w:cs="Times New Roman"/>
+        </w:rPr>
+        <w:t xml:space="preserve">, asegurando que cada usuario tenga asociada una única cuenta dentro del sistema. A su vez, la tabla </w:t>
+      </w:r>
+      <w:proofErr w:type="spellStart"/>
+      <w:r>
+        <w:rPr>
+          <w:rFonts w:ascii="Times New Roman" w:hAnsi="Times New Roman" w:cs="Times New Roman"/>
+          <w:i/>
+          <w:iCs/>
+        </w:rPr>
+        <w:t>cuentas_usuarios</w:t>
+      </w:r>
+      <w:proofErr w:type="spellEnd"/>
+      <w:r>
+        <w:rPr>
+          <w:rFonts w:ascii="Times New Roman" w:hAnsi="Times New Roman" w:cs="Times New Roman"/>
+        </w:rPr>
+        <w:t xml:space="preserve"> se relaciona con </w:t>
+      </w:r>
+      <w:proofErr w:type="spellStart"/>
+      <w:r>
+        <w:rPr>
+          <w:rFonts w:ascii="Times New Roman" w:hAnsi="Times New Roman" w:cs="Times New Roman"/>
+          <w:i/>
+          <w:iCs/>
+        </w:rPr>
+        <w:t>estados_cuenta</w:t>
+      </w:r>
+      <w:proofErr w:type="spellEnd"/>
+      <w:r>
+        <w:rPr>
+          <w:rFonts w:ascii="Times New Roman" w:hAnsi="Times New Roman" w:cs="Times New Roman"/>
+        </w:rPr>
+        <w:t xml:space="preserve"> mediante una relación de muchos a uno, donde cada cuenta posee un único estado, mientras que un estado puede estar asociado a múltiples cuentas.</w:t>
+      </w:r>
+    </w:p>
+    <w:p>
+      <w:pPr>
+        <w:jc w:val="both"/>
+        <w:rPr>
+          <w:rFonts w:ascii="Times New Roman" w:hAnsi="Times New Roman" w:cs="Times New Roman"/>
+        </w:rPr>
+      </w:pPr>
+      <w:r>
+        <w:rPr>
+          <w:rFonts w:ascii="Times New Roman" w:hAnsi="Times New Roman" w:cs="Times New Roman"/>
+        </w:rPr>
+        <w:t xml:space="preserve">Adicionalmente, la entidad </w:t>
+      </w:r>
+      <w:proofErr w:type="spellStart"/>
+      <w:r>
+        <w:rPr>
+          <w:rFonts w:ascii="Times New Roman" w:hAnsi="Times New Roman" w:cs="Times New Roman"/>
+          <w:i/>
+          <w:iCs/>
+        </w:rPr>
+        <w:t>gestiones_cuenta</w:t>
+      </w:r>
+      <w:proofErr w:type="spellEnd"/>
+      <w:r>
+        <w:rPr>
+          <w:rFonts w:ascii="Times New Roman" w:hAnsi="Times New Roman" w:cs="Times New Roman"/>
+        </w:rPr>
+        <w:t xml:space="preserve"> se vincula con </w:t>
+      </w:r>
+      <w:proofErr w:type="spellStart"/>
+      <w:r>
+        <w:rPr>
+          <w:rFonts w:ascii="Times New Roman" w:hAnsi="Times New Roman" w:cs="Times New Roman"/>
+          <w:i/>
+          <w:iCs/>
+        </w:rPr>
+        <w:t>cuentas_usuarios</w:t>
+      </w:r>
+      <w:proofErr w:type="spellEnd"/>
+      <w:r>
+        <w:rPr>
+          <w:rFonts w:ascii="Times New Roman" w:hAnsi="Times New Roman" w:cs="Times New Roman"/>
+          <w:i/>
+          <w:iCs/>
+        </w:rPr>
+        <w:t xml:space="preserve"> </w:t>
+      </w:r>
+      <w:r>
+        <w:rPr>
+          <w:rFonts w:ascii="Times New Roman" w:hAnsi="Times New Roman" w:cs="Times New Roman"/>
+        </w:rPr>
+        <w:t>bajo una relación de muchos a uno, permitiendo que una cuenta registre múltiples gestiones o acciones administrativas, mientras que cada gestión pertenece exclusivamente a una cuenta. Este diseño responde a la necesidad de soportar escenarios donde usuarios con roles privilegiados (por ejemplo, administradores) puedan gestionar cuentas de otros usuarios, garantizando trazabilidad de dichas acciones.</w:t>
+      </w:r>
+    </w:p>
+    <w:p>
+      <w:pPr>
+        <w:jc w:val="both"/>
+        <w:rPr>
+          <w:rFonts w:ascii="Times New Roman" w:hAnsi="Times New Roman" w:cs="Times New Roman"/>
+        </w:rPr>
+      </w:pPr>
+      <w:r>
+        <w:rPr>
+          <w:rFonts w:ascii="Times New Roman" w:hAnsi="Times New Roman" w:cs="Times New Roman"/>
+        </w:rPr>
+        <w:t xml:space="preserve">Por otra parte, la entidad </w:t>
+      </w:r>
+      <w:proofErr w:type="spellStart"/>
+      <w:r>
+        <w:rPr>
+          <w:rFonts w:ascii="Times New Roman" w:hAnsi="Times New Roman" w:cs="Times New Roman"/>
+          <w:i/>
+          <w:iCs/>
+        </w:rPr>
+        <w:t>cuentas_usuarios</w:t>
+      </w:r>
+      <w:proofErr w:type="spellEnd"/>
+      <w:r>
+        <w:rPr>
+          <w:rFonts w:ascii="Times New Roman" w:hAnsi="Times New Roman" w:cs="Times New Roman"/>
+        </w:rPr>
+        <w:t xml:space="preserve"> se relaciona con la tabla </w:t>
+      </w:r>
+      <w:r>
+        <w:rPr>
+          <w:rFonts w:ascii="Times New Roman" w:hAnsi="Times New Roman" w:cs="Times New Roman"/>
+          <w:i/>
+          <w:iCs/>
+        </w:rPr>
+        <w:t>sesiones</w:t>
+      </w:r>
+      <w:r>
+        <w:rPr>
+          <w:rFonts w:ascii="Times New Roman" w:hAnsi="Times New Roman" w:cs="Times New Roman"/>
+        </w:rPr>
+        <w:t xml:space="preserve"> mediante una relación de uno a muchos, en la cual una cuenta puede generar múltiples sesiones activas o históricas, mientras que cada sesión pertenece a una única cuenta. En continuidad con este </w:t>
+      </w:r>
+      <w:r>
+        <w:rPr>
+          <w:rFonts w:ascii="Times New Roman" w:hAnsi="Times New Roman" w:cs="Times New Roman"/>
+        </w:rPr>
+        <w:lastRenderedPageBreak/>
+        <w:t xml:space="preserve">flujo, la tabla </w:t>
+      </w:r>
+      <w:r>
+        <w:rPr>
+          <w:rFonts w:ascii="Times New Roman" w:hAnsi="Times New Roman" w:cs="Times New Roman"/>
+          <w:i/>
+          <w:iCs/>
+        </w:rPr>
+        <w:t>sesiones</w:t>
+      </w:r>
+      <w:r>
+        <w:rPr>
+          <w:rFonts w:ascii="Times New Roman" w:hAnsi="Times New Roman" w:cs="Times New Roman"/>
+        </w:rPr>
+        <w:t xml:space="preserve"> se relaciona con la entidad </w:t>
+      </w:r>
+      <w:r>
+        <w:rPr>
+          <w:rFonts w:ascii="Times New Roman" w:hAnsi="Times New Roman" w:cs="Times New Roman"/>
+          <w:i/>
+          <w:iCs/>
+        </w:rPr>
+        <w:t>eventos</w:t>
+      </w:r>
+      <w:r>
+        <w:rPr>
+          <w:rFonts w:ascii="Times New Roman" w:hAnsi="Times New Roman" w:cs="Times New Roman"/>
+        </w:rPr>
+        <w:t xml:space="preserve"> también bajo una relación de uno a muchos, permitiendo registrar múltiples eventos asociados a una misma sesión, lo cual facilita el seguimiento detallado de la actividad del usuario dentro del sistema.</w:t>
+      </w:r>
+    </w:p>
+    <w:p>
+      <w:pPr>
+        <w:jc w:val="both"/>
+        <w:rPr>
+          <w:rFonts w:ascii="Times New Roman" w:hAnsi="Times New Roman" w:cs="Times New Roman"/>
+        </w:rPr>
+      </w:pPr>
+      <w:r>
+        <w:rPr>
+          <w:rFonts w:ascii="Times New Roman" w:hAnsi="Times New Roman" w:cs="Times New Roman"/>
+        </w:rPr>
+        <w:t xml:space="preserve">Con el objetivo de promover la escalabilidad y estandarización, la tabla eventos se vincula con la entidad </w:t>
+      </w:r>
+      <w:proofErr w:type="spellStart"/>
+      <w:r>
+        <w:rPr>
+          <w:rFonts w:ascii="Times New Roman" w:hAnsi="Times New Roman" w:cs="Times New Roman"/>
+          <w:i/>
+          <w:iCs/>
+        </w:rPr>
+        <w:t>tipo_eventos</w:t>
+      </w:r>
+      <w:proofErr w:type="spellEnd"/>
+      <w:r>
+        <w:rPr>
+          <w:rFonts w:ascii="Times New Roman" w:hAnsi="Times New Roman" w:cs="Times New Roman"/>
+        </w:rPr>
+        <w:t xml:space="preserve"> mediante una relación de muchos a uno, de forma que cada evento corresponde a un único tipo, mientras que un tipo de evento puede agrupar múltiples eventos. Esto permite una clasificación eficiente y extensible de las acciones registradas.</w:t>
+      </w:r>
+    </w:p>
+    <w:p>
+      <w:pPr>
+        <w:jc w:val="both"/>
+        <w:rPr>
+          <w:rFonts w:ascii="Times New Roman" w:hAnsi="Times New Roman" w:cs="Times New Roman"/>
+        </w:rPr>
+      </w:pPr>
+      <w:r>
+        <w:rPr>
+          <w:rFonts w:ascii="Times New Roman" w:hAnsi="Times New Roman" w:cs="Times New Roman"/>
+        </w:rPr>
+        <w:t xml:space="preserve">Finalmente, en el ámbito de notificaciones, se establece una relación de uno a muchos entre </w:t>
+      </w:r>
+      <w:r>
+        <w:rPr>
+          <w:rFonts w:ascii="Times New Roman" w:hAnsi="Times New Roman" w:cs="Times New Roman"/>
+          <w:i/>
+          <w:iCs/>
+        </w:rPr>
+        <w:t>eventos</w:t>
+      </w:r>
+      <w:r>
+        <w:rPr>
+          <w:rFonts w:ascii="Times New Roman" w:hAnsi="Times New Roman" w:cs="Times New Roman"/>
+        </w:rPr>
+        <w:t xml:space="preserve"> y </w:t>
+      </w:r>
+      <w:r>
+        <w:rPr>
+          <w:rFonts w:ascii="Times New Roman" w:hAnsi="Times New Roman" w:cs="Times New Roman"/>
+          <w:i/>
+          <w:iCs/>
+        </w:rPr>
+        <w:t>notificaciones</w:t>
+      </w:r>
+      <w:r>
+        <w:rPr>
+          <w:rFonts w:ascii="Times New Roman" w:hAnsi="Times New Roman" w:cs="Times New Roman"/>
+        </w:rPr>
+        <w:t xml:space="preserve">, donde un evento puede generar múltiples notificaciones, pero cada notificación está asociada a un único evento. Complementariamente, la tabla notificaciones se relaciona con </w:t>
+      </w:r>
+      <w:proofErr w:type="spellStart"/>
+      <w:r>
+        <w:rPr>
+          <w:rFonts w:ascii="Times New Roman" w:hAnsi="Times New Roman" w:cs="Times New Roman"/>
+          <w:i/>
+          <w:iCs/>
+        </w:rPr>
+        <w:t>notificaciones_canales</w:t>
+      </w:r>
+      <w:proofErr w:type="spellEnd"/>
+      <w:r>
+        <w:rPr>
+          <w:rFonts w:ascii="Times New Roman" w:hAnsi="Times New Roman" w:cs="Times New Roman"/>
+        </w:rPr>
+        <w:t xml:space="preserve"> mediante una relación de muchos a uno, permitiendo que cada notificación se emita a través de un único canal, mientras que un canal puede ser utilizado por múltiples notificaciones. Esta estructura favorece la flexibilidad en los mecanismos de comunicación del sistema.</w:t>
+      </w:r>
+    </w:p>
+    <w:p>
+      <w:pPr>
+        <w:jc w:val="both"/>
+        <w:rPr>
+          <w:rFonts w:ascii="Times New Roman" w:hAnsi="Times New Roman" w:cs="Times New Roman"/>
+        </w:rPr>
+      </w:pPr>
+      <w:r>
+        <w:rPr>
+          <w:rFonts w:ascii="Times New Roman" w:hAnsi="Times New Roman" w:cs="Times New Roman"/>
+        </w:rPr>
+        <w:t xml:space="preserve">Como complemento a esta descripción, se adjunta el diagrama relacional correspondiente. No obstante, para un análisis más detallado y preciso, se recomienda consultar los documentos </w:t>
+      </w:r>
+      <w:proofErr w:type="spellStart"/>
+      <w:r>
+        <w:rPr>
+          <w:rFonts w:ascii="Times New Roman" w:hAnsi="Times New Roman" w:cs="Times New Roman"/>
+        </w:rPr>
+        <w:t>DiagramaRelacional.pgerd</w:t>
+      </w:r>
+      <w:proofErr w:type="spellEnd"/>
+      <w:r>
+        <w:rPr>
+          <w:rFonts w:ascii="Times New Roman" w:hAnsi="Times New Roman" w:cs="Times New Roman"/>
+        </w:rPr>
+        <w:t xml:space="preserve"> y DiccionarioDatos.xlsx, donde se especifican las estructuras, atributos y restricciones del modelo de datos</w:t>
+      </w:r>
+    </w:p>
+    <w:p>
+      <w:pPr>
+        <w:jc w:val="both"/>
+        <w:rPr>
+          <w:rFonts w:ascii="Times New Roman" w:hAnsi="Times New Roman" w:cs="Times New Roman"/>
+        </w:rPr>
+      </w:pPr>
+    </w:p>
+    <w:p>
+      <w:pPr>
+        <w:jc w:val="both"/>
+        <w:rPr>
+          <w:rFonts w:ascii="Times New Roman" w:hAnsi="Times New Roman" w:cs="Times New Roman"/>
+        </w:rPr>
+      </w:pPr>
+      <w:r>
+        <w:rPr>
+          <w:noProof/>
+        </w:rPr>
+        <w:drawing>
+          <wp:inline distT="0" distB="0" distL="0" distR="0" wp14:anchorId="2FE3C9EC" wp14:editId="78EBB6BD">
+            <wp:extent cx="5881254" cy="3010499"/>
+            <wp:effectExtent l="0" t="0" r="5715" b="0"/>
+            <wp:docPr id="69697785" name="Imagen 1"/>
+            <wp:cNvGraphicFramePr>
+              <a:graphicFrameLocks xmlns:a="http://schemas.openxmlformats.org/drawingml/2006/main" noChangeAspect="1"/>
+            </wp:cNvGraphicFramePr>
+            <a:graphic xmlns:a="http://schemas.openxmlformats.org/drawingml/2006/main">
+              <a:graphicData uri="http://schemas.openxmlformats.org/drawingml/2006/picture">
+                <pic:pic xmlns:pic="http://schemas.openxmlformats.org/drawingml/2006/picture">
+                  <pic:nvPicPr>
+                    <pic:cNvPr id="0" name="Picture 1"/>
+                    <pic:cNvPicPr>
+                      <a:picLocks noChangeAspect="1" noChangeArrowheads="1"/>
+                    </pic:cNvPicPr>
+                  </pic:nvPicPr>
+                  <pic:blipFill>
+                    <a:blip r:embed="rId7" cstate="print">
+                      <a:extLst>
+                        <a:ext uri="{28A0092B-C50C-407E-A947-70E740481C1C}">
+                          <a14:useLocalDpi xmlns:a14="http://schemas.microsoft.com/office/drawing/2010/main" val="0"/>
+                        </a:ext>
+                      </a:extLst>
+                    </a:blip>
+                    <a:srcRect/>
+                    <a:stretch>
+                      <a:fillRect/>
+                    </a:stretch>
+                  </pic:blipFill>
+                  <pic:spPr bwMode="auto">
+                    <a:xfrm>
+                      <a:off x="0" y="0"/>
+                      <a:ext cx="5884490" cy="3012155"/>
+                    </a:xfrm>
+                    <a:prstGeom prst="rect">
+                      <a:avLst/>
+                    </a:prstGeom>
+                    <a:noFill/>
+                    <a:ln>
+                      <a:noFill/>
+                    </a:ln>
+                  </pic:spPr>
+                </pic:pic>
+              </a:graphicData>
+            </a:graphic>
+          </wp:inline>
+        </w:drawing>
+      </w:r>
+    </w:p>
     <w:p>
       <w:pPr>
         <w:pStyle w:val="Ttulo1"/>
       </w:pPr>
-      <w:bookmarkStart w:id="1" w:name="_Toc226805711"/>
-      <w:r>
+      <w:bookmarkStart w:id="2" w:name="_Toc226814936"/>
+      <w:r>
+        <w:lastRenderedPageBreak/>
         <w:t>Diccionario de Datos</w:t>
       </w:r>
-      <w:bookmarkEnd w:id="1"/>
-    </w:p>
-    <w:p/>
+      <w:bookmarkEnd w:id="2"/>
+    </w:p>
+    <w:p>
+      <w:pPr>
+        <w:jc w:val="both"/>
+        <w:rPr>
+          <w:rFonts w:ascii="Times New Roman" w:hAnsi="Times New Roman" w:cs="Times New Roman"/>
+        </w:rPr>
+      </w:pPr>
+      <w:r>
+        <w:rPr>
+          <w:rFonts w:ascii="Times New Roman" w:hAnsi="Times New Roman" w:cs="Times New Roman"/>
+        </w:rPr>
+        <w:t>El modelo de datos del módulo de usuarios, roles y control de acceso gestiona de manera coherente la información asociada a los usuarios y sus interacciones dentro del sistema.</w:t>
+      </w:r>
+    </w:p>
+    <w:p>
+      <w:pPr>
+        <w:jc w:val="both"/>
+        <w:rPr>
+          <w:rFonts w:ascii="Times New Roman" w:hAnsi="Times New Roman" w:cs="Times New Roman"/>
+        </w:rPr>
+      </w:pPr>
+      <w:r>
+        <w:rPr>
+          <w:rFonts w:ascii="Times New Roman" w:hAnsi="Times New Roman" w:cs="Times New Roman"/>
+        </w:rPr>
+        <w:t xml:space="preserve">En este contexto, la entidad usuarios constituye el núcleo del modelo, ya que almacena la información principal de los individuos registrados. Su clave primaria </w:t>
+      </w:r>
+      <w:proofErr w:type="spellStart"/>
+      <w:r>
+        <w:rPr>
+          <w:rFonts w:ascii="Times New Roman" w:hAnsi="Times New Roman" w:cs="Times New Roman"/>
+          <w:i/>
+          <w:iCs/>
+        </w:rPr>
+        <w:t>id_usuarios</w:t>
+      </w:r>
+      <w:proofErr w:type="spellEnd"/>
+      <w:r>
+        <w:rPr>
+          <w:rFonts w:ascii="Times New Roman" w:hAnsi="Times New Roman" w:cs="Times New Roman"/>
+        </w:rPr>
+        <w:t xml:space="preserve"> garantiza la unicidad de cada registro y es generada automáticamente, lo que facilita la identificación inequívoca del usuario en todo el sistema. Adicionalmente, se establecen restricciones de unicidad sobre campos críticos como </w:t>
+      </w:r>
+      <w:proofErr w:type="spellStart"/>
+      <w:r>
+        <w:rPr>
+          <w:rFonts w:ascii="Times New Roman" w:hAnsi="Times New Roman" w:cs="Times New Roman"/>
+          <w:i/>
+          <w:iCs/>
+        </w:rPr>
+        <w:t>uq_numero_identificacion</w:t>
+      </w:r>
+      <w:proofErr w:type="spellEnd"/>
+      <w:r>
+        <w:rPr>
+          <w:rFonts w:ascii="Times New Roman" w:hAnsi="Times New Roman" w:cs="Times New Roman"/>
+        </w:rPr>
+        <w:t xml:space="preserve"> y </w:t>
+      </w:r>
+      <w:proofErr w:type="spellStart"/>
+      <w:r>
+        <w:rPr>
+          <w:rFonts w:ascii="Times New Roman" w:hAnsi="Times New Roman" w:cs="Times New Roman"/>
+          <w:i/>
+          <w:iCs/>
+        </w:rPr>
+        <w:t>uq_correo_electronico</w:t>
+      </w:r>
+      <w:proofErr w:type="spellEnd"/>
+      <w:r>
+        <w:rPr>
+          <w:rFonts w:ascii="Times New Roman" w:hAnsi="Times New Roman" w:cs="Times New Roman"/>
+        </w:rPr>
+        <w:t>, los cuales aseguran que no existan duplicidades en atributos sensibles utilizados para autenticación e identificación.</w:t>
+      </w:r>
+    </w:p>
+    <w:p>
+      <w:pPr>
+        <w:jc w:val="both"/>
+        <w:rPr>
+          <w:rFonts w:ascii="Times New Roman" w:hAnsi="Times New Roman" w:cs="Times New Roman"/>
+        </w:rPr>
+      </w:pPr>
+      <w:r>
+        <w:rPr>
+          <w:rFonts w:ascii="Times New Roman" w:hAnsi="Times New Roman" w:cs="Times New Roman"/>
+        </w:rPr>
+        <w:t xml:space="preserve">Desde una perspectiva relacional, el campo </w:t>
+      </w:r>
+      <w:proofErr w:type="spellStart"/>
+      <w:r>
+        <w:rPr>
+          <w:rFonts w:ascii="Times New Roman" w:hAnsi="Times New Roman" w:cs="Times New Roman"/>
+          <w:i/>
+          <w:iCs/>
+        </w:rPr>
+        <w:t>fk_rol</w:t>
+      </w:r>
+      <w:proofErr w:type="spellEnd"/>
+      <w:r>
+        <w:rPr>
+          <w:rFonts w:ascii="Times New Roman" w:hAnsi="Times New Roman" w:cs="Times New Roman"/>
+        </w:rPr>
+        <w:t xml:space="preserve"> en la tabla usuarios representa una clave foránea fundamental, ya que vincula cada usuario con un rol específico dentro del sistema, estableciendo así la base del control de acceso.</w:t>
+      </w:r>
+    </w:p>
+    <w:p>
+      <w:pPr>
+        <w:jc w:val="both"/>
+        <w:rPr>
+          <w:rFonts w:ascii="Times New Roman" w:hAnsi="Times New Roman" w:cs="Times New Roman"/>
+        </w:rPr>
+      </w:pPr>
+      <w:r>
+        <w:rPr>
+          <w:rFonts w:ascii="Times New Roman" w:hAnsi="Times New Roman" w:cs="Times New Roman"/>
+        </w:rPr>
+        <w:t xml:space="preserve">La entidad roles, por su parte, define los perfiles funcionales del sistema. Su clave primaria </w:t>
+      </w:r>
+      <w:proofErr w:type="spellStart"/>
+      <w:r>
+        <w:rPr>
+          <w:rFonts w:ascii="Times New Roman" w:hAnsi="Times New Roman" w:cs="Times New Roman"/>
+          <w:i/>
+          <w:iCs/>
+        </w:rPr>
+        <w:t>id_rol</w:t>
+      </w:r>
+      <w:proofErr w:type="spellEnd"/>
+      <w:r>
+        <w:rPr>
+          <w:rFonts w:ascii="Times New Roman" w:hAnsi="Times New Roman" w:cs="Times New Roman"/>
+        </w:rPr>
+        <w:t xml:space="preserve"> permite identificar cada rol, mientras que el atributo </w:t>
+      </w:r>
+      <w:proofErr w:type="spellStart"/>
+      <w:r>
+        <w:rPr>
+          <w:rFonts w:ascii="Times New Roman" w:hAnsi="Times New Roman" w:cs="Times New Roman"/>
+          <w:i/>
+          <w:iCs/>
+        </w:rPr>
+        <w:t>uq_nombre</w:t>
+      </w:r>
+      <w:proofErr w:type="spellEnd"/>
+      <w:r>
+        <w:rPr>
+          <w:rFonts w:ascii="Times New Roman" w:hAnsi="Times New Roman" w:cs="Times New Roman"/>
+        </w:rPr>
+        <w:t xml:space="preserve"> garantiza la unicidad semántica de los mismos. La relación entre roles y permisos se materializa a través de la tabla intermedia </w:t>
+      </w:r>
+      <w:proofErr w:type="spellStart"/>
+      <w:r>
+        <w:rPr>
+          <w:rFonts w:ascii="Times New Roman" w:hAnsi="Times New Roman" w:cs="Times New Roman"/>
+          <w:i/>
+          <w:iCs/>
+        </w:rPr>
+        <w:t>roles_permisos</w:t>
+      </w:r>
+      <w:proofErr w:type="spellEnd"/>
+      <w:r>
+        <w:rPr>
+          <w:rFonts w:ascii="Times New Roman" w:hAnsi="Times New Roman" w:cs="Times New Roman"/>
+        </w:rPr>
+        <w:t>, la cual resuelve una relación de muchos a muchos mediante claves foráneas (</w:t>
+      </w:r>
+      <w:proofErr w:type="spellStart"/>
+      <w:r>
+        <w:rPr>
+          <w:rFonts w:ascii="Times New Roman" w:hAnsi="Times New Roman" w:cs="Times New Roman"/>
+        </w:rPr>
+        <w:t>fk_rol</w:t>
+      </w:r>
+      <w:proofErr w:type="spellEnd"/>
+      <w:r>
+        <w:rPr>
+          <w:rFonts w:ascii="Times New Roman" w:hAnsi="Times New Roman" w:cs="Times New Roman"/>
+        </w:rPr>
+        <w:t xml:space="preserve">, </w:t>
+      </w:r>
+      <w:proofErr w:type="spellStart"/>
+      <w:r>
+        <w:rPr>
+          <w:rFonts w:ascii="Times New Roman" w:hAnsi="Times New Roman" w:cs="Times New Roman"/>
+        </w:rPr>
+        <w:t>fk_permiso</w:t>
+      </w:r>
+      <w:proofErr w:type="spellEnd"/>
+      <w:r>
+        <w:rPr>
+          <w:rFonts w:ascii="Times New Roman" w:hAnsi="Times New Roman" w:cs="Times New Roman"/>
+        </w:rPr>
+        <w:t>) y una clave primaria compuesta. Esta estructura es crítica para evitar redundancias y asegurar que un mismo permiso no sea asignado múltiples veces a un rol.</w:t>
+      </w:r>
+    </w:p>
+    <w:p>
+      <w:pPr>
+        <w:jc w:val="both"/>
+        <w:rPr>
+          <w:rFonts w:ascii="Times New Roman" w:hAnsi="Times New Roman" w:cs="Times New Roman"/>
+        </w:rPr>
+      </w:pPr>
+      <w:r>
+        <w:rPr>
+          <w:rFonts w:ascii="Times New Roman" w:hAnsi="Times New Roman" w:cs="Times New Roman"/>
+        </w:rPr>
+        <w:t xml:space="preserve">En cuanto a la entidad permisos, esta define las acciones específicas que pueden ejecutarse dentro del sistema. La clave primaria </w:t>
+      </w:r>
+      <w:proofErr w:type="spellStart"/>
+      <w:r>
+        <w:rPr>
+          <w:rFonts w:ascii="Times New Roman" w:hAnsi="Times New Roman" w:cs="Times New Roman"/>
+          <w:i/>
+          <w:iCs/>
+        </w:rPr>
+        <w:t>id_permisos</w:t>
+      </w:r>
+      <w:proofErr w:type="spellEnd"/>
+      <w:r>
+        <w:rPr>
+          <w:rFonts w:ascii="Times New Roman" w:hAnsi="Times New Roman" w:cs="Times New Roman"/>
+        </w:rPr>
+        <w:t xml:space="preserve"> y la restricción de unicidad en </w:t>
+      </w:r>
+      <w:proofErr w:type="spellStart"/>
+      <w:r>
+        <w:rPr>
+          <w:rFonts w:ascii="Times New Roman" w:hAnsi="Times New Roman" w:cs="Times New Roman"/>
+          <w:i/>
+          <w:iCs/>
+        </w:rPr>
+        <w:t>uq_accion</w:t>
+      </w:r>
+      <w:proofErr w:type="spellEnd"/>
+      <w:r>
+        <w:rPr>
+          <w:rFonts w:ascii="Times New Roman" w:hAnsi="Times New Roman" w:cs="Times New Roman"/>
+        </w:rPr>
+        <w:t xml:space="preserve"> garantizan una definición consistente de las operaciones permitidas. El atributo </w:t>
+      </w:r>
+      <w:proofErr w:type="spellStart"/>
+      <w:r>
+        <w:rPr>
+          <w:rFonts w:ascii="Times New Roman" w:hAnsi="Times New Roman" w:cs="Times New Roman"/>
+          <w:i/>
+          <w:iCs/>
+        </w:rPr>
+        <w:t>tiene_estado</w:t>
+      </w:r>
+      <w:proofErr w:type="spellEnd"/>
+      <w:r>
+        <w:rPr>
+          <w:rFonts w:ascii="Times New Roman" w:hAnsi="Times New Roman" w:cs="Times New Roman"/>
+        </w:rPr>
+        <w:t xml:space="preserve"> introduce una capa adicional de control, permitiendo activar o desactivar permisos sin necesidad de eliminarlos físicamente.</w:t>
+      </w:r>
+    </w:p>
+    <w:p>
+      <w:pPr>
+        <w:jc w:val="both"/>
+        <w:rPr>
+          <w:rFonts w:ascii="Times New Roman" w:hAnsi="Times New Roman" w:cs="Times New Roman"/>
+        </w:rPr>
+      </w:pPr>
+      <w:r>
+        <w:rPr>
+          <w:rFonts w:ascii="Times New Roman" w:hAnsi="Times New Roman" w:cs="Times New Roman"/>
+        </w:rPr>
+        <w:t xml:space="preserve">El modelo también incorpora un componente robusto de trazabilidad mediante la entidad evento, donde cada registro representa una acción </w:t>
+      </w:r>
+      <w:r>
+        <w:rPr>
+          <w:rFonts w:ascii="Times New Roman" w:hAnsi="Times New Roman" w:cs="Times New Roman"/>
+        </w:rPr>
+        <w:t xml:space="preserve">que involucra a </w:t>
+      </w:r>
+      <w:r>
+        <w:rPr>
+          <w:rFonts w:ascii="Times New Roman" w:hAnsi="Times New Roman" w:cs="Times New Roman"/>
+        </w:rPr>
+        <w:t xml:space="preserve">un usuario. La clave primaria </w:t>
+      </w:r>
+      <w:proofErr w:type="spellStart"/>
+      <w:r>
+        <w:rPr>
+          <w:rFonts w:ascii="Times New Roman" w:hAnsi="Times New Roman" w:cs="Times New Roman"/>
+          <w:i/>
+          <w:iCs/>
+        </w:rPr>
+        <w:t>id_evento</w:t>
+      </w:r>
+      <w:proofErr w:type="spellEnd"/>
+      <w:r>
+        <w:rPr>
+          <w:rFonts w:ascii="Times New Roman" w:hAnsi="Times New Roman" w:cs="Times New Roman"/>
+        </w:rPr>
+        <w:t xml:space="preserve"> identifica cada evento, mientras que las claves foráneas </w:t>
+      </w:r>
+      <w:proofErr w:type="spellStart"/>
+      <w:r>
+        <w:rPr>
+          <w:rFonts w:ascii="Times New Roman" w:hAnsi="Times New Roman" w:cs="Times New Roman"/>
+          <w:i/>
+          <w:iCs/>
+        </w:rPr>
+        <w:t>fk_usuario</w:t>
+      </w:r>
+      <w:proofErr w:type="spellEnd"/>
+      <w:r>
+        <w:rPr>
+          <w:rFonts w:ascii="Times New Roman" w:hAnsi="Times New Roman" w:cs="Times New Roman"/>
+        </w:rPr>
+        <w:t xml:space="preserve">, </w:t>
+      </w:r>
+      <w:proofErr w:type="spellStart"/>
+      <w:r>
+        <w:rPr>
+          <w:rFonts w:ascii="Times New Roman" w:hAnsi="Times New Roman" w:cs="Times New Roman"/>
+          <w:i/>
+          <w:iCs/>
+        </w:rPr>
+        <w:t>fk_tipo_evento</w:t>
+      </w:r>
+      <w:proofErr w:type="spellEnd"/>
+      <w:r>
+        <w:rPr>
+          <w:rFonts w:ascii="Times New Roman" w:hAnsi="Times New Roman" w:cs="Times New Roman"/>
+        </w:rPr>
+        <w:t xml:space="preserve"> </w:t>
+      </w:r>
+      <w:r>
+        <w:rPr>
+          <w:rFonts w:ascii="Times New Roman" w:hAnsi="Times New Roman" w:cs="Times New Roman"/>
+          <w:i/>
+          <w:iCs/>
+        </w:rPr>
+        <w:t xml:space="preserve">y </w:t>
+      </w:r>
+      <w:proofErr w:type="spellStart"/>
+      <w:r>
+        <w:rPr>
+          <w:rFonts w:ascii="Times New Roman" w:hAnsi="Times New Roman" w:cs="Times New Roman"/>
+          <w:i/>
+          <w:iCs/>
+        </w:rPr>
+        <w:t>fk_sesion</w:t>
+      </w:r>
+      <w:proofErr w:type="spellEnd"/>
+      <w:r>
+        <w:rPr>
+          <w:rFonts w:ascii="Times New Roman" w:hAnsi="Times New Roman" w:cs="Times New Roman"/>
+        </w:rPr>
+        <w:t xml:space="preserve"> permiten establecer relaciones directas con el usuario que ejecuta la acción, el tipo de evento y la sesión asociada, respectivamente. Este diseño permite reconstruir el contexto completo de cada interacción. Campos como </w:t>
+      </w:r>
+      <w:proofErr w:type="spellStart"/>
+      <w:r>
+        <w:rPr>
+          <w:rFonts w:ascii="Times New Roman" w:hAnsi="Times New Roman" w:cs="Times New Roman"/>
+          <w:i/>
+          <w:iCs/>
+        </w:rPr>
+        <w:t>enum_resultado</w:t>
+      </w:r>
+      <w:proofErr w:type="spellEnd"/>
+      <w:r>
+        <w:rPr>
+          <w:rFonts w:ascii="Times New Roman" w:hAnsi="Times New Roman" w:cs="Times New Roman"/>
+        </w:rPr>
+        <w:t xml:space="preserve"> y </w:t>
+      </w:r>
+      <w:proofErr w:type="spellStart"/>
+      <w:r>
+        <w:rPr>
+          <w:rFonts w:ascii="Times New Roman" w:hAnsi="Times New Roman" w:cs="Times New Roman"/>
+          <w:i/>
+          <w:iCs/>
+        </w:rPr>
+        <w:t>idx_json_detalle</w:t>
+      </w:r>
+      <w:proofErr w:type="spellEnd"/>
+      <w:r>
+        <w:rPr>
+          <w:rFonts w:ascii="Times New Roman" w:hAnsi="Times New Roman" w:cs="Times New Roman"/>
+        </w:rPr>
+        <w:t xml:space="preserve"> enriquecen la capacidad de auditoría al registrar el resultado de la acción y detalles adicionales en formato flexible.</w:t>
+      </w:r>
+    </w:p>
+    <w:p>
+      <w:pPr>
+        <w:jc w:val="both"/>
+        <w:rPr>
+          <w:rFonts w:ascii="Times New Roman" w:hAnsi="Times New Roman" w:cs="Times New Roman"/>
+        </w:rPr>
+      </w:pPr>
+      <w:r>
+        <w:rPr>
+          <w:rFonts w:ascii="Times New Roman" w:hAnsi="Times New Roman" w:cs="Times New Roman"/>
+        </w:rPr>
+        <w:t xml:space="preserve">La entidad </w:t>
+      </w:r>
+      <w:proofErr w:type="spellStart"/>
+      <w:r>
+        <w:rPr>
+          <w:rFonts w:ascii="Times New Roman" w:hAnsi="Times New Roman" w:cs="Times New Roman"/>
+        </w:rPr>
+        <w:t>sesion</w:t>
+      </w:r>
+      <w:proofErr w:type="spellEnd"/>
+      <w:r>
+        <w:rPr>
+          <w:rFonts w:ascii="Times New Roman" w:hAnsi="Times New Roman" w:cs="Times New Roman"/>
+        </w:rPr>
+        <w:t xml:space="preserve"> complementa este esquema al registrar el contexto de acceso del usuario, incluyendo información como la dirección IP </w:t>
+      </w:r>
+      <w:r>
+        <w:rPr>
+          <w:rFonts w:ascii="Times New Roman" w:hAnsi="Times New Roman" w:cs="Times New Roman"/>
+          <w:i/>
+          <w:iCs/>
+        </w:rPr>
+        <w:t>(</w:t>
+      </w:r>
+      <w:proofErr w:type="spellStart"/>
+      <w:r>
+        <w:rPr>
+          <w:rFonts w:ascii="Times New Roman" w:hAnsi="Times New Roman" w:cs="Times New Roman"/>
+          <w:i/>
+          <w:iCs/>
+        </w:rPr>
+        <w:t>idx_direccion_ip</w:t>
+      </w:r>
+      <w:proofErr w:type="spellEnd"/>
+      <w:r>
+        <w:rPr>
+          <w:rFonts w:ascii="Times New Roman" w:hAnsi="Times New Roman" w:cs="Times New Roman"/>
+        </w:rPr>
+        <w:t xml:space="preserve">) y el agente de usuario </w:t>
+      </w:r>
+      <w:r>
+        <w:rPr>
+          <w:rFonts w:ascii="Times New Roman" w:hAnsi="Times New Roman" w:cs="Times New Roman"/>
+          <w:i/>
+          <w:iCs/>
+        </w:rPr>
+        <w:t>(</w:t>
+      </w:r>
+      <w:proofErr w:type="spellStart"/>
+      <w:r>
+        <w:rPr>
+          <w:rFonts w:ascii="Times New Roman" w:hAnsi="Times New Roman" w:cs="Times New Roman"/>
+          <w:i/>
+          <w:iCs/>
+        </w:rPr>
+        <w:t>idx_user_agent</w:t>
+      </w:r>
+      <w:proofErr w:type="spellEnd"/>
+      <w:r>
+        <w:rPr>
+          <w:rFonts w:ascii="Times New Roman" w:hAnsi="Times New Roman" w:cs="Times New Roman"/>
+        </w:rPr>
+        <w:t xml:space="preserve">). Su clave primaria </w:t>
+      </w:r>
+      <w:proofErr w:type="spellStart"/>
+      <w:r>
+        <w:rPr>
+          <w:rFonts w:ascii="Times New Roman" w:hAnsi="Times New Roman" w:cs="Times New Roman"/>
+          <w:i/>
+          <w:iCs/>
+        </w:rPr>
+        <w:t>id_sesion</w:t>
+      </w:r>
+      <w:proofErr w:type="spellEnd"/>
+      <w:r>
+        <w:rPr>
+          <w:rFonts w:ascii="Times New Roman" w:hAnsi="Times New Roman" w:cs="Times New Roman"/>
+        </w:rPr>
+        <w:t xml:space="preserve"> y la clave foránea </w:t>
+      </w:r>
+      <w:proofErr w:type="spellStart"/>
+      <w:r>
+        <w:rPr>
+          <w:rFonts w:ascii="Times New Roman" w:hAnsi="Times New Roman" w:cs="Times New Roman"/>
+          <w:i/>
+          <w:iCs/>
+        </w:rPr>
+        <w:t>fk_cuenta</w:t>
+      </w:r>
+      <w:proofErr w:type="spellEnd"/>
+      <w:r>
+        <w:rPr>
+          <w:rFonts w:ascii="Times New Roman" w:hAnsi="Times New Roman" w:cs="Times New Roman"/>
+        </w:rPr>
+        <w:t xml:space="preserve"> permiten vincular múltiples eventos a una misma sesión, fortaleciendo la trazabilidad del sistema.</w:t>
+      </w:r>
+    </w:p>
+    <w:p>
+      <w:pPr>
+        <w:jc w:val="both"/>
+        <w:rPr>
+          <w:rFonts w:ascii="Times New Roman" w:hAnsi="Times New Roman" w:cs="Times New Roman"/>
+        </w:rPr>
+      </w:pPr>
+    </w:p>
+    <w:p>
+      <w:pPr>
+        <w:jc w:val="both"/>
+        <w:rPr>
+          <w:rFonts w:ascii="Times New Roman" w:hAnsi="Times New Roman" w:cs="Times New Roman"/>
+        </w:rPr>
+      </w:pPr>
+      <w:r>
+        <w:rPr>
+          <w:rFonts w:ascii="Times New Roman" w:hAnsi="Times New Roman" w:cs="Times New Roman"/>
+        </w:rPr>
+        <w:t xml:space="preserve">Por otro lado, la gestión administrativa se soporta mediante la tabla </w:t>
+      </w:r>
+      <w:proofErr w:type="spellStart"/>
+      <w:r>
+        <w:rPr>
+          <w:rFonts w:ascii="Times New Roman" w:hAnsi="Times New Roman" w:cs="Times New Roman"/>
+          <w:i/>
+          <w:iCs/>
+        </w:rPr>
+        <w:t>gestion_cuenta</w:t>
+      </w:r>
+      <w:proofErr w:type="spellEnd"/>
+      <w:r>
+        <w:rPr>
+          <w:rFonts w:ascii="Times New Roman" w:hAnsi="Times New Roman" w:cs="Times New Roman"/>
+        </w:rPr>
+        <w:t xml:space="preserve">, donde se registran acciones realizadas sobre cuentas de usuario. Aunque no todas sus relaciones están explícitamente definidas como claves foráneas en el esquema, campos como </w:t>
+      </w:r>
+      <w:proofErr w:type="spellStart"/>
+      <w:r>
+        <w:rPr>
+          <w:rFonts w:ascii="Times New Roman" w:hAnsi="Times New Roman" w:cs="Times New Roman"/>
+          <w:i/>
+          <w:iCs/>
+        </w:rPr>
+        <w:t>usuario_admin_responsable</w:t>
+      </w:r>
+      <w:proofErr w:type="spellEnd"/>
+      <w:r>
+        <w:rPr>
+          <w:rFonts w:ascii="Times New Roman" w:hAnsi="Times New Roman" w:cs="Times New Roman"/>
+          <w:i/>
+          <w:iCs/>
+        </w:rPr>
+        <w:t xml:space="preserve"> y </w:t>
+      </w:r>
+      <w:proofErr w:type="spellStart"/>
+      <w:r>
+        <w:rPr>
+          <w:rFonts w:ascii="Times New Roman" w:hAnsi="Times New Roman" w:cs="Times New Roman"/>
+          <w:i/>
+          <w:iCs/>
+        </w:rPr>
+        <w:t>fk_cuenta</w:t>
+      </w:r>
+      <w:proofErr w:type="spellEnd"/>
+      <w:r>
+        <w:rPr>
+          <w:rFonts w:ascii="Times New Roman" w:hAnsi="Times New Roman" w:cs="Times New Roman"/>
+        </w:rPr>
+        <w:t xml:space="preserve"> permiten identificar tanto al responsable de la acción como a la cuenta afectada, lo que resulta esencial para auditorías de seguridad.</w:t>
+      </w:r>
+    </w:p>
+    <w:p>
+      <w:pPr>
+        <w:jc w:val="both"/>
+        <w:rPr>
+          <w:rFonts w:ascii="Times New Roman" w:hAnsi="Times New Roman" w:cs="Times New Roman"/>
+        </w:rPr>
+      </w:pPr>
+      <w:r>
+        <w:rPr>
+          <w:rFonts w:ascii="Times New Roman" w:hAnsi="Times New Roman" w:cs="Times New Roman"/>
+        </w:rPr>
+        <w:t xml:space="preserve">En relación con los estados del sistema, la entidad </w:t>
+      </w:r>
+      <w:proofErr w:type="spellStart"/>
+      <w:r>
+        <w:rPr>
+          <w:rFonts w:ascii="Times New Roman" w:hAnsi="Times New Roman" w:cs="Times New Roman"/>
+        </w:rPr>
+        <w:t>estado_cuenta</w:t>
+      </w:r>
+      <w:proofErr w:type="spellEnd"/>
+      <w:r>
+        <w:rPr>
+          <w:rFonts w:ascii="Times New Roman" w:hAnsi="Times New Roman" w:cs="Times New Roman"/>
+        </w:rPr>
+        <w:t xml:space="preserve"> permite categorizar las cuentas de usuario mediante una clave primaria </w:t>
+      </w:r>
+      <w:r>
+        <w:rPr>
+          <w:rFonts w:ascii="Times New Roman" w:hAnsi="Times New Roman" w:cs="Times New Roman"/>
+          <w:i/>
+          <w:iCs/>
+        </w:rPr>
+        <w:t>(</w:t>
+      </w:r>
+      <w:proofErr w:type="spellStart"/>
+      <w:r>
+        <w:rPr>
+          <w:rFonts w:ascii="Times New Roman" w:hAnsi="Times New Roman" w:cs="Times New Roman"/>
+          <w:i/>
+          <w:iCs/>
+        </w:rPr>
+        <w:t>id_estado_cuentas</w:t>
+      </w:r>
+      <w:proofErr w:type="spellEnd"/>
+      <w:r>
+        <w:rPr>
+          <w:rFonts w:ascii="Times New Roman" w:hAnsi="Times New Roman" w:cs="Times New Roman"/>
+          <w:i/>
+          <w:iCs/>
+        </w:rPr>
+        <w:t>)</w:t>
+      </w:r>
+      <w:r>
+        <w:rPr>
+          <w:rFonts w:ascii="Times New Roman" w:hAnsi="Times New Roman" w:cs="Times New Roman"/>
+        </w:rPr>
+        <w:t xml:space="preserve"> y un nombre único </w:t>
+      </w:r>
+      <w:r>
+        <w:rPr>
+          <w:rFonts w:ascii="Times New Roman" w:hAnsi="Times New Roman" w:cs="Times New Roman"/>
+          <w:i/>
+          <w:iCs/>
+        </w:rPr>
+        <w:t>(</w:t>
+      </w:r>
+      <w:proofErr w:type="spellStart"/>
+      <w:r>
+        <w:rPr>
+          <w:rFonts w:ascii="Times New Roman" w:hAnsi="Times New Roman" w:cs="Times New Roman"/>
+          <w:i/>
+          <w:iCs/>
+        </w:rPr>
+        <w:t>uq_nombre</w:t>
+      </w:r>
+      <w:proofErr w:type="spellEnd"/>
+      <w:r>
+        <w:rPr>
+          <w:rFonts w:ascii="Times New Roman" w:hAnsi="Times New Roman" w:cs="Times New Roman"/>
+          <w:i/>
+          <w:iCs/>
+        </w:rPr>
+        <w:t>),</w:t>
+      </w:r>
+      <w:r>
+        <w:rPr>
+          <w:rFonts w:ascii="Times New Roman" w:hAnsi="Times New Roman" w:cs="Times New Roman"/>
+        </w:rPr>
+        <w:t xml:space="preserve"> facilitando la gestión de estados como activo, inactivo o bloqueado.</w:t>
+      </w:r>
+    </w:p>
+    <w:p>
+      <w:pPr>
+        <w:jc w:val="both"/>
+        <w:rPr>
+          <w:rFonts w:ascii="Times New Roman" w:hAnsi="Times New Roman" w:cs="Times New Roman"/>
+        </w:rPr>
+      </w:pPr>
+      <w:r>
+        <w:rPr>
+          <w:rFonts w:ascii="Times New Roman" w:hAnsi="Times New Roman" w:cs="Times New Roman"/>
+        </w:rPr>
+        <w:t xml:space="preserve">Finalmente, el módulo contempla un sistema de notificaciones estructurado mediante las entidades notificaciones y </w:t>
+      </w:r>
+      <w:proofErr w:type="spellStart"/>
+      <w:r>
+        <w:rPr>
+          <w:rFonts w:ascii="Times New Roman" w:hAnsi="Times New Roman" w:cs="Times New Roman"/>
+          <w:i/>
+          <w:iCs/>
+        </w:rPr>
+        <w:t>notificacion_canales</w:t>
+      </w:r>
+      <w:proofErr w:type="spellEnd"/>
+      <w:r>
+        <w:rPr>
+          <w:rFonts w:ascii="Times New Roman" w:hAnsi="Times New Roman" w:cs="Times New Roman"/>
+        </w:rPr>
+        <w:t xml:space="preserve">. La tabla notificaciones utiliza claves foráneas como </w:t>
+      </w:r>
+      <w:proofErr w:type="spellStart"/>
+      <w:r>
+        <w:rPr>
+          <w:rFonts w:ascii="Times New Roman" w:hAnsi="Times New Roman" w:cs="Times New Roman"/>
+          <w:i/>
+          <w:iCs/>
+        </w:rPr>
+        <w:t>fk_usuario</w:t>
+      </w:r>
+      <w:proofErr w:type="spellEnd"/>
+      <w:r>
+        <w:rPr>
+          <w:rFonts w:ascii="Times New Roman" w:hAnsi="Times New Roman" w:cs="Times New Roman"/>
+          <w:i/>
+          <w:iCs/>
+        </w:rPr>
+        <w:t xml:space="preserve">, </w:t>
+      </w:r>
+      <w:proofErr w:type="spellStart"/>
+      <w:r>
+        <w:rPr>
+          <w:rFonts w:ascii="Times New Roman" w:hAnsi="Times New Roman" w:cs="Times New Roman"/>
+          <w:i/>
+          <w:iCs/>
+        </w:rPr>
+        <w:t>fk_tipo_evento</w:t>
+      </w:r>
+      <w:proofErr w:type="spellEnd"/>
+      <w:r>
+        <w:rPr>
+          <w:rFonts w:ascii="Times New Roman" w:hAnsi="Times New Roman" w:cs="Times New Roman"/>
+          <w:i/>
+          <w:iCs/>
+        </w:rPr>
+        <w:t xml:space="preserve"> y </w:t>
+      </w:r>
+      <w:proofErr w:type="spellStart"/>
+      <w:r>
+        <w:rPr>
+          <w:rFonts w:ascii="Times New Roman" w:hAnsi="Times New Roman" w:cs="Times New Roman"/>
+          <w:i/>
+          <w:iCs/>
+        </w:rPr>
+        <w:t>fk_notificaciones_canal</w:t>
+      </w:r>
+      <w:proofErr w:type="spellEnd"/>
+      <w:r>
+        <w:rPr>
+          <w:rFonts w:ascii="Times New Roman" w:hAnsi="Times New Roman" w:cs="Times New Roman"/>
+        </w:rPr>
+        <w:t xml:space="preserve"> para asociar cada notificación con su destinatario, el evento que la genera y el canal de comunicación utilizado. Esto permite una gestión flexible y escalable de los mecanismos de notificación. Por su parte, </w:t>
+      </w:r>
+      <w:proofErr w:type="spellStart"/>
+      <w:r>
+        <w:rPr>
+          <w:rFonts w:ascii="Times New Roman" w:hAnsi="Times New Roman" w:cs="Times New Roman"/>
+          <w:i/>
+          <w:iCs/>
+        </w:rPr>
+        <w:t>notificacion_canales</w:t>
+      </w:r>
+      <w:proofErr w:type="spellEnd"/>
+      <w:r>
+        <w:rPr>
+          <w:rFonts w:ascii="Times New Roman" w:hAnsi="Times New Roman" w:cs="Times New Roman"/>
+        </w:rPr>
+        <w:t xml:space="preserve"> define los medios de envío, permitiendo reutilizar canales para múltiples notificaciones y registrar su estado de entrega.</w:t>
+      </w:r>
+    </w:p>
+    <w:p>
+      <w:pPr>
+        <w:jc w:val="both"/>
+        <w:rPr>
+          <w:rFonts w:ascii="Times New Roman" w:hAnsi="Times New Roman" w:cs="Times New Roman"/>
+        </w:rPr>
+      </w:pPr>
+      <w:r>
+        <w:rPr>
+          <w:rFonts w:ascii="Times New Roman" w:hAnsi="Times New Roman" w:cs="Times New Roman"/>
+        </w:rPr>
+        <w:t>En conjunto, los campos críticos (claves primarias y foráneas) garantizan la integridad referencial del sistema, mientras que las restricciones de unicidad y los atributos adicionales permiten mantener la consistencia, seguridad y trazabilidad de la información. Este diseño responde a las necesidades de un sistema robusto, escalable y alineado con buenas prácticas de ingeniería de datos.</w:t>
+      </w:r>
+    </w:p>
     <w:p>
       <w:pPr>
         <w:pStyle w:val="Ttulo1"/>
       </w:pPr>
-      <w:bookmarkStart w:id="2" w:name="_Toc226805712"/>
+      <w:bookmarkStart w:id="3" w:name="_Toc226814937"/>
       <w:r>
         <w:t>Lógica de Negocio en Base de Datos</w:t>
       </w:r>
-      <w:bookmarkEnd w:id="2"/>
+      <w:bookmarkEnd w:id="3"/>
     </w:p>
     <w:p>
       <w:pPr>
@@ -1506,11 +2850,11 @@
           <w:numId w:val="1"/>
         </w:numPr>
       </w:pPr>
-      <w:bookmarkStart w:id="3" w:name="_Toc226805713"/>
+      <w:bookmarkStart w:id="4" w:name="_Toc226814938"/>
       <w:r>
         <w:t>Procedimientos</w:t>
       </w:r>
-      <w:bookmarkEnd w:id="3"/>
+      <w:bookmarkEnd w:id="4"/>
       <w:r>
         <w:t xml:space="preserve"> </w:t>
       </w:r>
@@ -1523,11 +2867,11 @@
           <w:numId w:val="1"/>
         </w:numPr>
       </w:pPr>
-      <w:bookmarkStart w:id="4" w:name="_Toc226805714"/>
+      <w:bookmarkStart w:id="5" w:name="_Toc226814939"/>
       <w:r>
         <w:t>Funciones</w:t>
       </w:r>
-      <w:bookmarkEnd w:id="4"/>
+      <w:bookmarkEnd w:id="5"/>
     </w:p>
     <w:p>
       <w:pPr>
@@ -1537,12 +2881,12 @@
           <w:numId w:val="1"/>
         </w:numPr>
       </w:pPr>
-      <w:bookmarkStart w:id="5" w:name="_Toc226805715"/>
+      <w:bookmarkStart w:id="6" w:name="_Toc226814940"/>
       <w:proofErr w:type="spellStart"/>
       <w:r>
         <w:t>Triggers</w:t>
       </w:r>
-      <w:bookmarkEnd w:id="5"/>
+      <w:bookmarkEnd w:id="6"/>
       <w:proofErr w:type="spellEnd"/>
     </w:p>
     <w:p/>
@@ -1550,25 +2894,25 @@
       <w:pPr>
         <w:pStyle w:val="Ttulo1"/>
       </w:pPr>
-      <w:bookmarkStart w:id="6" w:name="_Toc226805716"/>
+      <w:bookmarkStart w:id="7" w:name="_Toc226814941"/>
       <w:r>
         <w:t>Flujo de Datos</w:t>
       </w:r>
-      <w:bookmarkEnd w:id="6"/>
+      <w:bookmarkEnd w:id="7"/>
     </w:p>
     <w:p/>
     <w:p>
       <w:pPr>
         <w:pStyle w:val="Ttulo1"/>
       </w:pPr>
-      <w:bookmarkStart w:id="7" w:name="_Toc226805717"/>
+      <w:bookmarkStart w:id="8" w:name="_Toc226814942"/>
       <w:r>
         <w:t>Consideraciones Técnicas</w:t>
       </w:r>
-      <w:bookmarkEnd w:id="7"/>
+      <w:bookmarkEnd w:id="8"/>
     </w:p>
     <w:sectPr>
-      <w:footerReference w:type="default" r:id="rId7"/>
+      <w:footerReference w:type="default" r:id="rId8"/>
       <w:pgSz w:w="12240" w:h="15840"/>
       <w:pgMar w:top="1417" w:right="1701" w:bottom="1417" w:left="1701" w:header="708" w:footer="708" w:gutter="0"/>
       <w:cols w:space="708"/>

</xml_diff>

<commit_message>
Ultimas modificaciones de documenatacion
</commit_message>
<xml_diff>
--- a/Modulo1/Informe.docx
+++ b/Modulo1/Informe.docx
@@ -287,7 +287,14 @@
     <w:sdt>
       <w:sdtPr>
         <w:rPr>
-          <w:lang w:val="es-ES"/>
+          <w:rFonts w:asciiTheme="minorHAnsi" w:eastAsiaTheme="minorHAnsi" w:hAnsiTheme="minorHAnsi" w:cstheme="minorBidi"/>
+          <w:b w:val="0"/>
+          <w:color w:val="auto"/>
+          <w:kern w:val="2"/>
+          <w:sz w:val="24"/>
+          <w:szCs w:val="24"/>
+          <w:lang w:val="es-ES" w:eastAsia="en-US"/>
+          <w14:ligatures w14:val="standardContextual"/>
         </w:rPr>
         <w:id w:val="-195083543"/>
         <w:docPartObj>
@@ -297,14 +304,7 @@
       </w:sdtPr>
       <w:sdtEndPr>
         <w:rPr>
-          <w:rFonts w:asciiTheme="minorHAnsi" w:eastAsiaTheme="minorHAnsi" w:hAnsiTheme="minorHAnsi" w:cstheme="minorBidi"/>
           <w:bCs/>
-          <w:color w:val="auto"/>
-          <w:kern w:val="2"/>
-          <w:sz w:val="24"/>
-          <w:szCs w:val="24"/>
-          <w:lang w:eastAsia="en-US"/>
-          <w14:ligatures w14:val="standardContextual"/>
         </w:rPr>
       </w:sdtEndPr>
       <w:sdtContent>
@@ -354,7 +354,7 @@
             </w:rPr>
             <w:fldChar w:fldCharType="separate"/>
           </w:r>
-          <w:hyperlink w:anchor="_Toc226814934" w:history="1">
+          <w:hyperlink w:anchor="_Toc226841846" w:history="1">
             <w:r>
               <w:rPr>
                 <w:rStyle w:val="Hipervnculo"/>
@@ -385,7 +385,7 @@
                 <w:noProof/>
                 <w:webHidden/>
               </w:rPr>
-              <w:instrText xml:space="preserve"> PAGEREF _Toc226814934 \h </w:instrText>
+              <w:instrText xml:space="preserve"> PAGEREF _Toc226841846 \h </w:instrText>
             </w:r>
             <w:r>
               <w:rPr>
@@ -432,7 +432,7 @@
               <w:lang w:eastAsia="es-CO"/>
             </w:rPr>
           </w:pPr>
-          <w:hyperlink w:anchor="_Toc226814935" w:history="1">
+          <w:hyperlink w:anchor="_Toc226841847" w:history="1">
             <w:r>
               <w:rPr>
                 <w:rStyle w:val="Hipervnculo"/>
@@ -463,7 +463,7 @@
                 <w:noProof/>
                 <w:webHidden/>
               </w:rPr>
-              <w:instrText xml:space="preserve"> PAGEREF _Toc226814935 \h </w:instrText>
+              <w:instrText xml:space="preserve"> PAGEREF _Toc226841847 \h </w:instrText>
             </w:r>
             <w:r>
               <w:rPr>
@@ -510,7 +510,7 @@
               <w:lang w:eastAsia="es-CO"/>
             </w:rPr>
           </w:pPr>
-          <w:hyperlink w:anchor="_Toc226814936" w:history="1">
+          <w:hyperlink w:anchor="_Toc226841848" w:history="1">
             <w:r>
               <w:rPr>
                 <w:rStyle w:val="Hipervnculo"/>
@@ -541,7 +541,7 @@
                 <w:noProof/>
                 <w:webHidden/>
               </w:rPr>
-              <w:instrText xml:space="preserve"> PAGEREF _Toc226814936 \h </w:instrText>
+              <w:instrText xml:space="preserve"> PAGEREF _Toc226841848 \h </w:instrText>
             </w:r>
             <w:r>
               <w:rPr>
@@ -588,7 +588,7 @@
               <w:lang w:eastAsia="es-CO"/>
             </w:rPr>
           </w:pPr>
-          <w:hyperlink w:anchor="_Toc226814937" w:history="1">
+          <w:hyperlink w:anchor="_Toc226841849" w:history="1">
             <w:r>
               <w:rPr>
                 <w:rStyle w:val="Hipervnculo"/>
@@ -619,7 +619,7 @@
                 <w:noProof/>
                 <w:webHidden/>
               </w:rPr>
-              <w:instrText xml:space="preserve"> PAGEREF _Toc226814937 \h </w:instrText>
+              <w:instrText xml:space="preserve"> PAGEREF _Toc226841849 \h </w:instrText>
             </w:r>
             <w:r>
               <w:rPr>
@@ -642,7 +642,7 @@
                 <w:noProof/>
                 <w:webHidden/>
               </w:rPr>
-              <w:t>6</w:t>
+              <w:t>7</w:t>
             </w:r>
             <w:r>
               <w:rPr>
@@ -667,7 +667,7 @@
               <w:lang w:eastAsia="es-CO"/>
             </w:rPr>
           </w:pPr>
-          <w:hyperlink w:anchor="_Toc226814938" w:history="1">
+          <w:hyperlink w:anchor="_Toc226841850" w:history="1">
             <w:r>
               <w:rPr>
                 <w:rStyle w:val="Hipervnculo"/>
@@ -714,7 +714,7 @@
                 <w:noProof/>
                 <w:webHidden/>
               </w:rPr>
-              <w:instrText xml:space="preserve"> PAGEREF _Toc226814938 \h </w:instrText>
+              <w:instrText xml:space="preserve"> PAGEREF _Toc226841850 \h </w:instrText>
             </w:r>
             <w:r>
               <w:rPr>
@@ -737,7 +737,7 @@
                 <w:noProof/>
                 <w:webHidden/>
               </w:rPr>
-              <w:t>6</w:t>
+              <w:t>7</w:t>
             </w:r>
             <w:r>
               <w:rPr>
@@ -762,7 +762,7 @@
               <w:lang w:eastAsia="es-CO"/>
             </w:rPr>
           </w:pPr>
-          <w:hyperlink w:anchor="_Toc226814939" w:history="1">
+          <w:hyperlink w:anchor="_Toc226841851" w:history="1">
             <w:r>
               <w:rPr>
                 <w:rStyle w:val="Hipervnculo"/>
@@ -809,7 +809,7 @@
                 <w:noProof/>
                 <w:webHidden/>
               </w:rPr>
-              <w:instrText xml:space="preserve"> PAGEREF _Toc226814939 \h </w:instrText>
+              <w:instrText xml:space="preserve"> PAGEREF _Toc226841851 \h </w:instrText>
             </w:r>
             <w:r>
               <w:rPr>
@@ -832,7 +832,7 @@
                 <w:noProof/>
                 <w:webHidden/>
               </w:rPr>
-              <w:t>6</w:t>
+              <w:t>8</w:t>
             </w:r>
             <w:r>
               <w:rPr>
@@ -857,7 +857,7 @@
               <w:lang w:eastAsia="es-CO"/>
             </w:rPr>
           </w:pPr>
-          <w:hyperlink w:anchor="_Toc226814940" w:history="1">
+          <w:hyperlink w:anchor="_Toc226841852" w:history="1">
             <w:r>
               <w:rPr>
                 <w:rStyle w:val="Hipervnculo"/>
@@ -904,7 +904,7 @@
                 <w:noProof/>
                 <w:webHidden/>
               </w:rPr>
-              <w:instrText xml:space="preserve"> PAGEREF _Toc226814940 \h </w:instrText>
+              <w:instrText xml:space="preserve"> PAGEREF _Toc226841852 \h </w:instrText>
             </w:r>
             <w:r>
               <w:rPr>
@@ -927,7 +927,7 @@
                 <w:noProof/>
                 <w:webHidden/>
               </w:rPr>
-              <w:t>6</w:t>
+              <w:t>9</w:t>
             </w:r>
             <w:r>
               <w:rPr>
@@ -951,14 +951,14 @@
               <w:lang w:eastAsia="es-CO"/>
             </w:rPr>
           </w:pPr>
-          <w:hyperlink w:anchor="_Toc226814941" w:history="1">
+          <w:hyperlink w:anchor="_Toc226841853" w:history="1">
             <w:r>
               <w:rPr>
                 <w:rStyle w:val="Hipervnculo"/>
                 <w:rFonts w:ascii="Times New Roman" w:hAnsi="Times New Roman" w:cs="Times New Roman"/>
                 <w:noProof/>
               </w:rPr>
-              <w:t>Flujo de Datos</w:t>
+              <w:t>Consideraciones Técnicas</w:t>
             </w:r>
             <w:r>
               <w:rPr>
@@ -982,7 +982,7 @@
                 <w:noProof/>
                 <w:webHidden/>
               </w:rPr>
-              <w:instrText xml:space="preserve"> PAGEREF _Toc226814941 \h </w:instrText>
+              <w:instrText xml:space="preserve"> PAGEREF _Toc226841853 \h </w:instrText>
             </w:r>
             <w:r>
               <w:rPr>
@@ -1005,85 +1005,7 @@
                 <w:noProof/>
                 <w:webHidden/>
               </w:rPr>
-              <w:t>6</w:t>
-            </w:r>
-            <w:r>
-              <w:rPr>
-                <w:rFonts w:ascii="Times New Roman" w:hAnsi="Times New Roman" w:cs="Times New Roman"/>
-                <w:noProof/>
-                <w:webHidden/>
-              </w:rPr>
-              <w:fldChar w:fldCharType="end"/>
-            </w:r>
-          </w:hyperlink>
-        </w:p>
-        <w:p>
-          <w:pPr>
-            <w:pStyle w:val="TDC1"/>
-            <w:tabs>
-              <w:tab w:val="right" w:leader="dot" w:pos="8828"/>
-            </w:tabs>
-            <w:rPr>
-              <w:rFonts w:ascii="Times New Roman" w:eastAsiaTheme="minorEastAsia" w:hAnsi="Times New Roman" w:cs="Times New Roman"/>
-              <w:noProof/>
-              <w:lang w:eastAsia="es-CO"/>
-            </w:rPr>
-          </w:pPr>
-          <w:hyperlink w:anchor="_Toc226814942" w:history="1">
-            <w:r>
-              <w:rPr>
-                <w:rStyle w:val="Hipervnculo"/>
-                <w:rFonts w:ascii="Times New Roman" w:hAnsi="Times New Roman" w:cs="Times New Roman"/>
-                <w:noProof/>
-              </w:rPr>
-              <w:t>Consideraciones Técnicas</w:t>
-            </w:r>
-            <w:r>
-              <w:rPr>
-                <w:rFonts w:ascii="Times New Roman" w:hAnsi="Times New Roman" w:cs="Times New Roman"/>
-                <w:noProof/>
-                <w:webHidden/>
-              </w:rPr>
-              <w:tab/>
-            </w:r>
-            <w:r>
-              <w:rPr>
-                <w:rFonts w:ascii="Times New Roman" w:hAnsi="Times New Roman" w:cs="Times New Roman"/>
-                <w:noProof/>
-                <w:webHidden/>
-              </w:rPr>
-              <w:fldChar w:fldCharType="begin"/>
-            </w:r>
-            <w:r>
-              <w:rPr>
-                <w:rFonts w:ascii="Times New Roman" w:hAnsi="Times New Roman" w:cs="Times New Roman"/>
-                <w:noProof/>
-                <w:webHidden/>
-              </w:rPr>
-              <w:instrText xml:space="preserve"> PAGEREF _Toc226814942 \h </w:instrText>
-            </w:r>
-            <w:r>
-              <w:rPr>
-                <w:rFonts w:ascii="Times New Roman" w:hAnsi="Times New Roman" w:cs="Times New Roman"/>
-                <w:noProof/>
-                <w:webHidden/>
-              </w:rPr>
-            </w:r>
-            <w:r>
-              <w:rPr>
-                <w:rFonts w:ascii="Times New Roman" w:hAnsi="Times New Roman" w:cs="Times New Roman"/>
-                <w:noProof/>
-                <w:webHidden/>
-              </w:rPr>
-              <w:fldChar w:fldCharType="separate"/>
-            </w:r>
-            <w:r>
-              <w:rPr>
-                <w:rFonts w:ascii="Times New Roman" w:hAnsi="Times New Roman" w:cs="Times New Roman"/>
-                <w:noProof/>
-                <w:webHidden/>
-              </w:rPr>
-              <w:t>6</w:t>
+              <w:t>9</w:t>
             </w:r>
             <w:r>
               <w:rPr>
@@ -1126,7 +1048,7 @@
       <w:pPr>
         <w:pStyle w:val="Ttulo1"/>
       </w:pPr>
-      <w:bookmarkStart w:id="0" w:name="_Toc226814934"/>
+      <w:bookmarkStart w:id="0" w:name="_Toc226841846"/>
       <w:r>
         <w:lastRenderedPageBreak/>
         <w:t>Alcance</w:t>
@@ -1445,7 +1367,7 @@
       <w:pPr>
         <w:pStyle w:val="Ttulo1"/>
       </w:pPr>
-      <w:bookmarkStart w:id="1" w:name="_Toc226814935"/>
+      <w:bookmarkStart w:id="1" w:name="_Toc226841847"/>
       <w:r>
         <w:t>Modelo Relacional</w:t>
       </w:r>
@@ -2053,7 +1975,7 @@
       <w:pPr>
         <w:pStyle w:val="Ttulo1"/>
       </w:pPr>
-      <w:bookmarkStart w:id="2" w:name="_Toc226814936"/>
+      <w:bookmarkStart w:id="2" w:name="_Toc226841848"/>
       <w:r>
         <w:lastRenderedPageBreak/>
         <w:t>Diccionario de Datos</w:t>
@@ -2413,7 +2335,19 @@
         <w:rPr>
           <w:rFonts w:ascii="Times New Roman" w:hAnsi="Times New Roman" w:cs="Times New Roman"/>
         </w:rPr>
-        <w:t xml:space="preserve"> permiten establecer relaciones directas con el usuario que ejecuta la acción, el tipo de evento y la sesión asociada, respectivamente. Este diseño permite reconstruir el contexto completo de cada interacción. Campos como </w:t>
+        <w:t xml:space="preserve"> permiten establecer relaciones directas con el usuario que ejecuta la acción, el tipo de evento y la sesión asociada, respectivamente. Este diseño permite reconstruir el contexto completo de </w:t>
+      </w:r>
+      <w:r>
+        <w:rPr>
+          <w:rFonts w:ascii="Times New Roman" w:hAnsi="Times New Roman" w:cs="Times New Roman"/>
+        </w:rPr>
+        <w:t xml:space="preserve">cada </w:t>
+      </w:r>
+      <w:r>
+        <w:rPr>
+          <w:rFonts w:ascii="Times New Roman" w:hAnsi="Times New Roman" w:cs="Times New Roman"/>
+        </w:rPr>
+        <w:t xml:space="preserve">interacción. Campos como </w:t>
       </w:r>
       <w:proofErr w:type="spellStart"/>
       <w:r>
@@ -2836,7 +2770,7 @@
       <w:pPr>
         <w:pStyle w:val="Ttulo1"/>
       </w:pPr>
-      <w:bookmarkStart w:id="3" w:name="_Toc226814937"/>
+      <w:bookmarkStart w:id="3" w:name="_Toc226841849"/>
       <w:r>
         <w:t>Lógica de Negocio en Base de Datos</w:t>
       </w:r>
@@ -2850,7 +2784,7 @@
           <w:numId w:val="1"/>
         </w:numPr>
       </w:pPr>
-      <w:bookmarkStart w:id="4" w:name="_Toc226814938"/>
+      <w:bookmarkStart w:id="4" w:name="_Toc226841850"/>
       <w:r>
         <w:t>Procedimientos</w:t>
       </w:r>
@@ -2859,6 +2793,1068 @@
         <w:t xml:space="preserve"> </w:t>
       </w:r>
     </w:p>
+    <w:tbl>
+      <w:tblPr>
+        <w:tblStyle w:val="Tablaconcuadrcula"/>
+        <w:tblW w:w="9214" w:type="dxa"/>
+        <w:tblInd w:w="-147" w:type="dxa"/>
+        <w:tblLayout w:type="fixed"/>
+        <w:tblLook w:val="04A0" w:firstRow="1" w:lastRow="0" w:firstColumn="1" w:lastColumn="0" w:noHBand="0" w:noVBand="1"/>
+      </w:tblPr>
+      <w:tblGrid>
+        <w:gridCol w:w="2127"/>
+        <w:gridCol w:w="2854"/>
+        <w:gridCol w:w="2001"/>
+        <w:gridCol w:w="2232"/>
+      </w:tblGrid>
+      <w:tr>
+        <w:tc>
+          <w:tcPr>
+            <w:tcW w:w="2127" w:type="dxa"/>
+            <w:vAlign w:val="center"/>
+            <w:hideMark/>
+          </w:tcPr>
+          <w:p>
+            <w:pPr>
+              <w:spacing w:after="160" w:line="278" w:lineRule="auto"/>
+              <w:jc w:val="center"/>
+              <w:rPr>
+                <w:rFonts w:ascii="Times New Roman" w:hAnsi="Times New Roman" w:cs="Times New Roman"/>
+                <w:b/>
+                <w:bCs/>
+                <w:i/>
+                <w:iCs/>
+                <w:sz w:val="22"/>
+                <w:szCs w:val="22"/>
+              </w:rPr>
+            </w:pPr>
+            <w:r>
+              <w:rPr>
+                <w:rFonts w:ascii="Times New Roman" w:hAnsi="Times New Roman" w:cs="Times New Roman"/>
+                <w:b/>
+                <w:bCs/>
+                <w:i/>
+                <w:iCs/>
+                <w:sz w:val="22"/>
+                <w:szCs w:val="22"/>
+              </w:rPr>
+              <w:t>Nombre</w:t>
+            </w:r>
+          </w:p>
+        </w:tc>
+        <w:tc>
+          <w:tcPr>
+            <w:tcW w:w="2854" w:type="dxa"/>
+            <w:vAlign w:val="center"/>
+            <w:hideMark/>
+          </w:tcPr>
+          <w:p>
+            <w:pPr>
+              <w:spacing w:after="160" w:line="278" w:lineRule="auto"/>
+              <w:jc w:val="center"/>
+              <w:rPr>
+                <w:rFonts w:ascii="Times New Roman" w:hAnsi="Times New Roman" w:cs="Times New Roman"/>
+                <w:b/>
+                <w:bCs/>
+                <w:i/>
+                <w:iCs/>
+                <w:sz w:val="22"/>
+                <w:szCs w:val="22"/>
+              </w:rPr>
+            </w:pPr>
+            <w:r>
+              <w:rPr>
+                <w:rFonts w:ascii="Times New Roman" w:hAnsi="Times New Roman" w:cs="Times New Roman"/>
+                <w:b/>
+                <w:bCs/>
+                <w:i/>
+                <w:iCs/>
+                <w:sz w:val="22"/>
+                <w:szCs w:val="22"/>
+              </w:rPr>
+              <w:t>Descripción</w:t>
+            </w:r>
+          </w:p>
+        </w:tc>
+        <w:tc>
+          <w:tcPr>
+            <w:tcW w:w="2001" w:type="dxa"/>
+            <w:vAlign w:val="center"/>
+            <w:hideMark/>
+          </w:tcPr>
+          <w:p>
+            <w:pPr>
+              <w:spacing w:after="160" w:line="278" w:lineRule="auto"/>
+              <w:jc w:val="center"/>
+              <w:rPr>
+                <w:rFonts w:ascii="Times New Roman" w:hAnsi="Times New Roman" w:cs="Times New Roman"/>
+                <w:b/>
+                <w:bCs/>
+                <w:i/>
+                <w:iCs/>
+                <w:sz w:val="22"/>
+                <w:szCs w:val="22"/>
+              </w:rPr>
+            </w:pPr>
+            <w:r>
+              <w:rPr>
+                <w:rFonts w:ascii="Times New Roman" w:hAnsi="Times New Roman" w:cs="Times New Roman"/>
+                <w:b/>
+                <w:bCs/>
+                <w:i/>
+                <w:iCs/>
+                <w:sz w:val="22"/>
+                <w:szCs w:val="22"/>
+              </w:rPr>
+              <w:t>Uso</w:t>
+            </w:r>
+          </w:p>
+        </w:tc>
+        <w:tc>
+          <w:tcPr>
+            <w:tcW w:w="2232" w:type="dxa"/>
+            <w:vAlign w:val="center"/>
+            <w:hideMark/>
+          </w:tcPr>
+          <w:p>
+            <w:pPr>
+              <w:spacing w:after="160" w:line="278" w:lineRule="auto"/>
+              <w:jc w:val="center"/>
+              <w:rPr>
+                <w:rFonts w:ascii="Times New Roman" w:hAnsi="Times New Roman" w:cs="Times New Roman"/>
+                <w:b/>
+                <w:bCs/>
+                <w:i/>
+                <w:iCs/>
+                <w:sz w:val="22"/>
+                <w:szCs w:val="22"/>
+              </w:rPr>
+            </w:pPr>
+            <w:r>
+              <w:rPr>
+                <w:rFonts w:ascii="Times New Roman" w:hAnsi="Times New Roman" w:cs="Times New Roman"/>
+                <w:b/>
+                <w:bCs/>
+                <w:i/>
+                <w:iCs/>
+                <w:sz w:val="22"/>
+                <w:szCs w:val="22"/>
+              </w:rPr>
+              <w:t>Impacto</w:t>
+            </w:r>
+          </w:p>
+        </w:tc>
+      </w:tr>
+      <w:tr>
+        <w:tc>
+          <w:tcPr>
+            <w:tcW w:w="2127" w:type="dxa"/>
+            <w:vAlign w:val="center"/>
+            <w:hideMark/>
+          </w:tcPr>
+          <w:p>
+            <w:pPr>
+              <w:spacing w:after="160" w:line="278" w:lineRule="auto"/>
+              <w:jc w:val="both"/>
+              <w:rPr>
+                <w:rFonts w:ascii="Times New Roman" w:hAnsi="Times New Roman" w:cs="Times New Roman"/>
+                <w:sz w:val="22"/>
+                <w:szCs w:val="22"/>
+              </w:rPr>
+            </w:pPr>
+            <w:proofErr w:type="spellStart"/>
+            <w:r>
+              <w:rPr>
+                <w:rFonts w:ascii="Times New Roman" w:hAnsi="Times New Roman" w:cs="Times New Roman"/>
+                <w:sz w:val="22"/>
+                <w:szCs w:val="22"/>
+              </w:rPr>
+              <w:t>sp_</w:t>
+            </w:r>
+            <w:r>
+              <w:rPr>
+                <w:rFonts w:ascii="Times New Roman" w:hAnsi="Times New Roman" w:cs="Times New Roman"/>
+                <w:sz w:val="22"/>
+                <w:szCs w:val="22"/>
+              </w:rPr>
+              <w:t>registrar_usuario</w:t>
+            </w:r>
+            <w:proofErr w:type="spellEnd"/>
+          </w:p>
+        </w:tc>
+        <w:tc>
+          <w:tcPr>
+            <w:tcW w:w="2854" w:type="dxa"/>
+            <w:vAlign w:val="center"/>
+            <w:hideMark/>
+          </w:tcPr>
+          <w:p>
+            <w:pPr>
+              <w:spacing w:after="160" w:line="278" w:lineRule="auto"/>
+              <w:jc w:val="both"/>
+              <w:rPr>
+                <w:rFonts w:ascii="Times New Roman" w:hAnsi="Times New Roman" w:cs="Times New Roman"/>
+                <w:sz w:val="22"/>
+                <w:szCs w:val="22"/>
+              </w:rPr>
+            </w:pPr>
+            <w:r>
+              <w:rPr>
+                <w:rFonts w:ascii="Times New Roman" w:hAnsi="Times New Roman" w:cs="Times New Roman"/>
+                <w:sz w:val="22"/>
+                <w:szCs w:val="22"/>
+              </w:rPr>
+              <w:t>Procedimiento almacenado que gestiona el registro de usuarios validando unicidad de correo e identificación, asignando automáticamente un rol por defecto y garantizando integridad de datos.</w:t>
+            </w:r>
+          </w:p>
+        </w:tc>
+        <w:tc>
+          <w:tcPr>
+            <w:tcW w:w="2001" w:type="dxa"/>
+            <w:vAlign w:val="center"/>
+            <w:hideMark/>
+          </w:tcPr>
+          <w:p>
+            <w:pPr>
+              <w:spacing w:after="160" w:line="278" w:lineRule="auto"/>
+              <w:jc w:val="both"/>
+              <w:rPr>
+                <w:rFonts w:ascii="Times New Roman" w:hAnsi="Times New Roman" w:cs="Times New Roman"/>
+                <w:sz w:val="22"/>
+                <w:szCs w:val="22"/>
+              </w:rPr>
+            </w:pPr>
+            <w:r>
+              <w:rPr>
+                <w:rFonts w:ascii="Times New Roman" w:hAnsi="Times New Roman" w:cs="Times New Roman"/>
+                <w:sz w:val="22"/>
+                <w:szCs w:val="22"/>
+              </w:rPr>
+              <w:t xml:space="preserve">Se invoca desde el </w:t>
+            </w:r>
+            <w:proofErr w:type="spellStart"/>
+            <w:r>
+              <w:rPr>
+                <w:rFonts w:ascii="Times New Roman" w:hAnsi="Times New Roman" w:cs="Times New Roman"/>
+                <w:sz w:val="22"/>
+                <w:szCs w:val="22"/>
+              </w:rPr>
+              <w:t>backend</w:t>
+            </w:r>
+            <w:proofErr w:type="spellEnd"/>
+            <w:r>
+              <w:rPr>
+                <w:rFonts w:ascii="Times New Roman" w:hAnsi="Times New Roman" w:cs="Times New Roman"/>
+                <w:sz w:val="22"/>
+                <w:szCs w:val="22"/>
+              </w:rPr>
+              <w:t xml:space="preserve"> </w:t>
+            </w:r>
+            <w:r>
+              <w:rPr>
+                <w:rFonts w:ascii="Times New Roman" w:hAnsi="Times New Roman" w:cs="Times New Roman"/>
+                <w:sz w:val="22"/>
+                <w:szCs w:val="22"/>
+              </w:rPr>
+              <w:t>al momento de registrar un nuevo usuario en el sistema. Centraliza las validaciones críticas y la inserción en la base de datos.</w:t>
+            </w:r>
+          </w:p>
+        </w:tc>
+        <w:tc>
+          <w:tcPr>
+            <w:tcW w:w="2232" w:type="dxa"/>
+            <w:vAlign w:val="center"/>
+            <w:hideMark/>
+          </w:tcPr>
+          <w:p>
+            <w:pPr>
+              <w:spacing w:after="160" w:line="278" w:lineRule="auto"/>
+              <w:jc w:val="both"/>
+              <w:rPr>
+                <w:rFonts w:ascii="Times New Roman" w:hAnsi="Times New Roman" w:cs="Times New Roman"/>
+                <w:sz w:val="22"/>
+                <w:szCs w:val="22"/>
+              </w:rPr>
+            </w:pPr>
+            <w:r>
+              <w:rPr>
+                <w:rFonts w:ascii="Times New Roman" w:hAnsi="Times New Roman" w:cs="Times New Roman"/>
+                <w:sz w:val="22"/>
+                <w:szCs w:val="22"/>
+              </w:rPr>
+              <w:t>Mejora la integridad de datos, evita duplicidades, reduce errores, centraliza lógica crítica y optimiza el acceso a la base de datos al ejecutar todo en una sola transacción.</w:t>
+            </w:r>
+          </w:p>
+        </w:tc>
+      </w:tr>
+      <w:tr>
+        <w:tc>
+          <w:tcPr>
+            <w:tcW w:w="2127" w:type="dxa"/>
+            <w:vAlign w:val="center"/>
+          </w:tcPr>
+          <w:p>
+            <w:pPr>
+              <w:jc w:val="both"/>
+              <w:rPr>
+                <w:rFonts w:ascii="Times New Roman" w:hAnsi="Times New Roman" w:cs="Times New Roman"/>
+                <w:sz w:val="22"/>
+                <w:szCs w:val="22"/>
+              </w:rPr>
+            </w:pPr>
+            <w:proofErr w:type="spellStart"/>
+            <w:r>
+              <w:rPr>
+                <w:rFonts w:ascii="Times New Roman" w:hAnsi="Times New Roman" w:cs="Times New Roman"/>
+                <w:sz w:val="22"/>
+                <w:szCs w:val="22"/>
+              </w:rPr>
+              <w:t>sp_</w:t>
+            </w:r>
+            <w:r>
+              <w:rPr>
+                <w:rFonts w:ascii="Times New Roman" w:hAnsi="Times New Roman" w:cs="Times New Roman"/>
+                <w:sz w:val="22"/>
+                <w:szCs w:val="22"/>
+              </w:rPr>
+              <w:t>crear_rol_permisos</w:t>
+            </w:r>
+            <w:proofErr w:type="spellEnd"/>
+          </w:p>
+        </w:tc>
+        <w:tc>
+          <w:tcPr>
+            <w:tcW w:w="2854" w:type="dxa"/>
+            <w:vAlign w:val="center"/>
+          </w:tcPr>
+          <w:p>
+            <w:pPr>
+              <w:jc w:val="both"/>
+              <w:rPr>
+                <w:rFonts w:ascii="Times New Roman" w:hAnsi="Times New Roman" w:cs="Times New Roman"/>
+                <w:sz w:val="22"/>
+                <w:szCs w:val="22"/>
+              </w:rPr>
+            </w:pPr>
+            <w:r>
+              <w:rPr>
+                <w:rFonts w:ascii="Times New Roman" w:hAnsi="Times New Roman" w:cs="Times New Roman"/>
+                <w:sz w:val="22"/>
+                <w:szCs w:val="22"/>
+              </w:rPr>
+              <w:t xml:space="preserve">Procedimiento que crea un rol y asegura que tenga al menos </w:t>
+            </w:r>
+            <w:r>
+              <w:rPr>
+                <w:rFonts w:ascii="Times New Roman" w:hAnsi="Times New Roman" w:cs="Times New Roman"/>
+                <w:sz w:val="22"/>
+                <w:szCs w:val="22"/>
+              </w:rPr>
+              <w:lastRenderedPageBreak/>
+              <w:t>un permiso asociado, gestionando la relación muchos a muchos de forma controlada.</w:t>
+            </w:r>
+          </w:p>
+        </w:tc>
+        <w:tc>
+          <w:tcPr>
+            <w:tcW w:w="2001" w:type="dxa"/>
+            <w:vAlign w:val="center"/>
+          </w:tcPr>
+          <w:p>
+            <w:pPr>
+              <w:jc w:val="both"/>
+              <w:rPr>
+                <w:rFonts w:ascii="Times New Roman" w:hAnsi="Times New Roman" w:cs="Times New Roman"/>
+                <w:sz w:val="22"/>
+                <w:szCs w:val="22"/>
+              </w:rPr>
+            </w:pPr>
+            <w:r>
+              <w:rPr>
+                <w:rFonts w:ascii="Times New Roman" w:hAnsi="Times New Roman" w:cs="Times New Roman"/>
+                <w:sz w:val="22"/>
+                <w:szCs w:val="22"/>
+              </w:rPr>
+              <w:lastRenderedPageBreak/>
+              <w:t xml:space="preserve">Se usa desde el </w:t>
+            </w:r>
+            <w:proofErr w:type="spellStart"/>
+            <w:r>
+              <w:rPr>
+                <w:rFonts w:ascii="Times New Roman" w:hAnsi="Times New Roman" w:cs="Times New Roman"/>
+                <w:sz w:val="22"/>
+                <w:szCs w:val="22"/>
+              </w:rPr>
+              <w:t>backend</w:t>
+            </w:r>
+            <w:proofErr w:type="spellEnd"/>
+            <w:r>
+              <w:rPr>
+                <w:rFonts w:ascii="Times New Roman" w:hAnsi="Times New Roman" w:cs="Times New Roman"/>
+                <w:sz w:val="22"/>
+                <w:szCs w:val="22"/>
+              </w:rPr>
+              <w:t xml:space="preserve"> al crear </w:t>
+            </w:r>
+            <w:r>
+              <w:rPr>
+                <w:rFonts w:ascii="Times New Roman" w:hAnsi="Times New Roman" w:cs="Times New Roman"/>
+                <w:sz w:val="22"/>
+                <w:szCs w:val="22"/>
+              </w:rPr>
+              <w:lastRenderedPageBreak/>
+              <w:t>nuevos roles en el sistema, garantizando consistencia y evitando roles inválidos sin permisos.</w:t>
+            </w:r>
+          </w:p>
+        </w:tc>
+        <w:tc>
+          <w:tcPr>
+            <w:tcW w:w="2232" w:type="dxa"/>
+            <w:vAlign w:val="center"/>
+          </w:tcPr>
+          <w:p>
+            <w:pPr>
+              <w:jc w:val="both"/>
+              <w:rPr>
+                <w:rFonts w:ascii="Times New Roman" w:hAnsi="Times New Roman" w:cs="Times New Roman"/>
+                <w:sz w:val="22"/>
+                <w:szCs w:val="22"/>
+              </w:rPr>
+            </w:pPr>
+            <w:r>
+              <w:rPr>
+                <w:rFonts w:ascii="Times New Roman" w:hAnsi="Times New Roman" w:cs="Times New Roman"/>
+                <w:sz w:val="22"/>
+                <w:szCs w:val="22"/>
+              </w:rPr>
+              <w:lastRenderedPageBreak/>
+              <w:t xml:space="preserve">Previene configuraciones </w:t>
+            </w:r>
+            <w:r>
+              <w:rPr>
+                <w:rFonts w:ascii="Times New Roman" w:hAnsi="Times New Roman" w:cs="Times New Roman"/>
+                <w:sz w:val="22"/>
+                <w:szCs w:val="22"/>
+              </w:rPr>
+              <w:lastRenderedPageBreak/>
+              <w:t>inseguras, mantiene integridad y reduce errores lógicos en el control de acceso.</w:t>
+            </w:r>
+          </w:p>
+        </w:tc>
+      </w:tr>
+      <w:tr>
+        <w:tc>
+          <w:tcPr>
+            <w:tcW w:w="2127" w:type="dxa"/>
+            <w:vAlign w:val="center"/>
+          </w:tcPr>
+          <w:p>
+            <w:pPr>
+              <w:jc w:val="both"/>
+              <w:rPr>
+                <w:rFonts w:ascii="Times New Roman" w:hAnsi="Times New Roman" w:cs="Times New Roman"/>
+                <w:sz w:val="22"/>
+                <w:szCs w:val="22"/>
+              </w:rPr>
+            </w:pPr>
+            <w:proofErr w:type="spellStart"/>
+            <w:r>
+              <w:rPr>
+                <w:rFonts w:ascii="Times New Roman" w:hAnsi="Times New Roman" w:cs="Times New Roman"/>
+                <w:sz w:val="22"/>
+                <w:szCs w:val="22"/>
+              </w:rPr>
+              <w:lastRenderedPageBreak/>
+              <w:t>sp_eliminar_rol</w:t>
+            </w:r>
+            <w:proofErr w:type="spellEnd"/>
+          </w:p>
+        </w:tc>
+        <w:tc>
+          <w:tcPr>
+            <w:tcW w:w="2854" w:type="dxa"/>
+            <w:vAlign w:val="center"/>
+          </w:tcPr>
+          <w:p>
+            <w:pPr>
+              <w:jc w:val="both"/>
+              <w:rPr>
+                <w:rFonts w:ascii="Times New Roman" w:hAnsi="Times New Roman" w:cs="Times New Roman"/>
+                <w:sz w:val="22"/>
+                <w:szCs w:val="22"/>
+              </w:rPr>
+            </w:pPr>
+            <w:r>
+              <w:rPr>
+                <w:rFonts w:ascii="Times New Roman" w:hAnsi="Times New Roman" w:cs="Times New Roman"/>
+                <w:sz w:val="22"/>
+                <w:szCs w:val="22"/>
+              </w:rPr>
+              <w:t>Procedimiento que elimina un rol validando que no sea el rol Administrador ni tenga usuarios asociados.</w:t>
+            </w:r>
+          </w:p>
+        </w:tc>
+        <w:tc>
+          <w:tcPr>
+            <w:tcW w:w="2001" w:type="dxa"/>
+            <w:vAlign w:val="center"/>
+          </w:tcPr>
+          <w:p>
+            <w:pPr>
+              <w:jc w:val="both"/>
+              <w:rPr>
+                <w:rFonts w:ascii="Times New Roman" w:hAnsi="Times New Roman" w:cs="Times New Roman"/>
+                <w:sz w:val="22"/>
+                <w:szCs w:val="22"/>
+              </w:rPr>
+            </w:pPr>
+            <w:r>
+              <w:rPr>
+                <w:rFonts w:ascii="Times New Roman" w:hAnsi="Times New Roman" w:cs="Times New Roman"/>
+                <w:sz w:val="22"/>
+                <w:szCs w:val="22"/>
+              </w:rPr>
+              <w:t>Se invoca cuando un administrador intenta eliminar un rol, asegurando que no se rompa la integridad del sistema.</w:t>
+            </w:r>
+          </w:p>
+        </w:tc>
+        <w:tc>
+          <w:tcPr>
+            <w:tcW w:w="2232" w:type="dxa"/>
+            <w:vAlign w:val="center"/>
+          </w:tcPr>
+          <w:p>
+            <w:pPr>
+              <w:jc w:val="both"/>
+              <w:rPr>
+                <w:rFonts w:ascii="Times New Roman" w:hAnsi="Times New Roman" w:cs="Times New Roman"/>
+                <w:sz w:val="22"/>
+                <w:szCs w:val="22"/>
+              </w:rPr>
+            </w:pPr>
+            <w:r>
+              <w:rPr>
+                <w:rFonts w:ascii="Times New Roman" w:hAnsi="Times New Roman" w:cs="Times New Roman"/>
+                <w:sz w:val="22"/>
+                <w:szCs w:val="22"/>
+              </w:rPr>
+              <w:t>Protege la seguridad del sistema y evita pérdida de control de acceso</w:t>
+            </w:r>
+          </w:p>
+        </w:tc>
+      </w:tr>
+      <w:tr>
+        <w:tc>
+          <w:tcPr>
+            <w:tcW w:w="2127" w:type="dxa"/>
+            <w:vAlign w:val="center"/>
+          </w:tcPr>
+          <w:p>
+            <w:pPr>
+              <w:jc w:val="both"/>
+              <w:rPr>
+                <w:rFonts w:ascii="Times New Roman" w:hAnsi="Times New Roman" w:cs="Times New Roman"/>
+                <w:sz w:val="22"/>
+                <w:szCs w:val="22"/>
+              </w:rPr>
+            </w:pPr>
+            <w:proofErr w:type="spellStart"/>
+            <w:r>
+              <w:rPr>
+                <w:rFonts w:ascii="Times New Roman" w:hAnsi="Times New Roman" w:cs="Times New Roman"/>
+                <w:sz w:val="22"/>
+                <w:szCs w:val="22"/>
+              </w:rPr>
+              <w:t>sp_eliminar_rol</w:t>
+            </w:r>
+            <w:proofErr w:type="spellEnd"/>
+          </w:p>
+        </w:tc>
+        <w:tc>
+          <w:tcPr>
+            <w:tcW w:w="2854" w:type="dxa"/>
+            <w:vAlign w:val="center"/>
+          </w:tcPr>
+          <w:p>
+            <w:pPr>
+              <w:jc w:val="both"/>
+              <w:rPr>
+                <w:rFonts w:ascii="Times New Roman" w:hAnsi="Times New Roman" w:cs="Times New Roman"/>
+                <w:sz w:val="22"/>
+                <w:szCs w:val="22"/>
+              </w:rPr>
+            </w:pPr>
+            <w:r>
+              <w:rPr>
+                <w:rFonts w:ascii="Times New Roman" w:hAnsi="Times New Roman" w:cs="Times New Roman"/>
+                <w:sz w:val="22"/>
+                <w:szCs w:val="22"/>
+              </w:rPr>
+              <w:t>Permite modificar los permisos de un rol asegurando que siempre tenga al menos uno asociado.</w:t>
+            </w:r>
+          </w:p>
+        </w:tc>
+        <w:tc>
+          <w:tcPr>
+            <w:tcW w:w="2001" w:type="dxa"/>
+            <w:vAlign w:val="center"/>
+          </w:tcPr>
+          <w:p>
+            <w:pPr>
+              <w:jc w:val="both"/>
+              <w:rPr>
+                <w:rFonts w:ascii="Times New Roman" w:hAnsi="Times New Roman" w:cs="Times New Roman"/>
+                <w:sz w:val="22"/>
+                <w:szCs w:val="22"/>
+              </w:rPr>
+            </w:pPr>
+            <w:r>
+              <w:rPr>
+                <w:rFonts w:ascii="Times New Roman" w:hAnsi="Times New Roman" w:cs="Times New Roman"/>
+                <w:sz w:val="22"/>
+                <w:szCs w:val="22"/>
+              </w:rPr>
+              <w:t>Usado en módulos de administración para editar roles existentes.</w:t>
+            </w:r>
+          </w:p>
+        </w:tc>
+        <w:tc>
+          <w:tcPr>
+            <w:tcW w:w="2232" w:type="dxa"/>
+            <w:vAlign w:val="center"/>
+          </w:tcPr>
+          <w:p>
+            <w:pPr>
+              <w:jc w:val="both"/>
+              <w:rPr>
+                <w:rFonts w:ascii="Times New Roman" w:hAnsi="Times New Roman" w:cs="Times New Roman"/>
+                <w:sz w:val="22"/>
+                <w:szCs w:val="22"/>
+              </w:rPr>
+            </w:pPr>
+            <w:r>
+              <w:rPr>
+                <w:rFonts w:ascii="Times New Roman" w:hAnsi="Times New Roman" w:cs="Times New Roman"/>
+                <w:sz w:val="22"/>
+                <w:szCs w:val="22"/>
+              </w:rPr>
+              <w:t>Mantiene consistencia en cambios y evita estados inválidos.</w:t>
+            </w:r>
+          </w:p>
+        </w:tc>
+      </w:tr>
+      <w:tr>
+        <w:tc>
+          <w:tcPr>
+            <w:tcW w:w="2127" w:type="dxa"/>
+            <w:vAlign w:val="center"/>
+          </w:tcPr>
+          <w:p>
+            <w:pPr>
+              <w:jc w:val="both"/>
+              <w:rPr>
+                <w:rFonts w:ascii="Times New Roman" w:hAnsi="Times New Roman" w:cs="Times New Roman"/>
+                <w:sz w:val="22"/>
+                <w:szCs w:val="22"/>
+              </w:rPr>
+            </w:pPr>
+            <w:proofErr w:type="spellStart"/>
+            <w:r>
+              <w:rPr>
+                <w:rFonts w:ascii="Times New Roman" w:hAnsi="Times New Roman" w:cs="Times New Roman"/>
+                <w:sz w:val="22"/>
+                <w:szCs w:val="22"/>
+              </w:rPr>
+              <w:t>sp_</w:t>
+            </w:r>
+            <w:r>
+              <w:rPr>
+                <w:rFonts w:ascii="Times New Roman" w:hAnsi="Times New Roman" w:cs="Times New Roman"/>
+                <w:sz w:val="22"/>
+                <w:szCs w:val="22"/>
+              </w:rPr>
+              <w:t>cambiar_estado_usuario</w:t>
+            </w:r>
+            <w:proofErr w:type="spellEnd"/>
+          </w:p>
+        </w:tc>
+        <w:tc>
+          <w:tcPr>
+            <w:tcW w:w="2854" w:type="dxa"/>
+            <w:vAlign w:val="center"/>
+          </w:tcPr>
+          <w:p>
+            <w:pPr>
+              <w:jc w:val="both"/>
+              <w:rPr>
+                <w:rFonts w:ascii="Times New Roman" w:hAnsi="Times New Roman" w:cs="Times New Roman"/>
+                <w:sz w:val="22"/>
+                <w:szCs w:val="22"/>
+              </w:rPr>
+            </w:pPr>
+            <w:r>
+              <w:rPr>
+                <w:rFonts w:ascii="Times New Roman" w:hAnsi="Times New Roman" w:cs="Times New Roman"/>
+                <w:sz w:val="22"/>
+                <w:szCs w:val="22"/>
+              </w:rPr>
+              <w:t>Procedimiento que gestiona las transiciones de estado de un usuario validando reglas de negocio, restricciones de seguridad y registrando auditoría de cambios.</w:t>
+            </w:r>
+          </w:p>
+        </w:tc>
+        <w:tc>
+          <w:tcPr>
+            <w:tcW w:w="2001" w:type="dxa"/>
+            <w:vAlign w:val="center"/>
+          </w:tcPr>
+          <w:p>
+            <w:pPr>
+              <w:jc w:val="both"/>
+              <w:rPr>
+                <w:rFonts w:ascii="Times New Roman" w:hAnsi="Times New Roman" w:cs="Times New Roman"/>
+                <w:sz w:val="22"/>
+                <w:szCs w:val="22"/>
+              </w:rPr>
+            </w:pPr>
+            <w:r>
+              <w:rPr>
+                <w:rFonts w:ascii="Times New Roman" w:hAnsi="Times New Roman" w:cs="Times New Roman"/>
+                <w:sz w:val="22"/>
+                <w:szCs w:val="22"/>
+              </w:rPr>
+              <w:t xml:space="preserve">Se invoca desde el </w:t>
+            </w:r>
+            <w:proofErr w:type="spellStart"/>
+            <w:r>
+              <w:rPr>
+                <w:rFonts w:ascii="Times New Roman" w:hAnsi="Times New Roman" w:cs="Times New Roman"/>
+                <w:sz w:val="22"/>
+                <w:szCs w:val="22"/>
+              </w:rPr>
+              <w:t>backend</w:t>
+            </w:r>
+            <w:proofErr w:type="spellEnd"/>
+            <w:r>
+              <w:rPr>
+                <w:rFonts w:ascii="Times New Roman" w:hAnsi="Times New Roman" w:cs="Times New Roman"/>
+                <w:sz w:val="22"/>
+                <w:szCs w:val="22"/>
+              </w:rPr>
+              <w:t xml:space="preserve"> cuando un administrador realiza acciones sobre cuentas (activar, bloquear, eliminar, etc.).</w:t>
+            </w:r>
+          </w:p>
+        </w:tc>
+        <w:tc>
+          <w:tcPr>
+            <w:tcW w:w="2232" w:type="dxa"/>
+            <w:vAlign w:val="center"/>
+          </w:tcPr>
+          <w:p>
+            <w:pPr>
+              <w:jc w:val="both"/>
+              <w:rPr>
+                <w:rFonts w:ascii="Times New Roman" w:hAnsi="Times New Roman" w:cs="Times New Roman"/>
+                <w:sz w:val="22"/>
+                <w:szCs w:val="22"/>
+              </w:rPr>
+            </w:pPr>
+            <w:r>
+              <w:rPr>
+                <w:rFonts w:ascii="Times New Roman" w:hAnsi="Times New Roman" w:cs="Times New Roman"/>
+                <w:sz w:val="22"/>
+                <w:szCs w:val="22"/>
+              </w:rPr>
+              <w:t>Garantiza control total del ciclo de vida del usuario, evita estados inválidos y asegura trazabilidad mediante auditoría.</w:t>
+            </w:r>
+          </w:p>
+        </w:tc>
+      </w:tr>
+      <w:tr>
+        <w:tc>
+          <w:tcPr>
+            <w:tcW w:w="2127" w:type="dxa"/>
+            <w:vAlign w:val="center"/>
+          </w:tcPr>
+          <w:p>
+            <w:pPr>
+              <w:jc w:val="both"/>
+              <w:rPr>
+                <w:rFonts w:ascii="Times New Roman" w:hAnsi="Times New Roman" w:cs="Times New Roman"/>
+                <w:sz w:val="22"/>
+                <w:szCs w:val="22"/>
+              </w:rPr>
+            </w:pPr>
+            <w:proofErr w:type="spellStart"/>
+            <w:r>
+              <w:rPr>
+                <w:rFonts w:ascii="Times New Roman" w:hAnsi="Times New Roman" w:cs="Times New Roman"/>
+                <w:sz w:val="22"/>
+                <w:szCs w:val="22"/>
+              </w:rPr>
+              <w:t>sp</w:t>
+            </w:r>
+            <w:proofErr w:type="spellEnd"/>
+            <w:r>
+              <w:rPr>
+                <w:rFonts w:ascii="Times New Roman" w:hAnsi="Times New Roman" w:cs="Times New Roman"/>
+                <w:sz w:val="22"/>
+                <w:szCs w:val="22"/>
+              </w:rPr>
+              <w:t>_</w:t>
+            </w:r>
+            <w:r>
+              <w:t xml:space="preserve"> </w:t>
+            </w:r>
+            <w:proofErr w:type="spellStart"/>
+            <w:r>
+              <w:rPr>
+                <w:rFonts w:ascii="Times New Roman" w:hAnsi="Times New Roman" w:cs="Times New Roman"/>
+                <w:sz w:val="22"/>
+                <w:szCs w:val="22"/>
+              </w:rPr>
+              <w:t>registrar_evento</w:t>
+            </w:r>
+            <w:proofErr w:type="spellEnd"/>
+          </w:p>
+        </w:tc>
+        <w:tc>
+          <w:tcPr>
+            <w:tcW w:w="2854" w:type="dxa"/>
+            <w:vAlign w:val="center"/>
+          </w:tcPr>
+          <w:p>
+            <w:pPr>
+              <w:jc w:val="both"/>
+              <w:rPr>
+                <w:rFonts w:ascii="Times New Roman" w:hAnsi="Times New Roman" w:cs="Times New Roman"/>
+                <w:sz w:val="22"/>
+                <w:szCs w:val="22"/>
+              </w:rPr>
+            </w:pPr>
+            <w:r>
+              <w:rPr>
+                <w:rFonts w:ascii="Times New Roman" w:hAnsi="Times New Roman" w:cs="Times New Roman"/>
+                <w:sz w:val="22"/>
+                <w:szCs w:val="22"/>
+              </w:rPr>
+              <w:t>Procedimiento que registra eventos auditables generando un hash SHA-256 para garantizar la integridad del registro.</w:t>
+            </w:r>
+          </w:p>
+        </w:tc>
+        <w:tc>
+          <w:tcPr>
+            <w:tcW w:w="2001" w:type="dxa"/>
+            <w:vAlign w:val="center"/>
+          </w:tcPr>
+          <w:p>
+            <w:pPr>
+              <w:jc w:val="both"/>
+              <w:rPr>
+                <w:rFonts w:ascii="Times New Roman" w:hAnsi="Times New Roman" w:cs="Times New Roman"/>
+                <w:sz w:val="22"/>
+                <w:szCs w:val="22"/>
+              </w:rPr>
+            </w:pPr>
+            <w:r>
+              <w:rPr>
+                <w:rFonts w:ascii="Times New Roman" w:hAnsi="Times New Roman" w:cs="Times New Roman"/>
+                <w:sz w:val="22"/>
+                <w:szCs w:val="22"/>
+              </w:rPr>
+              <w:t xml:space="preserve">Se invoca desde el </w:t>
+            </w:r>
+            <w:proofErr w:type="spellStart"/>
+            <w:r>
+              <w:rPr>
+                <w:rFonts w:ascii="Times New Roman" w:hAnsi="Times New Roman" w:cs="Times New Roman"/>
+                <w:sz w:val="22"/>
+                <w:szCs w:val="22"/>
+              </w:rPr>
+              <w:t>backend</w:t>
+            </w:r>
+            <w:proofErr w:type="spellEnd"/>
+            <w:r>
+              <w:rPr>
+                <w:rFonts w:ascii="Times New Roman" w:hAnsi="Times New Roman" w:cs="Times New Roman"/>
+                <w:sz w:val="22"/>
+                <w:szCs w:val="22"/>
+              </w:rPr>
+              <w:t xml:space="preserve"> cada vez que ocurre un evento relevante del sistema.</w:t>
+            </w:r>
+          </w:p>
+        </w:tc>
+        <w:tc>
+          <w:tcPr>
+            <w:tcW w:w="2232" w:type="dxa"/>
+            <w:vAlign w:val="center"/>
+          </w:tcPr>
+          <w:p>
+            <w:pPr>
+              <w:jc w:val="both"/>
+              <w:rPr>
+                <w:rFonts w:ascii="Times New Roman" w:hAnsi="Times New Roman" w:cs="Times New Roman"/>
+                <w:sz w:val="22"/>
+                <w:szCs w:val="22"/>
+              </w:rPr>
+            </w:pPr>
+            <w:r>
+              <w:rPr>
+                <w:rFonts w:ascii="Times New Roman" w:hAnsi="Times New Roman" w:cs="Times New Roman"/>
+                <w:sz w:val="22"/>
+                <w:szCs w:val="22"/>
+              </w:rPr>
+              <w:t>Garantiza trazabilidad completa y registros seguros e íntegros.</w:t>
+            </w:r>
+          </w:p>
+        </w:tc>
+      </w:tr>
+      <w:tr>
+        <w:tc>
+          <w:tcPr>
+            <w:tcW w:w="2127" w:type="dxa"/>
+            <w:vAlign w:val="center"/>
+          </w:tcPr>
+          <w:p>
+            <w:pPr>
+              <w:jc w:val="both"/>
+              <w:rPr>
+                <w:rFonts w:ascii="Times New Roman" w:hAnsi="Times New Roman" w:cs="Times New Roman"/>
+                <w:sz w:val="22"/>
+                <w:szCs w:val="22"/>
+              </w:rPr>
+            </w:pPr>
+            <w:proofErr w:type="spellStart"/>
+            <w:r>
+              <w:rPr>
+                <w:rFonts w:ascii="Times New Roman" w:hAnsi="Times New Roman" w:cs="Times New Roman"/>
+                <w:sz w:val="22"/>
+                <w:szCs w:val="22"/>
+              </w:rPr>
+              <w:t>sp_</w:t>
+            </w:r>
+            <w:r>
+              <w:rPr>
+                <w:rFonts w:ascii="Times New Roman" w:hAnsi="Times New Roman" w:cs="Times New Roman"/>
+                <w:sz w:val="22"/>
+                <w:szCs w:val="22"/>
+              </w:rPr>
+              <w:t>generar_notificacion</w:t>
+            </w:r>
+            <w:proofErr w:type="spellEnd"/>
+          </w:p>
+        </w:tc>
+        <w:tc>
+          <w:tcPr>
+            <w:tcW w:w="2854" w:type="dxa"/>
+            <w:vAlign w:val="center"/>
+          </w:tcPr>
+          <w:p>
+            <w:pPr>
+              <w:jc w:val="both"/>
+              <w:rPr>
+                <w:rFonts w:ascii="Times New Roman" w:hAnsi="Times New Roman" w:cs="Times New Roman"/>
+                <w:sz w:val="22"/>
+                <w:szCs w:val="22"/>
+              </w:rPr>
+            </w:pPr>
+            <w:r>
+              <w:rPr>
+                <w:rFonts w:ascii="Times New Roman" w:hAnsi="Times New Roman" w:cs="Times New Roman"/>
+                <w:sz w:val="22"/>
+                <w:szCs w:val="22"/>
+              </w:rPr>
+              <w:t xml:space="preserve">Procedimiento que crea notificaciones validando estado del usuario, restricciones de seguridad y política </w:t>
+            </w:r>
+            <w:proofErr w:type="spellStart"/>
+            <w:r>
+              <w:rPr>
+                <w:rFonts w:ascii="Times New Roman" w:hAnsi="Times New Roman" w:cs="Times New Roman"/>
+                <w:sz w:val="22"/>
+                <w:szCs w:val="22"/>
+              </w:rPr>
+              <w:t>anti-spam</w:t>
+            </w:r>
+            <w:proofErr w:type="spellEnd"/>
+            <w:r>
+              <w:rPr>
+                <w:rFonts w:ascii="Times New Roman" w:hAnsi="Times New Roman" w:cs="Times New Roman"/>
+                <w:sz w:val="22"/>
+                <w:szCs w:val="22"/>
+              </w:rPr>
+              <w:t xml:space="preserve"> antes de registrar el evento.</w:t>
+            </w:r>
+          </w:p>
+        </w:tc>
+        <w:tc>
+          <w:tcPr>
+            <w:tcW w:w="2001" w:type="dxa"/>
+            <w:vAlign w:val="center"/>
+          </w:tcPr>
+          <w:p>
+            <w:pPr>
+              <w:jc w:val="both"/>
+              <w:rPr>
+                <w:rFonts w:ascii="Times New Roman" w:hAnsi="Times New Roman" w:cs="Times New Roman"/>
+                <w:sz w:val="22"/>
+                <w:szCs w:val="22"/>
+              </w:rPr>
+            </w:pPr>
+            <w:r>
+              <w:rPr>
+                <w:rFonts w:ascii="Times New Roman" w:hAnsi="Times New Roman" w:cs="Times New Roman"/>
+                <w:sz w:val="22"/>
+                <w:szCs w:val="22"/>
+              </w:rPr>
+              <w:t xml:space="preserve">Se invoca desde el </w:t>
+            </w:r>
+            <w:proofErr w:type="spellStart"/>
+            <w:r>
+              <w:rPr>
+                <w:rFonts w:ascii="Times New Roman" w:hAnsi="Times New Roman" w:cs="Times New Roman"/>
+                <w:sz w:val="22"/>
+                <w:szCs w:val="22"/>
+              </w:rPr>
+              <w:t>backend</w:t>
+            </w:r>
+            <w:proofErr w:type="spellEnd"/>
+            <w:r>
+              <w:rPr>
+                <w:rFonts w:ascii="Times New Roman" w:hAnsi="Times New Roman" w:cs="Times New Roman"/>
+                <w:sz w:val="22"/>
+                <w:szCs w:val="22"/>
+              </w:rPr>
+              <w:t xml:space="preserve"> cuando ocurre un evento relevante del sistema.</w:t>
+            </w:r>
+          </w:p>
+        </w:tc>
+        <w:tc>
+          <w:tcPr>
+            <w:tcW w:w="2232" w:type="dxa"/>
+            <w:vAlign w:val="center"/>
+          </w:tcPr>
+          <w:p>
+            <w:pPr>
+              <w:jc w:val="both"/>
+              <w:rPr>
+                <w:rFonts w:ascii="Times New Roman" w:hAnsi="Times New Roman" w:cs="Times New Roman"/>
+                <w:sz w:val="22"/>
+                <w:szCs w:val="22"/>
+              </w:rPr>
+            </w:pPr>
+            <w:r>
+              <w:rPr>
+                <w:rFonts w:ascii="Times New Roman" w:hAnsi="Times New Roman" w:cs="Times New Roman"/>
+                <w:sz w:val="22"/>
+                <w:szCs w:val="22"/>
+              </w:rPr>
+              <w:t>Evita spam, asegura envío controlado y mantiene consistencia en la gestión de notificaciones.</w:t>
+            </w:r>
+          </w:p>
+        </w:tc>
+      </w:tr>
+    </w:tbl>
+    <w:p/>
+    <w:p/>
     <w:p>
       <w:pPr>
         <w:pStyle w:val="Ttulo2"/>
@@ -2867,12 +3863,273 @@
           <w:numId w:val="1"/>
         </w:numPr>
       </w:pPr>
-      <w:bookmarkStart w:id="5" w:name="_Toc226814939"/>
+      <w:bookmarkStart w:id="5" w:name="_Toc226841851"/>
       <w:r>
         <w:t>Funciones</w:t>
       </w:r>
       <w:bookmarkEnd w:id="5"/>
     </w:p>
+    <w:tbl>
+      <w:tblPr>
+        <w:tblStyle w:val="Tablaconcuadrcula"/>
+        <w:tblW w:w="9214" w:type="dxa"/>
+        <w:tblInd w:w="-147" w:type="dxa"/>
+        <w:tblLook w:val="04A0" w:firstRow="1" w:lastRow="0" w:firstColumn="1" w:lastColumn="0" w:noHBand="0" w:noVBand="1"/>
+      </w:tblPr>
+      <w:tblGrid>
+        <w:gridCol w:w="2953"/>
+        <w:gridCol w:w="2225"/>
+        <w:gridCol w:w="1931"/>
+        <w:gridCol w:w="2105"/>
+      </w:tblGrid>
+      <w:tr>
+        <w:tc>
+          <w:tcPr>
+            <w:tcW w:w="1829" w:type="dxa"/>
+            <w:vAlign w:val="center"/>
+            <w:hideMark/>
+          </w:tcPr>
+          <w:p>
+            <w:pPr>
+              <w:spacing w:after="160" w:line="278" w:lineRule="auto"/>
+              <w:jc w:val="center"/>
+              <w:rPr>
+                <w:rFonts w:ascii="Times New Roman" w:hAnsi="Times New Roman" w:cs="Times New Roman"/>
+                <w:b/>
+                <w:bCs/>
+                <w:i/>
+                <w:iCs/>
+                <w:sz w:val="22"/>
+                <w:szCs w:val="22"/>
+              </w:rPr>
+            </w:pPr>
+            <w:r>
+              <w:rPr>
+                <w:rFonts w:ascii="Times New Roman" w:hAnsi="Times New Roman" w:cs="Times New Roman"/>
+                <w:b/>
+                <w:bCs/>
+                <w:i/>
+                <w:iCs/>
+                <w:sz w:val="22"/>
+                <w:szCs w:val="22"/>
+              </w:rPr>
+              <w:t>Nombre</w:t>
+            </w:r>
+          </w:p>
+        </w:tc>
+        <w:tc>
+          <w:tcPr>
+            <w:tcW w:w="2566" w:type="dxa"/>
+            <w:vAlign w:val="center"/>
+            <w:hideMark/>
+          </w:tcPr>
+          <w:p>
+            <w:pPr>
+              <w:spacing w:after="160" w:line="278" w:lineRule="auto"/>
+              <w:jc w:val="center"/>
+              <w:rPr>
+                <w:rFonts w:ascii="Times New Roman" w:hAnsi="Times New Roman" w:cs="Times New Roman"/>
+                <w:b/>
+                <w:bCs/>
+                <w:i/>
+                <w:iCs/>
+                <w:sz w:val="22"/>
+                <w:szCs w:val="22"/>
+              </w:rPr>
+            </w:pPr>
+            <w:r>
+              <w:rPr>
+                <w:rFonts w:ascii="Times New Roman" w:hAnsi="Times New Roman" w:cs="Times New Roman"/>
+                <w:b/>
+                <w:bCs/>
+                <w:i/>
+                <w:iCs/>
+                <w:sz w:val="22"/>
+                <w:szCs w:val="22"/>
+              </w:rPr>
+              <w:t>Descripción</w:t>
+            </w:r>
+          </w:p>
+        </w:tc>
+        <w:tc>
+          <w:tcPr>
+            <w:tcW w:w="2268" w:type="dxa"/>
+            <w:vAlign w:val="center"/>
+            <w:hideMark/>
+          </w:tcPr>
+          <w:p>
+            <w:pPr>
+              <w:spacing w:after="160" w:line="278" w:lineRule="auto"/>
+              <w:jc w:val="center"/>
+              <w:rPr>
+                <w:rFonts w:ascii="Times New Roman" w:hAnsi="Times New Roman" w:cs="Times New Roman"/>
+                <w:b/>
+                <w:bCs/>
+                <w:i/>
+                <w:iCs/>
+                <w:sz w:val="22"/>
+                <w:szCs w:val="22"/>
+              </w:rPr>
+            </w:pPr>
+            <w:r>
+              <w:rPr>
+                <w:rFonts w:ascii="Times New Roman" w:hAnsi="Times New Roman" w:cs="Times New Roman"/>
+                <w:b/>
+                <w:bCs/>
+                <w:i/>
+                <w:iCs/>
+                <w:sz w:val="22"/>
+                <w:szCs w:val="22"/>
+              </w:rPr>
+              <w:t>Retorno</w:t>
+            </w:r>
+          </w:p>
+        </w:tc>
+        <w:tc>
+          <w:tcPr>
+            <w:tcW w:w="2551" w:type="dxa"/>
+            <w:vAlign w:val="center"/>
+            <w:hideMark/>
+          </w:tcPr>
+          <w:p>
+            <w:pPr>
+              <w:spacing w:after="160" w:line="278" w:lineRule="auto"/>
+              <w:jc w:val="center"/>
+              <w:rPr>
+                <w:rFonts w:ascii="Times New Roman" w:hAnsi="Times New Roman" w:cs="Times New Roman"/>
+                <w:b/>
+                <w:bCs/>
+                <w:i/>
+                <w:iCs/>
+                <w:sz w:val="22"/>
+                <w:szCs w:val="22"/>
+              </w:rPr>
+            </w:pPr>
+            <w:r>
+              <w:rPr>
+                <w:rFonts w:ascii="Times New Roman" w:hAnsi="Times New Roman" w:cs="Times New Roman"/>
+                <w:b/>
+                <w:bCs/>
+                <w:i/>
+                <w:iCs/>
+                <w:sz w:val="22"/>
+                <w:szCs w:val="22"/>
+              </w:rPr>
+              <w:t>Uso</w:t>
+            </w:r>
+          </w:p>
+        </w:tc>
+      </w:tr>
+      <w:tr>
+        <w:tc>
+          <w:tcPr>
+            <w:tcW w:w="1829" w:type="dxa"/>
+            <w:hideMark/>
+          </w:tcPr>
+          <w:p>
+            <w:pPr>
+              <w:spacing w:after="160" w:line="278" w:lineRule="auto"/>
+              <w:rPr>
+                <w:rFonts w:ascii="Times New Roman" w:hAnsi="Times New Roman" w:cs="Times New Roman"/>
+                <w:sz w:val="22"/>
+                <w:szCs w:val="22"/>
+              </w:rPr>
+            </w:pPr>
+            <w:proofErr w:type="spellStart"/>
+            <w:r>
+              <w:rPr>
+                <w:rFonts w:ascii="Times New Roman" w:hAnsi="Times New Roman" w:cs="Times New Roman"/>
+                <w:sz w:val="22"/>
+                <w:szCs w:val="22"/>
+              </w:rPr>
+              <w:t>fn_</w:t>
+            </w:r>
+            <w:r>
+              <w:rPr>
+                <w:rFonts w:ascii="Times New Roman" w:hAnsi="Times New Roman" w:cs="Times New Roman"/>
+                <w:sz w:val="22"/>
+                <w:szCs w:val="22"/>
+              </w:rPr>
+              <w:t>verificar_integridad_evento</w:t>
+            </w:r>
+            <w:proofErr w:type="spellEnd"/>
+          </w:p>
+        </w:tc>
+        <w:tc>
+          <w:tcPr>
+            <w:tcW w:w="2566" w:type="dxa"/>
+            <w:hideMark/>
+          </w:tcPr>
+          <w:p>
+            <w:pPr>
+              <w:spacing w:after="160" w:line="278" w:lineRule="auto"/>
+              <w:rPr>
+                <w:rFonts w:ascii="Times New Roman" w:hAnsi="Times New Roman" w:cs="Times New Roman"/>
+                <w:sz w:val="22"/>
+                <w:szCs w:val="22"/>
+              </w:rPr>
+            </w:pPr>
+            <w:r>
+              <w:rPr>
+                <w:rFonts w:ascii="Times New Roman" w:hAnsi="Times New Roman" w:cs="Times New Roman"/>
+                <w:sz w:val="22"/>
+                <w:szCs w:val="22"/>
+              </w:rPr>
+              <w:t>Función que recalcula el hash de un evento y valida su integridad.</w:t>
+            </w:r>
+          </w:p>
+        </w:tc>
+        <w:tc>
+          <w:tcPr>
+            <w:tcW w:w="2268" w:type="dxa"/>
+            <w:hideMark/>
+          </w:tcPr>
+          <w:p>
+            <w:pPr>
+              <w:spacing w:after="160" w:line="278" w:lineRule="auto"/>
+              <w:rPr>
+                <w:rFonts w:ascii="Times New Roman" w:hAnsi="Times New Roman" w:cs="Times New Roman"/>
+                <w:sz w:val="22"/>
+                <w:szCs w:val="22"/>
+              </w:rPr>
+            </w:pPr>
+            <w:r>
+              <w:rPr>
+                <w:rFonts w:ascii="Times New Roman" w:hAnsi="Times New Roman" w:cs="Times New Roman"/>
+                <w:sz w:val="22"/>
+                <w:szCs w:val="22"/>
+              </w:rPr>
+              <w:t>Valor booleano</w:t>
+            </w:r>
+          </w:p>
+        </w:tc>
+        <w:tc>
+          <w:tcPr>
+            <w:tcW w:w="2551" w:type="dxa"/>
+            <w:hideMark/>
+          </w:tcPr>
+          <w:p>
+            <w:pPr>
+              <w:spacing w:after="160" w:line="278" w:lineRule="auto"/>
+              <w:rPr>
+                <w:rFonts w:ascii="Times New Roman" w:hAnsi="Times New Roman" w:cs="Times New Roman"/>
+                <w:sz w:val="22"/>
+                <w:szCs w:val="22"/>
+              </w:rPr>
+            </w:pPr>
+            <w:r>
+              <w:rPr>
+                <w:rFonts w:ascii="Times New Roman" w:hAnsi="Times New Roman" w:cs="Times New Roman"/>
+                <w:sz w:val="22"/>
+                <w:szCs w:val="22"/>
+              </w:rPr>
+              <w:t>Cuando se registra un evento</w:t>
+            </w:r>
+          </w:p>
+        </w:tc>
+      </w:tr>
+    </w:tbl>
+    <w:p/>
     <w:p>
       <w:pPr>
         <w:pStyle w:val="Ttulo2"/>
@@ -2881,35 +4138,455 @@
           <w:numId w:val="1"/>
         </w:numPr>
       </w:pPr>
-      <w:bookmarkStart w:id="6" w:name="_Toc226814940"/>
+      <w:bookmarkStart w:id="6" w:name="_Toc226841852"/>
       <w:proofErr w:type="spellStart"/>
       <w:r>
+        <w:lastRenderedPageBreak/>
         <w:t>Triggers</w:t>
       </w:r>
       <w:bookmarkEnd w:id="6"/>
       <w:proofErr w:type="spellEnd"/>
     </w:p>
+    <w:tbl>
+      <w:tblPr>
+        <w:tblStyle w:val="Tablaconcuadrcula"/>
+        <w:tblW w:w="9214" w:type="dxa"/>
+        <w:tblInd w:w="-147" w:type="dxa"/>
+        <w:tblLook w:val="04A0" w:firstRow="1" w:lastRow="0" w:firstColumn="1" w:lastColumn="0" w:noHBand="0" w:noVBand="1"/>
+      </w:tblPr>
+      <w:tblGrid>
+        <w:gridCol w:w="1972"/>
+        <w:gridCol w:w="2522"/>
+        <w:gridCol w:w="2222"/>
+        <w:gridCol w:w="2498"/>
+      </w:tblGrid>
+      <w:tr>
+        <w:tc>
+          <w:tcPr>
+            <w:tcW w:w="1829" w:type="dxa"/>
+            <w:vAlign w:val="center"/>
+            <w:hideMark/>
+          </w:tcPr>
+          <w:p>
+            <w:pPr>
+              <w:spacing w:after="160" w:line="278" w:lineRule="auto"/>
+              <w:jc w:val="center"/>
+              <w:rPr>
+                <w:rFonts w:ascii="Times New Roman" w:hAnsi="Times New Roman" w:cs="Times New Roman"/>
+                <w:b/>
+                <w:bCs/>
+                <w:i/>
+                <w:iCs/>
+                <w:sz w:val="22"/>
+                <w:szCs w:val="22"/>
+              </w:rPr>
+            </w:pPr>
+            <w:r>
+              <w:rPr>
+                <w:rFonts w:ascii="Times New Roman" w:hAnsi="Times New Roman" w:cs="Times New Roman"/>
+                <w:b/>
+                <w:bCs/>
+                <w:i/>
+                <w:iCs/>
+                <w:sz w:val="22"/>
+                <w:szCs w:val="22"/>
+              </w:rPr>
+              <w:t>Nombre</w:t>
+            </w:r>
+          </w:p>
+        </w:tc>
+        <w:tc>
+          <w:tcPr>
+            <w:tcW w:w="2566" w:type="dxa"/>
+            <w:vAlign w:val="center"/>
+            <w:hideMark/>
+          </w:tcPr>
+          <w:p>
+            <w:pPr>
+              <w:spacing w:after="160" w:line="278" w:lineRule="auto"/>
+              <w:jc w:val="center"/>
+              <w:rPr>
+                <w:rFonts w:ascii="Times New Roman" w:hAnsi="Times New Roman" w:cs="Times New Roman"/>
+                <w:b/>
+                <w:bCs/>
+                <w:i/>
+                <w:iCs/>
+                <w:sz w:val="22"/>
+                <w:szCs w:val="22"/>
+              </w:rPr>
+            </w:pPr>
+            <w:r>
+              <w:rPr>
+                <w:rFonts w:ascii="Times New Roman" w:hAnsi="Times New Roman" w:cs="Times New Roman"/>
+                <w:b/>
+                <w:bCs/>
+                <w:i/>
+                <w:iCs/>
+                <w:sz w:val="22"/>
+                <w:szCs w:val="22"/>
+              </w:rPr>
+              <w:t>Evento</w:t>
+            </w:r>
+          </w:p>
+        </w:tc>
+        <w:tc>
+          <w:tcPr>
+            <w:tcW w:w="2268" w:type="dxa"/>
+            <w:vAlign w:val="center"/>
+            <w:hideMark/>
+          </w:tcPr>
+          <w:p>
+            <w:pPr>
+              <w:spacing w:after="160" w:line="278" w:lineRule="auto"/>
+              <w:jc w:val="center"/>
+              <w:rPr>
+                <w:rFonts w:ascii="Times New Roman" w:hAnsi="Times New Roman" w:cs="Times New Roman"/>
+                <w:b/>
+                <w:bCs/>
+                <w:i/>
+                <w:iCs/>
+                <w:sz w:val="22"/>
+                <w:szCs w:val="22"/>
+              </w:rPr>
+            </w:pPr>
+            <w:r>
+              <w:rPr>
+                <w:rFonts w:ascii="Times New Roman" w:hAnsi="Times New Roman" w:cs="Times New Roman"/>
+                <w:b/>
+                <w:bCs/>
+                <w:i/>
+                <w:iCs/>
+                <w:sz w:val="22"/>
+                <w:szCs w:val="22"/>
+              </w:rPr>
+              <w:t>Descripción</w:t>
+            </w:r>
+          </w:p>
+        </w:tc>
+        <w:tc>
+          <w:tcPr>
+            <w:tcW w:w="2551" w:type="dxa"/>
+            <w:vAlign w:val="center"/>
+            <w:hideMark/>
+          </w:tcPr>
+          <w:p>
+            <w:pPr>
+              <w:spacing w:after="160" w:line="278" w:lineRule="auto"/>
+              <w:jc w:val="center"/>
+              <w:rPr>
+                <w:rFonts w:ascii="Times New Roman" w:hAnsi="Times New Roman" w:cs="Times New Roman"/>
+                <w:b/>
+                <w:bCs/>
+                <w:i/>
+                <w:iCs/>
+                <w:sz w:val="22"/>
+                <w:szCs w:val="22"/>
+              </w:rPr>
+            </w:pPr>
+            <w:r>
+              <w:rPr>
+                <w:rFonts w:ascii="Times New Roman" w:hAnsi="Times New Roman" w:cs="Times New Roman"/>
+                <w:b/>
+                <w:bCs/>
+                <w:i/>
+                <w:iCs/>
+                <w:sz w:val="22"/>
+                <w:szCs w:val="22"/>
+              </w:rPr>
+              <w:t>Impacto</w:t>
+            </w:r>
+          </w:p>
+        </w:tc>
+      </w:tr>
+      <w:tr>
+        <w:tc>
+          <w:tcPr>
+            <w:tcW w:w="1829" w:type="dxa"/>
+            <w:hideMark/>
+          </w:tcPr>
+          <w:p>
+            <w:pPr>
+              <w:spacing w:after="160" w:line="278" w:lineRule="auto"/>
+              <w:rPr>
+                <w:rFonts w:ascii="Times New Roman" w:hAnsi="Times New Roman" w:cs="Times New Roman"/>
+                <w:sz w:val="22"/>
+                <w:szCs w:val="22"/>
+              </w:rPr>
+            </w:pPr>
+            <w:proofErr w:type="spellStart"/>
+            <w:r>
+              <w:rPr>
+                <w:rFonts w:ascii="Times New Roman" w:hAnsi="Times New Roman" w:cs="Times New Roman"/>
+                <w:sz w:val="22"/>
+                <w:szCs w:val="22"/>
+              </w:rPr>
+              <w:t>trg_bloqueo_evento</w:t>
+            </w:r>
+            <w:proofErr w:type="spellEnd"/>
+          </w:p>
+        </w:tc>
+        <w:tc>
+          <w:tcPr>
+            <w:tcW w:w="2566" w:type="dxa"/>
+            <w:hideMark/>
+          </w:tcPr>
+          <w:p>
+            <w:pPr>
+              <w:spacing w:after="160" w:line="278" w:lineRule="auto"/>
+              <w:rPr>
+                <w:rFonts w:ascii="Times New Roman" w:hAnsi="Times New Roman" w:cs="Times New Roman"/>
+                <w:sz w:val="22"/>
+                <w:szCs w:val="22"/>
+              </w:rPr>
+            </w:pPr>
+            <w:proofErr w:type="spellStart"/>
+            <w:r>
+              <w:rPr>
+                <w:rFonts w:ascii="Times New Roman" w:hAnsi="Times New Roman" w:cs="Times New Roman"/>
+                <w:sz w:val="22"/>
+                <w:szCs w:val="22"/>
+              </w:rPr>
+              <w:t>s</w:t>
+            </w:r>
+            <w:r>
+              <w:rPr>
+                <w:rFonts w:ascii="Times New Roman" w:hAnsi="Times New Roman" w:cs="Times New Roman"/>
+                <w:sz w:val="22"/>
+                <w:szCs w:val="22"/>
+              </w:rPr>
+              <w:t>p</w:t>
+            </w:r>
+            <w:proofErr w:type="spellEnd"/>
+            <w:r>
+              <w:rPr>
+                <w:rFonts w:ascii="Times New Roman" w:hAnsi="Times New Roman" w:cs="Times New Roman"/>
+                <w:sz w:val="22"/>
+                <w:szCs w:val="22"/>
+              </w:rPr>
+              <w:t>_</w:t>
+            </w:r>
+            <w:r>
+              <w:t xml:space="preserve"> </w:t>
+            </w:r>
+            <w:proofErr w:type="spellStart"/>
+            <w:r>
+              <w:rPr>
+                <w:rFonts w:ascii="Times New Roman" w:hAnsi="Times New Roman" w:cs="Times New Roman"/>
+                <w:sz w:val="22"/>
+                <w:szCs w:val="22"/>
+              </w:rPr>
+              <w:t>registrar_evento</w:t>
+            </w:r>
+            <w:proofErr w:type="spellEnd"/>
+          </w:p>
+        </w:tc>
+        <w:tc>
+          <w:tcPr>
+            <w:tcW w:w="2268" w:type="dxa"/>
+            <w:hideMark/>
+          </w:tcPr>
+          <w:p>
+            <w:pPr>
+              <w:spacing w:after="160" w:line="278" w:lineRule="auto"/>
+              <w:rPr>
+                <w:rFonts w:ascii="Times New Roman" w:hAnsi="Times New Roman" w:cs="Times New Roman"/>
+                <w:sz w:val="22"/>
+                <w:szCs w:val="22"/>
+              </w:rPr>
+            </w:pPr>
+            <w:r>
+              <w:rPr>
+                <w:rFonts w:ascii="Times New Roman" w:hAnsi="Times New Roman" w:cs="Times New Roman"/>
+                <w:sz w:val="22"/>
+                <w:szCs w:val="22"/>
+              </w:rPr>
+              <w:t>Trigger que impide cualquier operación de UPDATE o DELETE sobre la tabla de auditoría.</w:t>
+            </w:r>
+          </w:p>
+        </w:tc>
+        <w:tc>
+          <w:tcPr>
+            <w:tcW w:w="2551" w:type="dxa"/>
+            <w:hideMark/>
+          </w:tcPr>
+          <w:p>
+            <w:pPr>
+              <w:spacing w:after="160" w:line="278" w:lineRule="auto"/>
+              <w:rPr>
+                <w:rFonts w:ascii="Times New Roman" w:hAnsi="Times New Roman" w:cs="Times New Roman"/>
+                <w:sz w:val="22"/>
+                <w:szCs w:val="22"/>
+              </w:rPr>
+            </w:pPr>
+            <w:r>
+              <w:rPr>
+                <w:rFonts w:ascii="Times New Roman" w:hAnsi="Times New Roman" w:cs="Times New Roman"/>
+                <w:sz w:val="22"/>
+                <w:szCs w:val="22"/>
+              </w:rPr>
+              <w:t>Asegura la inmutabilidad total de los registros.</w:t>
+            </w:r>
+          </w:p>
+        </w:tc>
+      </w:tr>
+    </w:tbl>
     <w:p/>
     <w:p>
       <w:pPr>
         <w:pStyle w:val="Ttulo1"/>
       </w:pPr>
-      <w:bookmarkStart w:id="7" w:name="_Toc226814941"/>
-      <w:r>
-        <w:t>Flujo de Datos</w:t>
+      <w:bookmarkStart w:id="7" w:name="_Toc226841853"/>
+      <w:r>
+        <w:t>Consideraciones Técnicas</w:t>
       </w:r>
       <w:bookmarkEnd w:id="7"/>
     </w:p>
-    <w:p/>
-    <w:p>
-      <w:pPr>
-        <w:pStyle w:val="Ttulo1"/>
-      </w:pPr>
-      <w:bookmarkStart w:id="8" w:name="_Toc226814942"/>
-      <w:r>
-        <w:t>Consideraciones Técnicas</w:t>
-      </w:r>
-      <w:bookmarkEnd w:id="8"/>
+    <w:p>
+      <w:pPr>
+        <w:jc w:val="both"/>
+        <w:rPr>
+          <w:rFonts w:ascii="Times New Roman" w:hAnsi="Times New Roman" w:cs="Times New Roman"/>
+        </w:rPr>
+      </w:pPr>
+      <w:r>
+        <w:rPr>
+          <w:rFonts w:ascii="Times New Roman" w:hAnsi="Times New Roman" w:cs="Times New Roman"/>
+        </w:rPr>
+        <w:t>El diseño e implementación del Módulo 1 evidencia un enfoque sólido fundamentado en principios de integridad, seguridad y escalabilidad, alineados con buenas prácticas de ingeniería de software y modelado de bases de datos.</w:t>
+      </w:r>
+    </w:p>
+    <w:p>
+      <w:pPr>
+        <w:jc w:val="both"/>
+        <w:rPr>
+          <w:rFonts w:ascii="Times New Roman" w:hAnsi="Times New Roman" w:cs="Times New Roman"/>
+        </w:rPr>
+      </w:pPr>
+      <w:r>
+        <w:rPr>
+          <w:rFonts w:ascii="Times New Roman" w:hAnsi="Times New Roman" w:cs="Times New Roman"/>
+        </w:rPr>
+        <w:t>Desde una perspectiva estructural, el modelo relacional propuesto demuestra un adecuado nivel de normalización y cohesión semántica, permitiendo representar de forma consistente las interacciones entre usuarios, roles, permisos, estados y eventos del sistema. La incorporación de entidades como eventos, sesiones y gestión de cuentas no solo responde a necesidades funcionales, sino que introduce una capa robusta de trazabilidad que fortalece la capacidad de auditoría y monitoreo del sistema.</w:t>
+      </w:r>
+    </w:p>
+    <w:p>
+      <w:pPr>
+        <w:jc w:val="both"/>
+        <w:rPr>
+          <w:rFonts w:ascii="Times New Roman" w:hAnsi="Times New Roman" w:cs="Times New Roman"/>
+        </w:rPr>
+      </w:pPr>
+      <w:r>
+        <w:rPr>
+          <w:rFonts w:ascii="Times New Roman" w:hAnsi="Times New Roman" w:cs="Times New Roman"/>
+        </w:rPr>
+        <w:t>En términos de integridad de datos, el uso estratégico de claves primarias, foráneas y restricciones de unicidad garantiza la consistencia de la información, evitando redundancias y asegurando relaciones válidas entre las entidades. Este enfoque se complementa con la implementación de procedimientos almacenados que centralizan la lógica crítica del negocio, permitiendo controlar operaciones sensibles como el registro de usuarios, la gestión de roles, la transición de estados y la generación de eventos auditables.</w:t>
+      </w:r>
+    </w:p>
+    <w:p>
+      <w:pPr>
+        <w:jc w:val="both"/>
+        <w:rPr>
+          <w:rFonts w:ascii="Times New Roman" w:hAnsi="Times New Roman" w:cs="Times New Roman"/>
+        </w:rPr>
+      </w:pPr>
+      <w:r>
+        <w:rPr>
+          <w:rFonts w:ascii="Times New Roman" w:hAnsi="Times New Roman" w:cs="Times New Roman"/>
+        </w:rPr>
+        <w:t xml:space="preserve">Particularmente relevante es la decisión de distribuir la lógica del sistema entre la base de datos y el </w:t>
+      </w:r>
+      <w:proofErr w:type="spellStart"/>
+      <w:r>
+        <w:rPr>
+          <w:rFonts w:ascii="Times New Roman" w:hAnsi="Times New Roman" w:cs="Times New Roman"/>
+        </w:rPr>
+        <w:t>backend</w:t>
+      </w:r>
+      <w:proofErr w:type="spellEnd"/>
+      <w:r>
+        <w:rPr>
+          <w:rFonts w:ascii="Times New Roman" w:hAnsi="Times New Roman" w:cs="Times New Roman"/>
+        </w:rPr>
+        <w:t xml:space="preserve"> de manera equilibrada. Mientras que la base de datos se encarga de la integridad, consistencia y control transaccional, el </w:t>
+      </w:r>
+      <w:proofErr w:type="spellStart"/>
+      <w:r>
+        <w:rPr>
+          <w:rFonts w:ascii="Times New Roman" w:hAnsi="Times New Roman" w:cs="Times New Roman"/>
+        </w:rPr>
+        <w:t>backend</w:t>
+      </w:r>
+      <w:proofErr w:type="spellEnd"/>
+      <w:r>
+        <w:rPr>
+          <w:rFonts w:ascii="Times New Roman" w:hAnsi="Times New Roman" w:cs="Times New Roman"/>
+        </w:rPr>
+        <w:t xml:space="preserve"> asume responsabilidades relacionadas con validaciones complejas, procesamiento de seguridad (como el cifrado de contraseñas) y la interacción con servicios externos (por ejemplo, envío de notificaciones). Esta separación de responsabilidades favorece la mantenibilidad del sistema y reduce el acoplamiento entre capas.</w:t>
+      </w:r>
+    </w:p>
+    <w:p>
+      <w:pPr>
+        <w:jc w:val="both"/>
+        <w:rPr>
+          <w:rFonts w:ascii="Times New Roman" w:hAnsi="Times New Roman" w:cs="Times New Roman"/>
+        </w:rPr>
+      </w:pPr>
+      <w:r>
+        <w:rPr>
+          <w:rFonts w:ascii="Times New Roman" w:hAnsi="Times New Roman" w:cs="Times New Roman"/>
+        </w:rPr>
+        <w:t xml:space="preserve">Asimismo, la inclusión de mecanismos de auditoría con generación de hash criptográfico representa un avance significativo hacia la construcción de un sistema confiable, capaz de garantizar la inmutabilidad y verificabilidad de los registros. Este tipo de implementación es </w:t>
+      </w:r>
+      <w:r>
+        <w:rPr>
+          <w:rFonts w:ascii="Times New Roman" w:hAnsi="Times New Roman" w:cs="Times New Roman"/>
+        </w:rPr>
+        <w:lastRenderedPageBreak/>
+        <w:t>característico de sistemas que requieren altos niveles de control y cumplimiento, posicionando al módulo dentro de estándares cercanos a entornos empresariales.</w:t>
+      </w:r>
+    </w:p>
+    <w:p>
+      <w:pPr>
+        <w:jc w:val="both"/>
+        <w:rPr>
+          <w:rFonts w:ascii="Times New Roman" w:hAnsi="Times New Roman" w:cs="Times New Roman"/>
+        </w:rPr>
+      </w:pPr>
+      <w:r>
+        <w:rPr>
+          <w:rFonts w:ascii="Times New Roman" w:hAnsi="Times New Roman" w:cs="Times New Roman"/>
+        </w:rPr>
+        <w:t>En relación con la gestión de estados de usuario, el modelo adopta correctamente el concepto de máquina de estados, permitiendo controlar de manera explícita las transiciones válidas dentro del ciclo de vida de una cuenta. Esta decisión no solo mejora la seguridad del sistema, sino que también facilita la extensión futura de reglas de negocio más complejas.</w:t>
+      </w:r>
+    </w:p>
+    <w:p>
+      <w:pPr>
+        <w:jc w:val="both"/>
+        <w:rPr>
+          <w:rFonts w:ascii="Times New Roman" w:hAnsi="Times New Roman" w:cs="Times New Roman"/>
+        </w:rPr>
+      </w:pPr>
+      <w:r>
+        <w:rPr>
+          <w:rFonts w:ascii="Times New Roman" w:hAnsi="Times New Roman" w:cs="Times New Roman"/>
+        </w:rPr>
+        <w:t xml:space="preserve">Por otra parte, el sistema de notificaciones evidencia un diseño desacoplado y escalable, en el cual la base de datos se limita a registrar y controlar las notificaciones, mientras que el </w:t>
+      </w:r>
+      <w:proofErr w:type="spellStart"/>
+      <w:r>
+        <w:rPr>
+          <w:rFonts w:ascii="Times New Roman" w:hAnsi="Times New Roman" w:cs="Times New Roman"/>
+        </w:rPr>
+        <w:t>backend</w:t>
+      </w:r>
+      <w:proofErr w:type="spellEnd"/>
+      <w:r>
+        <w:rPr>
+          <w:rFonts w:ascii="Times New Roman" w:hAnsi="Times New Roman" w:cs="Times New Roman"/>
+        </w:rPr>
+        <w:t xml:space="preserve"> se encarga de su procesamiento y envío. Este enfoque evita sobrecargar la base de datos con operaciones externas y permite la integración futura con sistemas de mensajería más avanzados.</w:t>
+      </w:r>
     </w:p>
     <w:sectPr>
       <w:footerReference w:type="default" r:id="rId8"/>
@@ -3775,7 +5452,7 @@
   <w:style w:type="paragraph" w:default="1" w:styleId="Normal">
     <w:name w:val="Normal"/>
     <w:qFormat/>
-    <w:rsid w:val="00FC6B50"/>
+    <w:rsid w:val="000940DF"/>
   </w:style>
   <w:style w:type="paragraph" w:styleId="Ttulo1">
     <w:name w:val="heading 1"/>
@@ -4392,6 +6069,25 @@
     <w:uiPriority w:val="99"/>
     <w:rsid w:val="00075967"/>
   </w:style>
+  <w:style w:type="table" w:styleId="Tablaconcuadrcula">
+    <w:name w:val="Table Grid"/>
+    <w:basedOn w:val="Tablanormal"/>
+    <w:uiPriority w:val="39"/>
+    <w:rsid w:val="000940DF"/>
+    <w:pPr>
+      <w:spacing w:after="0" w:line="240" w:lineRule="auto"/>
+    </w:pPr>
+    <w:tblPr>
+      <w:tblBorders>
+        <w:top w:val="single" w:sz="4" w:space="0" w:color="auto"/>
+        <w:left w:val="single" w:sz="4" w:space="0" w:color="auto"/>
+        <w:bottom w:val="single" w:sz="4" w:space="0" w:color="auto"/>
+        <w:right w:val="single" w:sz="4" w:space="0" w:color="auto"/>
+        <w:insideH w:val="single" w:sz="4" w:space="0" w:color="auto"/>
+        <w:insideV w:val="single" w:sz="4" w:space="0" w:color="auto"/>
+      </w:tblBorders>
+    </w:tblPr>
+  </w:style>
 </w:styles>
 </file>
 

</xml_diff>

<commit_message>
Ajustes modelo relacional y documentacion correspondiente al modulo 2
</commit_message>
<xml_diff>
--- a/Modulo1/Informe.docx
+++ b/Modulo1/Informe.docx
@@ -15564,6 +15564,26 @@
         </w:rPr>
         <w:t>Crear usuario</w:t>
       </w:r>
+      <w:r>
+        <w:rPr>
+          <w:rFonts w:ascii="Times New Roman" w:hAnsi="Times New Roman" w:cs="Times New Roman"/>
+        </w:rPr>
+        <w:t xml:space="preserve"> (</w:t>
+      </w:r>
+      <w:r>
+        <w:rPr>
+          <w:rFonts w:ascii="Times New Roman" w:hAnsi="Times New Roman" w:cs="Times New Roman"/>
+          <w:i/>
+          <w:iCs/>
+        </w:rPr>
+        <w:t>Prototipo Acceso y cuenta</w:t>
+      </w:r>
+      <w:r>
+        <w:rPr>
+          <w:rFonts w:ascii="Times New Roman" w:hAnsi="Times New Roman" w:cs="Times New Roman"/>
+        </w:rPr>
+        <w:t>)</w:t>
+      </w:r>
     </w:p>
     <w:tbl>
       <w:tblPr>
@@ -15941,6 +15961,42 @@
         </w:rPr>
         <w:t>Correo validado</w:t>
       </w:r>
+      <w:r>
+        <w:rPr>
+          <w:rFonts w:ascii="Times New Roman" w:hAnsi="Times New Roman" w:cs="Times New Roman"/>
+        </w:rPr>
+        <w:t xml:space="preserve"> </w:t>
+      </w:r>
+      <w:r>
+        <w:rPr>
+          <w:rFonts w:ascii="Times New Roman" w:hAnsi="Times New Roman" w:cs="Times New Roman"/>
+        </w:rPr>
+        <w:t>(</w:t>
+      </w:r>
+      <w:r>
+        <w:rPr>
+          <w:rFonts w:ascii="Times New Roman" w:hAnsi="Times New Roman" w:cs="Times New Roman"/>
+          <w:i/>
+          <w:iCs/>
+        </w:rPr>
+        <w:t xml:space="preserve">Prototipo </w:t>
+      </w:r>
+      <w:proofErr w:type="spellStart"/>
+      <w:r>
+        <w:rPr>
+          <w:rFonts w:ascii="Times New Roman" w:hAnsi="Times New Roman" w:cs="Times New Roman"/>
+          <w:i/>
+          <w:iCs/>
+        </w:rPr>
+        <w:t>Multiespecie</w:t>
+      </w:r>
+      <w:proofErr w:type="spellEnd"/>
+      <w:r>
+        <w:rPr>
+          <w:rFonts w:ascii="Times New Roman" w:hAnsi="Times New Roman" w:cs="Times New Roman"/>
+        </w:rPr>
+        <w:t>)</w:t>
+      </w:r>
     </w:p>
     <w:tbl>
       <w:tblPr>
@@ -16352,7 +16408,51 @@
         <w:rPr>
           <w:rFonts w:ascii="Times New Roman" w:hAnsi="Times New Roman" w:cs="Times New Roman"/>
         </w:rPr>
-        <w:t xml:space="preserve">io identificando: el nombre y apellido del usuario, modulo, fecha del evento y nombre del evento </w:t>
+        <w:t xml:space="preserve">io identificando: el nombre y apellido del usuario, modulo, fecha del evento y nombre del </w:t>
+      </w:r>
+      <w:proofErr w:type="gramStart"/>
+      <w:r>
+        <w:rPr>
+          <w:rFonts w:ascii="Times New Roman" w:hAnsi="Times New Roman" w:cs="Times New Roman"/>
+        </w:rPr>
+        <w:t xml:space="preserve">evento </w:t>
+      </w:r>
+      <w:r>
+        <w:rPr>
+          <w:rFonts w:ascii="Times New Roman" w:hAnsi="Times New Roman" w:cs="Times New Roman"/>
+        </w:rPr>
+        <w:t xml:space="preserve"> </w:t>
+      </w:r>
+      <w:r>
+        <w:rPr>
+          <w:rFonts w:ascii="Times New Roman" w:hAnsi="Times New Roman" w:cs="Times New Roman"/>
+        </w:rPr>
+        <w:t>(</w:t>
+      </w:r>
+      <w:proofErr w:type="gramEnd"/>
+      <w:r>
+        <w:rPr>
+          <w:rFonts w:ascii="Times New Roman" w:hAnsi="Times New Roman" w:cs="Times New Roman"/>
+          <w:i/>
+          <w:iCs/>
+        </w:rPr>
+        <w:t xml:space="preserve">Prototipo </w:t>
+      </w:r>
+      <w:proofErr w:type="spellStart"/>
+      <w:r>
+        <w:rPr>
+          <w:rFonts w:ascii="Times New Roman" w:hAnsi="Times New Roman" w:cs="Times New Roman"/>
+          <w:i/>
+          <w:iCs/>
+        </w:rPr>
+        <w:t>Multiespecie</w:t>
+      </w:r>
+      <w:proofErr w:type="spellEnd"/>
+      <w:r>
+        <w:rPr>
+          <w:rFonts w:ascii="Times New Roman" w:hAnsi="Times New Roman" w:cs="Times New Roman"/>
+        </w:rPr>
+        <w:t>)</w:t>
       </w:r>
     </w:p>
     <w:tbl>
@@ -16778,6 +16878,36 @@
         </w:rPr>
         <w:t xml:space="preserve">Listar notificaciones asociadas a un evento </w:t>
       </w:r>
+      <w:r>
+        <w:rPr>
+          <w:rFonts w:ascii="Times New Roman" w:hAnsi="Times New Roman" w:cs="Times New Roman"/>
+        </w:rPr>
+        <w:t>(</w:t>
+      </w:r>
+      <w:r>
+        <w:rPr>
+          <w:rFonts w:ascii="Times New Roman" w:hAnsi="Times New Roman" w:cs="Times New Roman"/>
+          <w:i/>
+          <w:iCs/>
+        </w:rPr>
+        <w:t xml:space="preserve">Prototipo </w:t>
+      </w:r>
+      <w:proofErr w:type="spellStart"/>
+      <w:r>
+        <w:rPr>
+          <w:rFonts w:ascii="Times New Roman" w:hAnsi="Times New Roman" w:cs="Times New Roman"/>
+          <w:i/>
+          <w:iCs/>
+        </w:rPr>
+        <w:t>Multiespecie</w:t>
+      </w:r>
+      <w:proofErr w:type="spellEnd"/>
+      <w:r>
+        <w:rPr>
+          <w:rFonts w:ascii="Times New Roman" w:hAnsi="Times New Roman" w:cs="Times New Roman"/>
+        </w:rPr>
+        <w:t>)</w:t>
+      </w:r>
     </w:p>
     <w:tbl>
       <w:tblPr>
@@ -17105,6 +17235,7 @@
               <w:rPr>
                 <w:rFonts w:ascii="Times New Roman" w:hAnsi="Times New Roman" w:cs="Times New Roman"/>
               </w:rPr>
+              <w:lastRenderedPageBreak/>
               <w:t xml:space="preserve">JOIN eventos e </w:t>
             </w:r>
           </w:p>
@@ -17119,7 +17250,6 @@
               <w:rPr>
                 <w:rFonts w:ascii="Times New Roman" w:hAnsi="Times New Roman" w:cs="Times New Roman"/>
               </w:rPr>
-              <w:lastRenderedPageBreak/>
               <w:t xml:space="preserve">    ON </w:t>
             </w:r>
             <w:proofErr w:type="spellStart"/>
@@ -17253,6 +17383,51 @@
         </w:rPr>
         <w:t>Listar nombre y apellido del usuario, correo electrónico, teléfono y fecha de creación de la cuenta</w:t>
       </w:r>
+      <w:r>
+        <w:rPr>
+          <w:rFonts w:ascii="Times New Roman" w:hAnsi="Times New Roman" w:cs="Times New Roman"/>
+        </w:rPr>
+        <w:t xml:space="preserve"> </w:t>
+      </w:r>
+      <w:r>
+        <w:rPr>
+          <w:rFonts w:ascii="Times New Roman" w:hAnsi="Times New Roman" w:cs="Times New Roman"/>
+        </w:rPr>
+        <w:t>(</w:t>
+      </w:r>
+      <w:r>
+        <w:rPr>
+          <w:rFonts w:ascii="Times New Roman" w:hAnsi="Times New Roman" w:cs="Times New Roman"/>
+          <w:i/>
+          <w:iCs/>
+        </w:rPr>
+        <w:t xml:space="preserve">Prototipo </w:t>
+      </w:r>
+      <w:proofErr w:type="spellStart"/>
+      <w:r>
+        <w:rPr>
+          <w:rFonts w:ascii="Times New Roman" w:hAnsi="Times New Roman" w:cs="Times New Roman"/>
+          <w:i/>
+          <w:iCs/>
+        </w:rPr>
+        <w:t>Multiespecie</w:t>
+      </w:r>
+      <w:proofErr w:type="spellEnd"/>
+      <w:r>
+        <w:rPr>
+          <w:rFonts w:ascii="Times New Roman" w:hAnsi="Times New Roman" w:cs="Times New Roman"/>
+        </w:rPr>
+        <w:t>)</w:t>
+      </w:r>
+    </w:p>
+    <w:p>
+      <w:pPr>
+        <w:pStyle w:val="Prrafodelista"/>
+        <w:ind w:left="785"/>
+        <w:rPr>
+          <w:rFonts w:ascii="Times New Roman" w:hAnsi="Times New Roman" w:cs="Times New Roman"/>
+        </w:rPr>
+      </w:pPr>
     </w:p>
     <w:tbl>
       <w:tblPr>
@@ -17470,6 +17645,45 @@
         </w:rPr>
         <w:t xml:space="preserve">Listar las sesiones activas del usuario, última fecha de acceso, estado y rol asignado del usuario </w:t>
       </w:r>
+      <w:r>
+        <w:rPr>
+          <w:rFonts w:ascii="Times New Roman" w:hAnsi="Times New Roman" w:cs="Times New Roman"/>
+        </w:rPr>
+        <w:t>(</w:t>
+      </w:r>
+      <w:r>
+        <w:rPr>
+          <w:rFonts w:ascii="Times New Roman" w:hAnsi="Times New Roman" w:cs="Times New Roman"/>
+          <w:i/>
+          <w:iCs/>
+        </w:rPr>
+        <w:t xml:space="preserve">Prototipo </w:t>
+      </w:r>
+      <w:proofErr w:type="spellStart"/>
+      <w:r>
+        <w:rPr>
+          <w:rFonts w:ascii="Times New Roman" w:hAnsi="Times New Roman" w:cs="Times New Roman"/>
+          <w:i/>
+          <w:iCs/>
+        </w:rPr>
+        <w:t>Multiespecie</w:t>
+      </w:r>
+      <w:proofErr w:type="spellEnd"/>
+      <w:r>
+        <w:rPr>
+          <w:rFonts w:ascii="Times New Roman" w:hAnsi="Times New Roman" w:cs="Times New Roman"/>
+        </w:rPr>
+        <w:t>)</w:t>
+      </w:r>
+    </w:p>
+    <w:p>
+      <w:pPr>
+        <w:pStyle w:val="Prrafodelista"/>
+        <w:ind w:left="785"/>
+        <w:rPr>
+          <w:rFonts w:ascii="Times New Roman" w:hAnsi="Times New Roman" w:cs="Times New Roman"/>
+        </w:rPr>
+      </w:pPr>
     </w:p>
     <w:tbl>
       <w:tblPr>
@@ -18140,6 +18354,51 @@
         </w:rPr>
         <w:t>Listar permisos del rol</w:t>
       </w:r>
+      <w:r>
+        <w:rPr>
+          <w:rFonts w:ascii="Times New Roman" w:hAnsi="Times New Roman" w:cs="Times New Roman"/>
+        </w:rPr>
+        <w:t xml:space="preserve"> </w:t>
+      </w:r>
+      <w:r>
+        <w:rPr>
+          <w:rFonts w:ascii="Times New Roman" w:hAnsi="Times New Roman" w:cs="Times New Roman"/>
+        </w:rPr>
+        <w:t>(</w:t>
+      </w:r>
+      <w:r>
+        <w:rPr>
+          <w:rFonts w:ascii="Times New Roman" w:hAnsi="Times New Roman" w:cs="Times New Roman"/>
+          <w:i/>
+          <w:iCs/>
+        </w:rPr>
+        <w:t xml:space="preserve">Prototipo </w:t>
+      </w:r>
+      <w:proofErr w:type="spellStart"/>
+      <w:r>
+        <w:rPr>
+          <w:rFonts w:ascii="Times New Roman" w:hAnsi="Times New Roman" w:cs="Times New Roman"/>
+          <w:i/>
+          <w:iCs/>
+        </w:rPr>
+        <w:t>Multiespecie</w:t>
+      </w:r>
+      <w:proofErr w:type="spellEnd"/>
+      <w:r>
+        <w:rPr>
+          <w:rFonts w:ascii="Times New Roman" w:hAnsi="Times New Roman" w:cs="Times New Roman"/>
+        </w:rPr>
+        <w:t>)</w:t>
+      </w:r>
+    </w:p>
+    <w:p>
+      <w:pPr>
+        <w:pStyle w:val="Prrafodelista"/>
+        <w:ind w:left="785"/>
+        <w:rPr>
+          <w:rFonts w:ascii="Times New Roman" w:hAnsi="Times New Roman" w:cs="Times New Roman"/>
+        </w:rPr>
+      </w:pPr>
     </w:p>
     <w:tbl>
       <w:tblPr>
@@ -18167,6 +18426,7 @@
               <w:rPr>
                 <w:rFonts w:ascii="Times New Roman" w:hAnsi="Times New Roman" w:cs="Times New Roman"/>
               </w:rPr>
+              <w:lastRenderedPageBreak/>
               <w:t xml:space="preserve">SELECT </w:t>
             </w:r>
           </w:p>
@@ -18277,7 +18537,6 @@
               <w:rPr>
                 <w:rFonts w:ascii="Times New Roman" w:hAnsi="Times New Roman" w:cs="Times New Roman"/>
               </w:rPr>
-              <w:lastRenderedPageBreak/>
               <w:t xml:space="preserve">    </w:t>
             </w:r>
             <w:proofErr w:type="spellStart"/>
@@ -18535,6 +18794,51 @@
         </w:rPr>
         <w:t>Actualizar clave</w:t>
       </w:r>
+      <w:r>
+        <w:rPr>
+          <w:rFonts w:ascii="Times New Roman" w:hAnsi="Times New Roman" w:cs="Times New Roman"/>
+        </w:rPr>
+        <w:t xml:space="preserve"> </w:t>
+      </w:r>
+      <w:r>
+        <w:rPr>
+          <w:rFonts w:ascii="Times New Roman" w:hAnsi="Times New Roman" w:cs="Times New Roman"/>
+        </w:rPr>
+        <w:t>(</w:t>
+      </w:r>
+      <w:r>
+        <w:rPr>
+          <w:rFonts w:ascii="Times New Roman" w:hAnsi="Times New Roman" w:cs="Times New Roman"/>
+          <w:i/>
+          <w:iCs/>
+        </w:rPr>
+        <w:t xml:space="preserve">Prototipo </w:t>
+      </w:r>
+      <w:proofErr w:type="spellStart"/>
+      <w:r>
+        <w:rPr>
+          <w:rFonts w:ascii="Times New Roman" w:hAnsi="Times New Roman" w:cs="Times New Roman"/>
+          <w:i/>
+          <w:iCs/>
+        </w:rPr>
+        <w:t>Multiespecie</w:t>
+      </w:r>
+      <w:proofErr w:type="spellEnd"/>
+      <w:r>
+        <w:rPr>
+          <w:rFonts w:ascii="Times New Roman" w:hAnsi="Times New Roman" w:cs="Times New Roman"/>
+        </w:rPr>
+        <w:t>)</w:t>
+      </w:r>
+    </w:p>
+    <w:p>
+      <w:pPr>
+        <w:pStyle w:val="Prrafodelista"/>
+        <w:ind w:left="785"/>
+        <w:rPr>
+          <w:rFonts w:ascii="Times New Roman" w:hAnsi="Times New Roman" w:cs="Times New Roman"/>
+        </w:rPr>
+      </w:pPr>
     </w:p>
     <w:tbl>
       <w:tblPr>
@@ -18747,6 +19051,51 @@
         </w:rPr>
         <w:t xml:space="preserve"> de la sesione de la cuenta del usuario</w:t>
       </w:r>
+      <w:r>
+        <w:rPr>
+          <w:rFonts w:ascii="Times New Roman" w:hAnsi="Times New Roman" w:cs="Times New Roman"/>
+        </w:rPr>
+        <w:t xml:space="preserve"> </w:t>
+      </w:r>
+      <w:r>
+        <w:rPr>
+          <w:rFonts w:ascii="Times New Roman" w:hAnsi="Times New Roman" w:cs="Times New Roman"/>
+        </w:rPr>
+        <w:t>(</w:t>
+      </w:r>
+      <w:r>
+        <w:rPr>
+          <w:rFonts w:ascii="Times New Roman" w:hAnsi="Times New Roman" w:cs="Times New Roman"/>
+          <w:i/>
+          <w:iCs/>
+        </w:rPr>
+        <w:t xml:space="preserve">Prototipo </w:t>
+      </w:r>
+      <w:proofErr w:type="spellStart"/>
+      <w:r>
+        <w:rPr>
+          <w:rFonts w:ascii="Times New Roman" w:hAnsi="Times New Roman" w:cs="Times New Roman"/>
+          <w:i/>
+          <w:iCs/>
+        </w:rPr>
+        <w:t>Multiespecie</w:t>
+      </w:r>
+      <w:proofErr w:type="spellEnd"/>
+      <w:r>
+        <w:rPr>
+          <w:rFonts w:ascii="Times New Roman" w:hAnsi="Times New Roman" w:cs="Times New Roman"/>
+        </w:rPr>
+        <w:t>)</w:t>
+      </w:r>
+    </w:p>
+    <w:p>
+      <w:pPr>
+        <w:pStyle w:val="Prrafodelista"/>
+        <w:ind w:left="785"/>
+        <w:rPr>
+          <w:rFonts w:ascii="Times New Roman" w:hAnsi="Times New Roman" w:cs="Times New Roman"/>
+        </w:rPr>
+      </w:pPr>
     </w:p>
     <w:tbl>
       <w:tblPr>
@@ -19356,6 +19705,7 @@
         <w:rPr>
           <w:rFonts w:ascii="Times New Roman" w:hAnsi="Times New Roman" w:cs="Times New Roman"/>
         </w:rPr>
+        <w:lastRenderedPageBreak/>
         <w:t xml:space="preserve">Listar el nombre y apellido del </w:t>
       </w:r>
       <w:r>
@@ -19370,6 +19720,51 @@
         </w:rPr>
         <w:t>, correo electrónico, rol, estado de la cuenta del usuario, ultimo acceso</w:t>
       </w:r>
+      <w:r>
+        <w:rPr>
+          <w:rFonts w:ascii="Times New Roman" w:hAnsi="Times New Roman" w:cs="Times New Roman"/>
+        </w:rPr>
+        <w:t xml:space="preserve"> </w:t>
+      </w:r>
+      <w:r>
+        <w:rPr>
+          <w:rFonts w:ascii="Times New Roman" w:hAnsi="Times New Roman" w:cs="Times New Roman"/>
+        </w:rPr>
+        <w:t>(</w:t>
+      </w:r>
+      <w:r>
+        <w:rPr>
+          <w:rFonts w:ascii="Times New Roman" w:hAnsi="Times New Roman" w:cs="Times New Roman"/>
+          <w:i/>
+          <w:iCs/>
+        </w:rPr>
+        <w:t xml:space="preserve">Prototipo </w:t>
+      </w:r>
+      <w:proofErr w:type="spellStart"/>
+      <w:r>
+        <w:rPr>
+          <w:rFonts w:ascii="Times New Roman" w:hAnsi="Times New Roman" w:cs="Times New Roman"/>
+          <w:i/>
+          <w:iCs/>
+        </w:rPr>
+        <w:t>Multiespecie</w:t>
+      </w:r>
+      <w:proofErr w:type="spellEnd"/>
+      <w:r>
+        <w:rPr>
+          <w:rFonts w:ascii="Times New Roman" w:hAnsi="Times New Roman" w:cs="Times New Roman"/>
+        </w:rPr>
+        <w:t>)</w:t>
+      </w:r>
+    </w:p>
+    <w:p>
+      <w:pPr>
+        <w:pStyle w:val="Prrafodelista"/>
+        <w:ind w:left="785"/>
+        <w:rPr>
+          <w:rFonts w:ascii="Times New Roman" w:hAnsi="Times New Roman" w:cs="Times New Roman"/>
+        </w:rPr>
+      </w:pPr>
     </w:p>
     <w:tbl>
       <w:tblPr>
@@ -19507,7 +19902,6 @@
               <w:rPr>
                 <w:rFonts w:ascii="Times New Roman" w:hAnsi="Times New Roman" w:cs="Times New Roman"/>
               </w:rPr>
-              <w:lastRenderedPageBreak/>
               <w:t xml:space="preserve">    </w:t>
             </w:r>
             <w:proofErr w:type="spellStart"/>
@@ -19889,8 +20283,61 @@
         <w:rPr>
           <w:rFonts w:ascii="Times New Roman" w:hAnsi="Times New Roman" w:cs="Times New Roman"/>
         </w:rPr>
-        <w:t xml:space="preserve">tar el rol del usuario y el estado de la cuenta del usuario </w:t>
-      </w:r>
+        <w:t xml:space="preserve">tar el rol del usuario y el estado de la cuenta del </w:t>
+      </w:r>
+      <w:proofErr w:type="gramStart"/>
+      <w:r>
+        <w:rPr>
+          <w:rFonts w:ascii="Times New Roman" w:hAnsi="Times New Roman" w:cs="Times New Roman"/>
+        </w:rPr>
+        <w:t xml:space="preserve">usuario </w:t>
+      </w:r>
+      <w:r>
+        <w:rPr>
+          <w:rFonts w:ascii="Times New Roman" w:hAnsi="Times New Roman" w:cs="Times New Roman"/>
+        </w:rPr>
+        <w:t xml:space="preserve"> </w:t>
+      </w:r>
+      <w:r>
+        <w:rPr>
+          <w:rFonts w:ascii="Times New Roman" w:hAnsi="Times New Roman" w:cs="Times New Roman"/>
+        </w:rPr>
+        <w:t>(</w:t>
+      </w:r>
+      <w:proofErr w:type="gramEnd"/>
+      <w:r>
+        <w:rPr>
+          <w:rFonts w:ascii="Times New Roman" w:hAnsi="Times New Roman" w:cs="Times New Roman"/>
+          <w:i/>
+          <w:iCs/>
+        </w:rPr>
+        <w:t xml:space="preserve">Prototipo </w:t>
+      </w:r>
+      <w:proofErr w:type="spellStart"/>
+      <w:r>
+        <w:rPr>
+          <w:rFonts w:ascii="Times New Roman" w:hAnsi="Times New Roman" w:cs="Times New Roman"/>
+          <w:i/>
+          <w:iCs/>
+        </w:rPr>
+        <w:t>Multiespecie</w:t>
+      </w:r>
+      <w:proofErr w:type="spellEnd"/>
+      <w:r>
+        <w:rPr>
+          <w:rFonts w:ascii="Times New Roman" w:hAnsi="Times New Roman" w:cs="Times New Roman"/>
+        </w:rPr>
+        <w:t>)</w:t>
+      </w:r>
+    </w:p>
+    <w:p>
+      <w:pPr>
+        <w:pStyle w:val="Prrafodelista"/>
+        <w:ind w:left="785"/>
+        <w:rPr>
+          <w:rFonts w:ascii="Times New Roman" w:hAnsi="Times New Roman" w:cs="Times New Roman"/>
+        </w:rPr>
+      </w:pPr>
     </w:p>
     <w:tbl>
       <w:tblPr>
@@ -20137,6 +20584,51 @@
         </w:rPr>
         <w:t>Editar atributos del rol</w:t>
       </w:r>
+      <w:r>
+        <w:rPr>
+          <w:rFonts w:ascii="Times New Roman" w:hAnsi="Times New Roman" w:cs="Times New Roman"/>
+        </w:rPr>
+        <w:t xml:space="preserve"> </w:t>
+      </w:r>
+      <w:r>
+        <w:rPr>
+          <w:rFonts w:ascii="Times New Roman" w:hAnsi="Times New Roman" w:cs="Times New Roman"/>
+        </w:rPr>
+        <w:t>(</w:t>
+      </w:r>
+      <w:r>
+        <w:rPr>
+          <w:rFonts w:ascii="Times New Roman" w:hAnsi="Times New Roman" w:cs="Times New Roman"/>
+          <w:i/>
+          <w:iCs/>
+        </w:rPr>
+        <w:t xml:space="preserve">Prototipo </w:t>
+      </w:r>
+      <w:proofErr w:type="spellStart"/>
+      <w:r>
+        <w:rPr>
+          <w:rFonts w:ascii="Times New Roman" w:hAnsi="Times New Roman" w:cs="Times New Roman"/>
+          <w:i/>
+          <w:iCs/>
+        </w:rPr>
+        <w:t>Multiespecie</w:t>
+      </w:r>
+      <w:proofErr w:type="spellEnd"/>
+      <w:r>
+        <w:rPr>
+          <w:rFonts w:ascii="Times New Roman" w:hAnsi="Times New Roman" w:cs="Times New Roman"/>
+        </w:rPr>
+        <w:t>)</w:t>
+      </w:r>
+    </w:p>
+    <w:p>
+      <w:pPr>
+        <w:pStyle w:val="Prrafodelista"/>
+        <w:ind w:left="785"/>
+        <w:rPr>
+          <w:rFonts w:ascii="Times New Roman" w:hAnsi="Times New Roman" w:cs="Times New Roman"/>
+        </w:rPr>
+      </w:pPr>
     </w:p>
     <w:tbl>
       <w:tblPr>
@@ -20339,6 +20831,7 @@
         <w:rPr>
           <w:rFonts w:cs="Times New Roman"/>
         </w:rPr>
+        <w:lastRenderedPageBreak/>
         <w:t>Consideraciones Técnicas</w:t>
       </w:r>
       <w:bookmarkEnd w:id="11"/>
@@ -20368,14 +20861,7 @@
         <w:rPr>
           <w:rFonts w:ascii="Times New Roman" w:hAnsi="Times New Roman" w:cs="Times New Roman"/>
         </w:rPr>
-        <w:t xml:space="preserve">Desde una perspectiva estructural, el modelo relacional propuesto demuestra un adecuado nivel de normalización y cohesión semántica, permitiendo representar de forma consistente las interacciones entre usuarios, roles, permisos, estados y eventos del sistema. La </w:t>
-      </w:r>
-      <w:r>
-        <w:rPr>
-          <w:rFonts w:ascii="Times New Roman" w:hAnsi="Times New Roman" w:cs="Times New Roman"/>
-        </w:rPr>
-        <w:lastRenderedPageBreak/>
-        <w:t>incorporación de entidades como eventos, sesiones y gestión de cuentas no solo responde a necesidades funcionales, sino que introduce una capa robusta de trazabilidad que fortalece la capacidad de auditoría y monitoreo del sistema.</w:t>
+        <w:t>Desde una perspectiva estructural, el modelo relacional propuesto demuestra un adecuado nivel de normalización y cohesión semántica, permitiendo representar de forma consistente las interacciones entre usuarios, roles, permisos, estados y eventos del sistema. La incorporación de entidades como eventos, sesiones y gestión de cuentas no solo responde a necesidades funcionales, sino que introduce una capa robusta de trazabilidad que fortalece la capacidad de auditoría y monitoreo del sistema.</w:t>
       </w:r>
     </w:p>
     <w:p>

</xml_diff>

<commit_message>
Modelo relacional y backup modulo 1,2,3,4 y 9
</commit_message>
<xml_diff>
--- a/Modulo1/Informe.docx
+++ b/Modulo1/Informe.docx
@@ -15539,13 +15539,21 @@
         </w:rPr>
       </w:pPr>
       <w:bookmarkStart w:id="10" w:name="_Toc227232019"/>
+      <w:proofErr w:type="spellStart"/>
       <w:r>
         <w:rPr>
           <w:rFonts w:cs="Times New Roman"/>
         </w:rPr>
+        <w:t>W</w:t>
+      </w:r>
+      <w:r>
+        <w:rPr>
+          <w:rFonts w:cs="Times New Roman"/>
+        </w:rPr>
         <w:t>Consultas</w:t>
       </w:r>
       <w:bookmarkEnd w:id="10"/>
+      <w:proofErr w:type="spellEnd"/>
     </w:p>
     <w:p>
       <w:pPr>
@@ -15965,13 +15973,7 @@
         <w:rPr>
           <w:rFonts w:ascii="Times New Roman" w:hAnsi="Times New Roman" w:cs="Times New Roman"/>
         </w:rPr>
-        <w:t xml:space="preserve"> </w:t>
-      </w:r>
-      <w:r>
-        <w:rPr>
-          <w:rFonts w:ascii="Times New Roman" w:hAnsi="Times New Roman" w:cs="Times New Roman"/>
-        </w:rPr>
-        <w:t>(</w:t>
+        <w:t xml:space="preserve"> (</w:t>
       </w:r>
       <w:r>
         <w:rPr>
@@ -16421,13 +16423,7 @@
         <w:rPr>
           <w:rFonts w:ascii="Times New Roman" w:hAnsi="Times New Roman" w:cs="Times New Roman"/>
         </w:rPr>
-        <w:t xml:space="preserve"> </w:t>
-      </w:r>
-      <w:r>
-        <w:rPr>
-          <w:rFonts w:ascii="Times New Roman" w:hAnsi="Times New Roman" w:cs="Times New Roman"/>
-        </w:rPr>
-        <w:t>(</w:t>
+        <w:t xml:space="preserve"> (</w:t>
       </w:r>
       <w:proofErr w:type="gramEnd"/>
       <w:r>
@@ -17387,13 +17383,7 @@
         <w:rPr>
           <w:rFonts w:ascii="Times New Roman" w:hAnsi="Times New Roman" w:cs="Times New Roman"/>
         </w:rPr>
-        <w:t xml:space="preserve"> </w:t>
-      </w:r>
-      <w:r>
-        <w:rPr>
-          <w:rFonts w:ascii="Times New Roman" w:hAnsi="Times New Roman" w:cs="Times New Roman"/>
-        </w:rPr>
-        <w:t>(</w:t>
+        <w:t xml:space="preserve"> (</w:t>
       </w:r>
       <w:r>
         <w:rPr>
@@ -18358,13 +18348,7 @@
         <w:rPr>
           <w:rFonts w:ascii="Times New Roman" w:hAnsi="Times New Roman" w:cs="Times New Roman"/>
         </w:rPr>
-        <w:t xml:space="preserve"> </w:t>
-      </w:r>
-      <w:r>
-        <w:rPr>
-          <w:rFonts w:ascii="Times New Roman" w:hAnsi="Times New Roman" w:cs="Times New Roman"/>
-        </w:rPr>
-        <w:t>(</w:t>
+        <w:t xml:space="preserve"> (</w:t>
       </w:r>
       <w:r>
         <w:rPr>
@@ -18798,13 +18782,7 @@
         <w:rPr>
           <w:rFonts w:ascii="Times New Roman" w:hAnsi="Times New Roman" w:cs="Times New Roman"/>
         </w:rPr>
-        <w:t xml:space="preserve"> </w:t>
-      </w:r>
-      <w:r>
-        <w:rPr>
-          <w:rFonts w:ascii="Times New Roman" w:hAnsi="Times New Roman" w:cs="Times New Roman"/>
-        </w:rPr>
-        <w:t>(</w:t>
+        <w:t xml:space="preserve"> (</w:t>
       </w:r>
       <w:r>
         <w:rPr>
@@ -19055,13 +19033,7 @@
         <w:rPr>
           <w:rFonts w:ascii="Times New Roman" w:hAnsi="Times New Roman" w:cs="Times New Roman"/>
         </w:rPr>
-        <w:t xml:space="preserve"> </w:t>
-      </w:r>
-      <w:r>
-        <w:rPr>
-          <w:rFonts w:ascii="Times New Roman" w:hAnsi="Times New Roman" w:cs="Times New Roman"/>
-        </w:rPr>
-        <w:t>(</w:t>
+        <w:t xml:space="preserve"> (</w:t>
       </w:r>
       <w:r>
         <w:rPr>
@@ -19724,13 +19696,7 @@
         <w:rPr>
           <w:rFonts w:ascii="Times New Roman" w:hAnsi="Times New Roman" w:cs="Times New Roman"/>
         </w:rPr>
-        <w:t xml:space="preserve"> </w:t>
-      </w:r>
-      <w:r>
-        <w:rPr>
-          <w:rFonts w:ascii="Times New Roman" w:hAnsi="Times New Roman" w:cs="Times New Roman"/>
-        </w:rPr>
-        <w:t>(</w:t>
+        <w:t xml:space="preserve"> (</w:t>
       </w:r>
       <w:r>
         <w:rPr>
@@ -20296,13 +20262,7 @@
         <w:rPr>
           <w:rFonts w:ascii="Times New Roman" w:hAnsi="Times New Roman" w:cs="Times New Roman"/>
         </w:rPr>
-        <w:t xml:space="preserve"> </w:t>
-      </w:r>
-      <w:r>
-        <w:rPr>
-          <w:rFonts w:ascii="Times New Roman" w:hAnsi="Times New Roman" w:cs="Times New Roman"/>
-        </w:rPr>
-        <w:t>(</w:t>
+        <w:t xml:space="preserve"> (</w:t>
       </w:r>
       <w:proofErr w:type="gramEnd"/>
       <w:r>
@@ -20588,13 +20548,7 @@
         <w:rPr>
           <w:rFonts w:ascii="Times New Roman" w:hAnsi="Times New Roman" w:cs="Times New Roman"/>
         </w:rPr>
-        <w:t xml:space="preserve"> </w:t>
-      </w:r>
-      <w:r>
-        <w:rPr>
-          <w:rFonts w:ascii="Times New Roman" w:hAnsi="Times New Roman" w:cs="Times New Roman"/>
-        </w:rPr>
-        <w:t>(</w:t>
+        <w:t xml:space="preserve"> (</w:t>
       </w:r>
       <w:r>
         <w:rPr>

</xml_diff>